<commit_message>
Guía Desarrollo Proyecto APT
Co-Authored-By: diediazp <139392398+diediazp@users.noreply.github.com>
</commit_message>
<xml_diff>
--- a/FASE 2/Evidencias Grupales/2.4_GuiaEstudiante_Fase 2_DesarrolloProyecto APT (Español).docx
+++ b/FASE 2/Evidencias Grupales/2.4_GuiaEstudiante_Fase 2_DesarrolloProyecto APT (Español).docx
@@ -626,6 +626,7 @@
           </w:tcPr>
           <w:p>
             <w:pPr>
+              <w:spacing w:line="276" w:lineRule="auto"/>
               <w:jc w:val="both"/>
               <w:rPr>
                 <w:rFonts w:ascii="Calibri" w:hAnsi="Calibri" w:cs="Arial"/>
@@ -645,33 +646,36 @@
                 <w:szCs w:val="20"/>
                 <w:lang w:eastAsia="es-CL"/>
               </w:rPr>
-              <w:t>Durante la Fase 2 hemos avanzado desde la etapa de diseño hacia la implementación del sistema.</w:t>
-            </w:r>
-            <w:r>
-              <w:rPr>
-                <w:rFonts w:ascii="Calibri" w:hAnsi="Calibri" w:cs="Arial"/>
-                <w:iCs/>
-                <w:color w:val="3B3838" w:themeColor="background2" w:themeShade="40"/>
-                <w:sz w:val="20"/>
-                <w:szCs w:val="20"/>
-                <w:lang w:eastAsia="es-CL"/>
-              </w:rPr>
-              <w:t xml:space="preserve"> Se mantuvo </w:t>
-            </w:r>
-            <w:r>
-              <w:rPr>
-                <w:rFonts w:ascii="Calibri" w:hAnsi="Calibri" w:cs="Arial"/>
-                <w:iCs/>
-                <w:color w:val="3B3838" w:themeColor="background2" w:themeShade="40"/>
-                <w:sz w:val="20"/>
-                <w:szCs w:val="20"/>
-                <w:lang w:eastAsia="es-CL"/>
-              </w:rPr>
-              <w:t>el enfoque y los objetivos definidos durante la Fase 1, pero hemos ido ajustando algunas decisiones técnicas a medida que avanzamos en el desarrollo.</w:t>
-            </w:r>
-          </w:p>
-          <w:p>
-            <w:pPr>
+              <w:t xml:space="preserve">En esta fase pasamos del diseño a un sistema con </w:t>
+            </w:r>
+            <w:proofErr w:type="spellStart"/>
+            <w:r>
+              <w:rPr>
+                <w:rFonts w:ascii="Calibri" w:hAnsi="Calibri" w:cs="Arial"/>
+                <w:iCs/>
+                <w:color w:val="3B3838" w:themeColor="background2" w:themeShade="40"/>
+                <w:sz w:val="20"/>
+                <w:szCs w:val="20"/>
+                <w:lang w:eastAsia="es-CL"/>
+              </w:rPr>
+              <w:t>backend</w:t>
+            </w:r>
+            <w:proofErr w:type="spellEnd"/>
+            <w:r>
+              <w:rPr>
+                <w:rFonts w:ascii="Calibri" w:hAnsi="Calibri" w:cs="Arial"/>
+                <w:iCs/>
+                <w:color w:val="3B3838" w:themeColor="background2" w:themeShade="40"/>
+                <w:sz w:val="20"/>
+                <w:szCs w:val="20"/>
+                <w:lang w:eastAsia="es-CL"/>
+              </w:rPr>
+              <w:t xml:space="preserve">, base de datos e interfaz conectados. </w:t>
+            </w:r>
+          </w:p>
+          <w:p>
+            <w:pPr>
+              <w:spacing w:line="276" w:lineRule="auto"/>
               <w:jc w:val="both"/>
               <w:rPr>
                 <w:rFonts w:ascii="Calibri" w:hAnsi="Calibri" w:cs="Arial"/>
@@ -691,7 +695,7 @@
                 <w:szCs w:val="20"/>
                 <w:lang w:eastAsia="es-CL"/>
               </w:rPr>
-              <w:t xml:space="preserve">Durante esta etapa elaboramos la documentación de arquitectura, el modelo entidad-relación y el plan de pruebas. También implementamos el modelo de datos en PostgreSQL y comenzamos el desarrollo del sistema mediante un </w:t>
+              <w:t xml:space="preserve">El </w:t>
             </w:r>
             <w:proofErr w:type="spellStart"/>
             <w:r>
@@ -715,7 +719,32 @@
                 <w:szCs w:val="20"/>
                 <w:lang w:eastAsia="es-CL"/>
               </w:rPr>
-              <w:t xml:space="preserve"> y un </w:t>
+              <w:t xml:space="preserve"> es una API REST en Node.js 18 y Express 5 sobre PostgreSQL, ordenada en rutas, controladores, modelos y middleware. </w:t>
+            </w:r>
+          </w:p>
+          <w:p>
+            <w:pPr>
+              <w:spacing w:line="276" w:lineRule="auto"/>
+              <w:jc w:val="both"/>
+              <w:rPr>
+                <w:rFonts w:ascii="Calibri" w:hAnsi="Calibri" w:cs="Arial"/>
+                <w:iCs/>
+                <w:color w:val="3B3838" w:themeColor="background2" w:themeShade="40"/>
+                <w:sz w:val="20"/>
+                <w:szCs w:val="20"/>
+                <w:lang w:eastAsia="es-CL"/>
+              </w:rPr>
+            </w:pPr>
+            <w:r>
+              <w:rPr>
+                <w:rFonts w:ascii="Calibri" w:hAnsi="Calibri" w:cs="Arial"/>
+                <w:iCs/>
+                <w:color w:val="3B3838" w:themeColor="background2" w:themeShade="40"/>
+                <w:sz w:val="20"/>
+                <w:szCs w:val="20"/>
+                <w:lang w:eastAsia="es-CL"/>
+              </w:rPr>
+              <w:t xml:space="preserve">Tiene diez grupos de </w:t>
             </w:r>
             <w:proofErr w:type="spellStart"/>
             <w:r>
@@ -727,6 +756,104 @@
                 <w:szCs w:val="20"/>
                 <w:lang w:eastAsia="es-CL"/>
               </w:rPr>
+              <w:t>endpoints</w:t>
+            </w:r>
+            <w:proofErr w:type="spellEnd"/>
+            <w:r>
+              <w:rPr>
+                <w:rFonts w:ascii="Calibri" w:hAnsi="Calibri" w:cs="Arial"/>
+                <w:iCs/>
+                <w:color w:val="3B3838" w:themeColor="background2" w:themeShade="40"/>
+                <w:sz w:val="20"/>
+                <w:szCs w:val="20"/>
+                <w:lang w:eastAsia="es-CL"/>
+              </w:rPr>
+              <w:t xml:space="preserve">: autenticación, preparaciones, ingredientes, menú, jornada, usuarios, análisis, perfil del estudiante, opiniones y predicción. La autenticación usa JWT y las contraseñas se guardan con </w:t>
+            </w:r>
+            <w:proofErr w:type="spellStart"/>
+            <w:r>
+              <w:rPr>
+                <w:rFonts w:ascii="Calibri" w:hAnsi="Calibri" w:cs="Arial"/>
+                <w:iCs/>
+                <w:color w:val="3B3838" w:themeColor="background2" w:themeShade="40"/>
+                <w:sz w:val="20"/>
+                <w:szCs w:val="20"/>
+                <w:lang w:eastAsia="es-CL"/>
+              </w:rPr>
+              <w:t>bcrypt</w:t>
+            </w:r>
+            <w:proofErr w:type="spellEnd"/>
+            <w:r>
+              <w:rPr>
+                <w:rFonts w:ascii="Calibri" w:hAnsi="Calibri" w:cs="Arial"/>
+                <w:iCs/>
+                <w:color w:val="3B3838" w:themeColor="background2" w:themeShade="40"/>
+                <w:sz w:val="20"/>
+                <w:szCs w:val="20"/>
+                <w:lang w:eastAsia="es-CL"/>
+              </w:rPr>
+              <w:t>. Hay cinco roles (Estudiante, Personal Casino, Cajero, Nutricionista y Administrador) y los permisos se verifican en el servidor, no solo en la interfaz.</w:t>
+            </w:r>
+          </w:p>
+          <w:p>
+            <w:pPr>
+              <w:spacing w:line="276" w:lineRule="auto"/>
+              <w:jc w:val="both"/>
+              <w:rPr>
+                <w:rFonts w:ascii="Calibri" w:hAnsi="Calibri" w:cs="Arial"/>
+                <w:iCs/>
+                <w:color w:val="3B3838" w:themeColor="background2" w:themeShade="40"/>
+                <w:sz w:val="20"/>
+                <w:szCs w:val="20"/>
+                <w:lang w:eastAsia="es-CL"/>
+              </w:rPr>
+            </w:pPr>
+            <w:r>
+              <w:rPr>
+                <w:rFonts w:ascii="Calibri" w:hAnsi="Calibri" w:cs="Arial"/>
+                <w:iCs/>
+                <w:color w:val="3B3838" w:themeColor="background2" w:themeShade="40"/>
+                <w:sz w:val="20"/>
+                <w:szCs w:val="20"/>
+                <w:lang w:eastAsia="es-CL"/>
+              </w:rPr>
+              <w:t>La base de datos pasó de las 16 tablas del diseño inicial a 24 tablas y una vista, a través de siete migraciones (Sprint 3 al 9). Se mantuvo la separación entre lo planificado y lo que ocurre durante la jornada. El stock se guarda como movimientos que no se editan ni se borran, y el estado de cada plato (disponible, quedan pocas unidades o agotado) se calcula a partir de lo que queda.</w:t>
+            </w:r>
+          </w:p>
+          <w:p>
+            <w:pPr>
+              <w:spacing w:line="276" w:lineRule="auto"/>
+              <w:jc w:val="both"/>
+              <w:rPr>
+                <w:rFonts w:ascii="Calibri" w:hAnsi="Calibri" w:cs="Arial"/>
+                <w:iCs/>
+                <w:color w:val="3B3838" w:themeColor="background2" w:themeShade="40"/>
+                <w:sz w:val="20"/>
+                <w:szCs w:val="20"/>
+                <w:lang w:eastAsia="es-CL"/>
+              </w:rPr>
+            </w:pPr>
+            <w:r>
+              <w:rPr>
+                <w:rFonts w:ascii="Calibri" w:hAnsi="Calibri" w:cs="Arial"/>
+                <w:iCs/>
+                <w:color w:val="3B3838" w:themeColor="background2" w:themeShade="40"/>
+                <w:sz w:val="20"/>
+                <w:szCs w:val="20"/>
+                <w:lang w:eastAsia="es-CL"/>
+              </w:rPr>
+              <w:t xml:space="preserve">El </w:t>
+            </w:r>
+            <w:proofErr w:type="spellStart"/>
+            <w:r>
+              <w:rPr>
+                <w:rFonts w:ascii="Calibri" w:hAnsi="Calibri" w:cs="Arial"/>
+                <w:iCs/>
+                <w:color w:val="3B3838" w:themeColor="background2" w:themeShade="40"/>
+                <w:sz w:val="20"/>
+                <w:szCs w:val="20"/>
+                <w:lang w:eastAsia="es-CL"/>
+              </w:rPr>
               <w:t>frontend</w:t>
             </w:r>
             <w:proofErr w:type="spellEnd"/>
@@ -739,11 +866,36 @@
                 <w:szCs w:val="20"/>
                 <w:lang w:eastAsia="es-CL"/>
               </w:rPr>
-              <w:t xml:space="preserve"> separados por carpetas dentro de la aplicación.</w:t>
-            </w:r>
-          </w:p>
-          <w:p>
-            <w:pPr>
+              <w:t xml:space="preserve"> es una aplicación </w:t>
+            </w:r>
+            <w:proofErr w:type="spellStart"/>
+            <w:r>
+              <w:rPr>
+                <w:rFonts w:ascii="Calibri" w:hAnsi="Calibri" w:cs="Arial"/>
+                <w:iCs/>
+                <w:color w:val="3B3838" w:themeColor="background2" w:themeShade="40"/>
+                <w:sz w:val="20"/>
+                <w:szCs w:val="20"/>
+                <w:lang w:eastAsia="es-CL"/>
+              </w:rPr>
+              <w:t>React</w:t>
+            </w:r>
+            <w:proofErr w:type="spellEnd"/>
+            <w:r>
+              <w:rPr>
+                <w:rFonts w:ascii="Calibri" w:hAnsi="Calibri" w:cs="Arial"/>
+                <w:iCs/>
+                <w:color w:val="3B3838" w:themeColor="background2" w:themeShade="40"/>
+                <w:sz w:val="20"/>
+                <w:szCs w:val="20"/>
+                <w:lang w:eastAsia="es-CL"/>
+              </w:rPr>
+              <w:t xml:space="preserve"> 19 con Vite, en una carpeta separada y conectada por la API. La vista pública muestra el menú diario por categoría, el menú semanal y las preguntas frecuentes, con la cantidad que queda de cada plato actualizada en tiempo real mediante eventos del servidor y una consulta cada 30 segundos de respaldo. El estudiante puede ingresar con su correo institucional, marcar alergias, elegir una categoría preferida, guardar favoritos y calificar platos. Ese ingreso está simulado, porque la autenticación real con Microsoft depende de que la administración de la sede registre la aplicación, algo que no controlamos.</w:t>
+            </w:r>
+          </w:p>
+          <w:p>
+            <w:pPr>
+              <w:spacing w:line="276" w:lineRule="auto"/>
               <w:jc w:val="both"/>
               <w:rPr>
                 <w:rFonts w:ascii="Calibri" w:hAnsi="Calibri" w:cs="Arial"/>
@@ -763,35 +915,24 @@
                 <w:szCs w:val="20"/>
                 <w:lang w:eastAsia="es-CL"/>
               </w:rPr>
-              <w:t xml:space="preserve">En el </w:t>
-            </w:r>
-            <w:proofErr w:type="spellStart"/>
-            <w:r>
-              <w:rPr>
-                <w:rFonts w:ascii="Calibri" w:hAnsi="Calibri" w:cs="Arial"/>
-                <w:iCs/>
-                <w:color w:val="3B3838" w:themeColor="background2" w:themeShade="40"/>
-                <w:sz w:val="20"/>
-                <w:szCs w:val="20"/>
-                <w:lang w:eastAsia="es-CL"/>
-              </w:rPr>
-              <w:t>backend</w:t>
-            </w:r>
-            <w:proofErr w:type="spellEnd"/>
-            <w:r>
-              <w:rPr>
-                <w:rFonts w:ascii="Calibri" w:hAnsi="Calibri" w:cs="Arial"/>
-                <w:iCs/>
-                <w:color w:val="3B3838" w:themeColor="background2" w:themeShade="40"/>
-                <w:sz w:val="20"/>
-                <w:szCs w:val="20"/>
-                <w:lang w:eastAsia="es-CL"/>
-              </w:rPr>
-              <w:t xml:space="preserve"> implementamos funcionalidades relacionadas con la autenticación mediante JWT, control de acceso según roles, gestión de preparaciones, ingredientes, alérgenos e información nutricional, planificación y publicación del menú, gestión de disponibilidad e historial de disponibilidad y consultas públicas del menú.</w:t>
-            </w:r>
-          </w:p>
-          <w:p>
-            <w:pPr>
+              <w:t xml:space="preserve">El panel del personal permite planificar el menú por día o por mes y copiar un día o una semana a otras fechas, administrar preparaciones e ingredientes, calcular la información nutricional por porción a partir de los gramos de cada ingrediente, abrir </w:t>
+            </w:r>
+            <w:r>
+              <w:rPr>
+                <w:rFonts w:ascii="Calibri" w:hAnsi="Calibri" w:cs="Arial"/>
+                <w:iCs/>
+                <w:color w:val="3B3838" w:themeColor="background2" w:themeShade="40"/>
+                <w:sz w:val="20"/>
+                <w:szCs w:val="20"/>
+                <w:lang w:eastAsia="es-CL"/>
+              </w:rPr>
+              <w:lastRenderedPageBreak/>
+              <w:t>y cerrar la jornada, registrar ventas en la caja con un toque por combo y administrar usuarios. El administrador tiene además un módulo de análisis con frecuencia de agotamiento, ventas por hora, preparaciones más vendidas, informe mensual y una predicción de cuánto preparar y a qué hora se agotaría cada plato.</w:t>
+            </w:r>
+          </w:p>
+          <w:p>
+            <w:pPr>
+              <w:spacing w:line="276" w:lineRule="auto"/>
               <w:jc w:val="both"/>
               <w:rPr>
                 <w:rFonts w:ascii="Calibri" w:hAnsi="Calibri" w:cs="Arial"/>
@@ -811,103 +952,29 @@
                 <w:szCs w:val="20"/>
                 <w:lang w:eastAsia="es-CL"/>
               </w:rPr>
-              <w:t xml:space="preserve">El </w:t>
-            </w:r>
-            <w:proofErr w:type="spellStart"/>
-            <w:r>
-              <w:rPr>
-                <w:rFonts w:ascii="Calibri" w:hAnsi="Calibri" w:cs="Arial"/>
-                <w:iCs/>
-                <w:color w:val="3B3838" w:themeColor="background2" w:themeShade="40"/>
-                <w:sz w:val="20"/>
-                <w:szCs w:val="20"/>
-                <w:lang w:eastAsia="es-CL"/>
-              </w:rPr>
-              <w:t>frontend</w:t>
-            </w:r>
-            <w:proofErr w:type="spellEnd"/>
-            <w:r>
-              <w:rPr>
-                <w:rFonts w:ascii="Calibri" w:hAnsi="Calibri" w:cs="Arial"/>
-                <w:iCs/>
-                <w:color w:val="3B3838" w:themeColor="background2" w:themeShade="40"/>
-                <w:sz w:val="20"/>
-                <w:szCs w:val="20"/>
-                <w:lang w:eastAsia="es-CL"/>
-              </w:rPr>
-              <w:t xml:space="preserve"> cuenta con una primera implementación funcional conectada al </w:t>
-            </w:r>
-            <w:proofErr w:type="spellStart"/>
-            <w:r>
-              <w:rPr>
-                <w:rFonts w:ascii="Calibri" w:hAnsi="Calibri" w:cs="Arial"/>
-                <w:iCs/>
-                <w:color w:val="3B3838" w:themeColor="background2" w:themeShade="40"/>
-                <w:sz w:val="20"/>
-                <w:szCs w:val="20"/>
-                <w:lang w:eastAsia="es-CL"/>
-              </w:rPr>
-              <w:t>backend</w:t>
-            </w:r>
-            <w:proofErr w:type="spellEnd"/>
-            <w:r>
-              <w:rPr>
-                <w:rFonts w:ascii="Calibri" w:hAnsi="Calibri" w:cs="Arial"/>
-                <w:iCs/>
-                <w:color w:val="3B3838" w:themeColor="background2" w:themeShade="40"/>
-                <w:sz w:val="20"/>
-                <w:szCs w:val="20"/>
-                <w:lang w:eastAsia="es-CL"/>
-              </w:rPr>
-              <w:t>, orientada principalmente a la consulta de la información del menú. Actualmente permite trabajar con información relacionada con categorías, preparaciones, disponibilidad, alérgenos e información nutricional.</w:t>
-            </w:r>
-          </w:p>
-          <w:p>
-            <w:pPr>
-              <w:jc w:val="both"/>
-              <w:rPr>
-                <w:rFonts w:ascii="Calibri" w:hAnsi="Calibri" w:cs="Arial"/>
-                <w:iCs/>
-                <w:color w:val="3B3838" w:themeColor="background2" w:themeShade="40"/>
-                <w:sz w:val="20"/>
-                <w:szCs w:val="20"/>
-                <w:lang w:eastAsia="es-CL"/>
-              </w:rPr>
-            </w:pPr>
-            <w:r>
-              <w:rPr>
-                <w:rFonts w:ascii="Calibri" w:hAnsi="Calibri" w:cs="Arial"/>
-                <w:iCs/>
-                <w:color w:val="3B3838" w:themeColor="background2" w:themeShade="40"/>
-                <w:sz w:val="20"/>
-                <w:szCs w:val="20"/>
-                <w:lang w:eastAsia="es-CL"/>
-              </w:rPr>
-              <w:t>Actualmente nos encontramos trabajando en el Sprint 4, manteniendo el cronograma general definido inicialmente. El desarrollo se ha realizado de manera incremental, revisando las funcionalidades implementadas y ajustando la documentación cuando ha sido necesario.</w:t>
-            </w:r>
-          </w:p>
-          <w:p>
-            <w:pPr>
-              <w:jc w:val="both"/>
-              <w:rPr>
-                <w:rFonts w:ascii="Calibri" w:hAnsi="Calibri" w:cs="Arial"/>
-                <w:iCs/>
-                <w:color w:val="3B3838" w:themeColor="background2" w:themeShade="40"/>
-                <w:sz w:val="20"/>
-                <w:szCs w:val="20"/>
-                <w:lang w:eastAsia="es-CL"/>
-              </w:rPr>
-            </w:pPr>
-            <w:r>
-              <w:rPr>
-                <w:rFonts w:ascii="Calibri" w:hAnsi="Calibri" w:cs="Arial"/>
-                <w:iCs/>
-                <w:color w:val="3B3838" w:themeColor="background2" w:themeShade="40"/>
-                <w:sz w:val="20"/>
-                <w:szCs w:val="20"/>
-                <w:lang w:eastAsia="es-CL"/>
-              </w:rPr>
-              <w:t>Respecto al uso de datos de venta, inicialmente se consideró como una posibilidad para incorporar análisis de consumo y apoyar la toma de decisiones del casino. Sin embargo, debido a que su utilización dependería de autorizaciones y acceso a información externa al equipo, se mantiene como una posibilidad futura y no como una funcionalidad del MVP.</w:t>
+              <w:t xml:space="preserve">Sobre los datos de venta: el casino lo opera Campomar, dueña del sistema de caja, y no tenemos acceso a esos datos. Por eso el escenario C (datos simulados) quedó como base. </w:t>
+            </w:r>
+            <w:r>
+              <w:rPr>
+                <w:rFonts w:ascii="Calibri" w:hAnsi="Calibri" w:cs="Arial"/>
+                <w:iCs/>
+                <w:color w:val="3B3838" w:themeColor="background2" w:themeShade="40"/>
+                <w:sz w:val="20"/>
+                <w:szCs w:val="20"/>
+                <w:lang w:eastAsia="es-CL"/>
+              </w:rPr>
+              <w:t>Además,</w:t>
+            </w:r>
+            <w:r>
+              <w:rPr>
+                <w:rFonts w:ascii="Calibri" w:hAnsi="Calibri" w:cs="Arial"/>
+                <w:iCs/>
+                <w:color w:val="3B3838" w:themeColor="background2" w:themeShade="40"/>
+                <w:sz w:val="20"/>
+                <w:szCs w:val="20"/>
+                <w:lang w:eastAsia="es-CL"/>
+              </w:rPr>
+              <w:t xml:space="preserve"> construimos una pantalla de caja propia, de modo que el sistema genera sus propios registros de venta, que se suman a los datos simulados por un script con semilla fija. Ninguna cifra de análisis o predicción refleja todavía el consumo real del casino, y la interfaz lo avisa cuando hay datos simulados.</w:t>
             </w:r>
           </w:p>
         </w:tc>
@@ -948,6 +1015,126 @@
               <w:jc w:val="both"/>
               <w:rPr>
                 <w:rFonts w:ascii="Calibri" w:hAnsi="Calibri" w:cs="Arial"/>
+                <w:iCs/>
+                <w:color w:val="3B3838" w:themeColor="background2" w:themeShade="40"/>
+                <w:sz w:val="20"/>
+                <w:szCs w:val="20"/>
+                <w:lang w:eastAsia="es-CL"/>
+              </w:rPr>
+            </w:pPr>
+            <w:r>
+              <w:rPr>
+                <w:rFonts w:ascii="Calibri" w:hAnsi="Calibri" w:cs="Arial"/>
+                <w:iCs/>
+                <w:color w:val="3B3838" w:themeColor="background2" w:themeShade="40"/>
+                <w:sz w:val="20"/>
+                <w:szCs w:val="20"/>
+                <w:lang w:eastAsia="es-CL"/>
+              </w:rPr>
+              <w:t>Mantenemos el objetivo general y los seis objetivos específicos de la Fase 1, sin modificaciones.</w:t>
+            </w:r>
+          </w:p>
+          <w:p>
+            <w:pPr>
+              <w:jc w:val="both"/>
+              <w:rPr>
+                <w:rFonts w:ascii="Calibri" w:hAnsi="Calibri" w:cs="Arial"/>
+                <w:iCs/>
+                <w:color w:val="3B3838" w:themeColor="background2" w:themeShade="40"/>
+                <w:sz w:val="20"/>
+                <w:szCs w:val="20"/>
+                <w:lang w:eastAsia="es-CL"/>
+              </w:rPr>
+            </w:pPr>
+            <w:r>
+              <w:rPr>
+                <w:rFonts w:ascii="Calibri" w:hAnsi="Calibri" w:cs="Arial"/>
+                <w:iCs/>
+                <w:color w:val="3B3838" w:themeColor="background2" w:themeShade="40"/>
+                <w:sz w:val="20"/>
+                <w:szCs w:val="20"/>
+                <w:lang w:eastAsia="es-CL"/>
+              </w:rPr>
+              <w:t xml:space="preserve">Estado de cada uno: la validación del problema (entrevista a la encargada, respuesta de la nutricionista y encuesta a 31 estudiantes) está hecha. </w:t>
+            </w:r>
+          </w:p>
+          <w:p>
+            <w:pPr>
+              <w:jc w:val="both"/>
+              <w:rPr>
+                <w:rFonts w:ascii="Calibri" w:hAnsi="Calibri" w:cs="Arial"/>
+                <w:iCs/>
+                <w:color w:val="3B3838" w:themeColor="background2" w:themeShade="40"/>
+                <w:sz w:val="20"/>
+                <w:szCs w:val="20"/>
+                <w:lang w:eastAsia="es-CL"/>
+              </w:rPr>
+            </w:pPr>
+            <w:r>
+              <w:rPr>
+                <w:rFonts w:ascii="Calibri" w:hAnsi="Calibri" w:cs="Arial"/>
+                <w:iCs/>
+                <w:color w:val="3B3838" w:themeColor="background2" w:themeShade="40"/>
+                <w:sz w:val="20"/>
+                <w:szCs w:val="20"/>
+                <w:lang w:eastAsia="es-CL"/>
+              </w:rPr>
+              <w:t xml:space="preserve">El modelo de datos está implementado y creció en siete migraciones. Los módulos de gestión de menú, disponibilidad y consulta estudiantil están implementados y se siguen ampliando. </w:t>
+            </w:r>
+          </w:p>
+          <w:p>
+            <w:pPr>
+              <w:jc w:val="both"/>
+              <w:rPr>
+                <w:rFonts w:ascii="Calibri" w:hAnsi="Calibri" w:cs="Arial"/>
+                <w:iCs/>
+                <w:color w:val="3B3838" w:themeColor="background2" w:themeShade="40"/>
+                <w:sz w:val="20"/>
+                <w:szCs w:val="20"/>
+                <w:lang w:eastAsia="es-CL"/>
+              </w:rPr>
+            </w:pPr>
+            <w:r>
+              <w:rPr>
+                <w:rFonts w:ascii="Calibri" w:hAnsi="Calibri" w:cs="Arial"/>
+                <w:iCs/>
+                <w:color w:val="3B3838" w:themeColor="background2" w:themeShade="40"/>
+                <w:sz w:val="20"/>
+                <w:szCs w:val="20"/>
+                <w:lang w:eastAsia="es-CL"/>
+              </w:rPr>
+              <w:t xml:space="preserve">El escenario de datos de venta quedó decidido, con datos simulados como base. </w:t>
+            </w:r>
+          </w:p>
+          <w:p>
+            <w:pPr>
+              <w:jc w:val="both"/>
+              <w:rPr>
+                <w:rFonts w:ascii="Calibri" w:hAnsi="Calibri" w:cs="Arial"/>
+                <w:iCs/>
+                <w:color w:val="3B3838" w:themeColor="background2" w:themeShade="40"/>
+                <w:sz w:val="20"/>
+                <w:szCs w:val="20"/>
+                <w:lang w:eastAsia="es-CL"/>
+              </w:rPr>
+            </w:pPr>
+            <w:r>
+              <w:rPr>
+                <w:rFonts w:ascii="Calibri" w:hAnsi="Calibri" w:cs="Arial"/>
+                <w:iCs/>
+                <w:color w:val="3B3838" w:themeColor="background2" w:themeShade="40"/>
+                <w:sz w:val="20"/>
+                <w:szCs w:val="20"/>
+                <w:lang w:eastAsia="es-CL"/>
+              </w:rPr>
+              <w:t>El plan de pruebas está en ejecución, con las pruebas automatizadas más avanzadas que su documentación.</w:t>
+            </w:r>
+          </w:p>
+          <w:p>
+            <w:pPr>
+              <w:jc w:val="both"/>
+              <w:rPr>
+                <w:rFonts w:ascii="Calibri" w:hAnsi="Calibri" w:cs="Arial"/>
                 <w:b/>
                 <w:i/>
                 <w:color w:val="3B3838" w:themeColor="background2" w:themeShade="40"/>
@@ -965,18 +1152,7 @@
                 <w:szCs w:val="20"/>
                 <w:lang w:eastAsia="es-CL"/>
               </w:rPr>
-              <w:t>No hemos realizado modificaciones importantes a los objetivos definidos en la Fase 1</w:t>
-            </w:r>
-            <w:r>
-              <w:rPr>
-                <w:rFonts w:ascii="Calibri" w:hAnsi="Calibri" w:cs="Arial"/>
-                <w:iCs/>
-                <w:color w:val="3B3838" w:themeColor="background2" w:themeShade="40"/>
-                <w:sz w:val="20"/>
-                <w:szCs w:val="20"/>
-                <w:lang w:eastAsia="es-CL"/>
-              </w:rPr>
-              <w:t>.</w:t>
+              <w:t>El aporte individual se documenta en el historial de Git y en los diarios de reflexión.</w:t>
             </w:r>
           </w:p>
         </w:tc>
@@ -1032,29 +1208,7 @@
                 <w:szCs w:val="20"/>
                 <w:lang w:eastAsia="es-CL"/>
               </w:rPr>
-              <w:t>Mantenemos la metodología definida durante la Fase 1</w:t>
-            </w:r>
-            <w:r>
-              <w:rPr>
-                <w:rFonts w:ascii="Calibri" w:hAnsi="Calibri" w:cs="Arial"/>
-                <w:iCs/>
-                <w:color w:val="3B3838" w:themeColor="background2" w:themeShade="40"/>
-                <w:sz w:val="20"/>
-                <w:szCs w:val="20"/>
-                <w:lang w:eastAsia="es-CL"/>
-              </w:rPr>
-              <w:t>, u</w:t>
-            </w:r>
-            <w:r>
-              <w:rPr>
-                <w:rFonts w:ascii="Calibri" w:hAnsi="Calibri" w:cs="Arial"/>
-                <w:iCs/>
-                <w:color w:val="3B3838" w:themeColor="background2" w:themeShade="40"/>
-                <w:sz w:val="20"/>
-                <w:szCs w:val="20"/>
-                <w:lang w:eastAsia="es-CL"/>
-              </w:rPr>
-              <w:t xml:space="preserve">tilizamos un enfoque ágil, incorporando técnicas de </w:t>
+              <w:t xml:space="preserve">Seguimos con un enfoque ágil: </w:t>
             </w:r>
             <w:proofErr w:type="spellStart"/>
             <w:r>
@@ -1102,7 +1256,7 @@
                 <w:szCs w:val="20"/>
                 <w:lang w:eastAsia="es-CL"/>
               </w:rPr>
-              <w:t xml:space="preserve"> durante la etapa inicial de levantamiento y validación, y Scrum mediante </w:t>
+              <w:t xml:space="preserve"> en el levantamiento de la Fase 1 y Scrum en el desarrollo. El trabajo está organizado en nueve </w:t>
             </w:r>
             <w:proofErr w:type="spellStart"/>
             <w:r>
@@ -1126,41 +1280,9 @@
                 <w:szCs w:val="20"/>
                 <w:lang w:eastAsia="es-CL"/>
               </w:rPr>
-              <w:t xml:space="preserve"> de dos semanas durante la etapa de desarrollo.</w:t>
-            </w:r>
-          </w:p>
-        </w:tc>
-      </w:tr>
-      <w:tr>
-        <w:trPr>
-          <w:trHeight w:val="2377"/>
-        </w:trPr>
-        <w:tc>
-          <w:tcPr>
-            <w:tcW w:w="2528" w:type="dxa"/>
-            <w:vAlign w:val="center"/>
-          </w:tcPr>
-          <w:p>
-            <w:pPr>
-              <w:rPr>
-                <w:rFonts w:ascii="Calibri" w:hAnsi="Calibri"/>
-                <w:color w:val="1F3864" w:themeColor="accent1" w:themeShade="80"/>
-              </w:rPr>
-            </w:pPr>
-            <w:r>
-              <w:rPr>
-                <w:rFonts w:ascii="Calibri" w:hAnsi="Calibri"/>
-                <w:color w:val="1F3864" w:themeColor="accent1" w:themeShade="80"/>
-              </w:rPr>
-              <w:t>Evidencias de avance</w:t>
-            </w:r>
-          </w:p>
-        </w:tc>
-        <w:tc>
-          <w:tcPr>
-            <w:tcW w:w="7111" w:type="dxa"/>
-            <w:vAlign w:val="center"/>
-          </w:tcPr>
+              <w:t xml:space="preserve">. </w:t>
+            </w:r>
+          </w:p>
           <w:p>
             <w:pPr>
               <w:jc w:val="both"/>
@@ -1182,7 +1304,7 @@
                 <w:szCs w:val="20"/>
                 <w:lang w:eastAsia="es-CL"/>
               </w:rPr>
-              <w:t>Como evidencias del avance del proyecto presentamos la documentación técnica y los componentes desarrollados durante esta fase.</w:t>
+              <w:t>Su duración se ajustó al tamaño de cada grupo de historias, así que no todos duraron las dos semanas previstas.</w:t>
             </w:r>
           </w:p>
           <w:p>
@@ -1206,55 +1328,7 @@
                 <w:szCs w:val="20"/>
                 <w:lang w:eastAsia="es-CL"/>
               </w:rPr>
-              <w:t xml:space="preserve">Entre las principales evidencias se encuentran el documento de arquitectura, el modelo entidad-relación, el plan de pruebas, el modelo de base de datos en PostgreSQL, el </w:t>
-            </w:r>
-            <w:proofErr w:type="spellStart"/>
-            <w:r>
-              <w:rPr>
-                <w:rFonts w:ascii="Calibri" w:hAnsi="Calibri" w:cs="Arial"/>
-                <w:iCs/>
-                <w:color w:val="3B3838" w:themeColor="background2" w:themeShade="40"/>
-                <w:sz w:val="20"/>
-                <w:szCs w:val="20"/>
-                <w:lang w:eastAsia="es-CL"/>
-              </w:rPr>
-              <w:t>backend</w:t>
-            </w:r>
-            <w:proofErr w:type="spellEnd"/>
-            <w:r>
-              <w:rPr>
-                <w:rFonts w:ascii="Calibri" w:hAnsi="Calibri" w:cs="Arial"/>
-                <w:iCs/>
-                <w:color w:val="3B3838" w:themeColor="background2" w:themeShade="40"/>
-                <w:sz w:val="20"/>
-                <w:szCs w:val="20"/>
-                <w:lang w:eastAsia="es-CL"/>
-              </w:rPr>
-              <w:t xml:space="preserve"> y el </w:t>
-            </w:r>
-            <w:proofErr w:type="spellStart"/>
-            <w:r>
-              <w:rPr>
-                <w:rFonts w:ascii="Calibri" w:hAnsi="Calibri" w:cs="Arial"/>
-                <w:iCs/>
-                <w:color w:val="3B3838" w:themeColor="background2" w:themeShade="40"/>
-                <w:sz w:val="20"/>
-                <w:szCs w:val="20"/>
-                <w:lang w:eastAsia="es-CL"/>
-              </w:rPr>
-              <w:t>frontend</w:t>
-            </w:r>
-            <w:proofErr w:type="spellEnd"/>
-            <w:r>
-              <w:rPr>
-                <w:rFonts w:ascii="Calibri" w:hAnsi="Calibri" w:cs="Arial"/>
-                <w:iCs/>
-                <w:color w:val="3B3838" w:themeColor="background2" w:themeShade="40"/>
-                <w:sz w:val="20"/>
-                <w:szCs w:val="20"/>
-                <w:lang w:eastAsia="es-CL"/>
-              </w:rPr>
-              <w:t xml:space="preserve"> de la aplicación.</w:t>
+              <w:t xml:space="preserve">Varias funciones nacieron durante el desarrollo y no estaban en el backlog original. La caja, el stock exacto, el ranking mensual, los roles de cajero y nutricionista y el cálculo nutricional quedaron identificados en el código como RF-21 a RF-28, mientras que la especificación de requerimientos llega solo hasta el RF-20. </w:t>
             </w:r>
           </w:p>
           <w:p>
@@ -1278,149 +1352,28 @@
                 <w:szCs w:val="20"/>
                 <w:lang w:eastAsia="es-CL"/>
               </w:rPr>
-              <w:t xml:space="preserve">Estas evidencias permiten demostrar el avance desde la planificación y diseño hacia la implementación del sistema. La arquitectura y el modelo de datos permiten evidenciar las decisiones técnicas realizadas, mientras que el </w:t>
-            </w:r>
-            <w:proofErr w:type="spellStart"/>
-            <w:r>
-              <w:rPr>
-                <w:rFonts w:ascii="Calibri" w:hAnsi="Calibri" w:cs="Arial"/>
-                <w:iCs/>
-                <w:color w:val="3B3838" w:themeColor="background2" w:themeShade="40"/>
-                <w:sz w:val="20"/>
-                <w:szCs w:val="20"/>
-                <w:lang w:eastAsia="es-CL"/>
-              </w:rPr>
-              <w:t>backend</w:t>
-            </w:r>
-            <w:proofErr w:type="spellEnd"/>
-            <w:r>
-              <w:rPr>
-                <w:rFonts w:ascii="Calibri" w:hAnsi="Calibri" w:cs="Arial"/>
-                <w:iCs/>
-                <w:color w:val="3B3838" w:themeColor="background2" w:themeShade="40"/>
-                <w:sz w:val="20"/>
-                <w:szCs w:val="20"/>
-                <w:lang w:eastAsia="es-CL"/>
-              </w:rPr>
-              <w:t xml:space="preserve">, </w:t>
-            </w:r>
-            <w:proofErr w:type="spellStart"/>
-            <w:r>
-              <w:rPr>
-                <w:rFonts w:ascii="Calibri" w:hAnsi="Calibri" w:cs="Arial"/>
-                <w:iCs/>
-                <w:color w:val="3B3838" w:themeColor="background2" w:themeShade="40"/>
-                <w:sz w:val="20"/>
-                <w:szCs w:val="20"/>
-                <w:lang w:eastAsia="es-CL"/>
-              </w:rPr>
-              <w:t>frontend</w:t>
-            </w:r>
-            <w:proofErr w:type="spellEnd"/>
-            <w:r>
-              <w:rPr>
-                <w:rFonts w:ascii="Calibri" w:hAnsi="Calibri" w:cs="Arial"/>
-                <w:iCs/>
-                <w:color w:val="3B3838" w:themeColor="background2" w:themeShade="40"/>
-                <w:sz w:val="20"/>
-                <w:szCs w:val="20"/>
-                <w:lang w:eastAsia="es-CL"/>
-              </w:rPr>
-              <w:t xml:space="preserve"> y base de datos permiten demostrar la implementación de las funcionalidades definidas para el MVP.</w:t>
-            </w:r>
-          </w:p>
-          <w:p>
-            <w:pPr>
-              <w:jc w:val="both"/>
-              <w:rPr>
-                <w:rFonts w:ascii="Calibri" w:hAnsi="Calibri" w:cs="Arial"/>
-                <w:b/>
-                <w:iCs/>
-                <w:color w:val="3B3838" w:themeColor="background2" w:themeShade="40"/>
-                <w:sz w:val="20"/>
-                <w:szCs w:val="20"/>
-                <w:lang w:eastAsia="es-CL"/>
-              </w:rPr>
-            </w:pPr>
-            <w:r>
-              <w:rPr>
-                <w:rFonts w:ascii="Calibri" w:hAnsi="Calibri" w:cs="Arial"/>
-                <w:iCs/>
-                <w:color w:val="3B3838" w:themeColor="background2" w:themeShade="40"/>
-                <w:sz w:val="20"/>
-                <w:szCs w:val="20"/>
-                <w:lang w:eastAsia="es-CL"/>
-              </w:rPr>
-              <w:t xml:space="preserve">Hemos </w:t>
-            </w:r>
-            <w:r>
-              <w:rPr>
-                <w:rFonts w:ascii="Calibri" w:hAnsi="Calibri" w:cs="Arial"/>
-                <w:iCs/>
-                <w:color w:val="3B3838" w:themeColor="background2" w:themeShade="40"/>
-                <w:sz w:val="20"/>
-                <w:szCs w:val="20"/>
-                <w:lang w:eastAsia="es-CL"/>
-              </w:rPr>
-              <w:t xml:space="preserve">utilizado control de versiones mediante Git y GitHub, documentación técnica, separación entre </w:t>
-            </w:r>
-            <w:proofErr w:type="spellStart"/>
-            <w:r>
-              <w:rPr>
-                <w:rFonts w:ascii="Calibri" w:hAnsi="Calibri" w:cs="Arial"/>
-                <w:iCs/>
-                <w:color w:val="3B3838" w:themeColor="background2" w:themeShade="40"/>
-                <w:sz w:val="20"/>
-                <w:szCs w:val="20"/>
-                <w:lang w:eastAsia="es-CL"/>
-              </w:rPr>
-              <w:t>frontend</w:t>
-            </w:r>
-            <w:proofErr w:type="spellEnd"/>
-            <w:r>
-              <w:rPr>
-                <w:rFonts w:ascii="Calibri" w:hAnsi="Calibri" w:cs="Arial"/>
-                <w:iCs/>
-                <w:color w:val="3B3838" w:themeColor="background2" w:themeShade="40"/>
-                <w:sz w:val="20"/>
-                <w:szCs w:val="20"/>
-                <w:lang w:eastAsia="es-CL"/>
-              </w:rPr>
-              <w:t xml:space="preserve"> y </w:t>
-            </w:r>
-            <w:proofErr w:type="spellStart"/>
-            <w:r>
-              <w:rPr>
-                <w:rFonts w:ascii="Calibri" w:hAnsi="Calibri" w:cs="Arial"/>
-                <w:iCs/>
-                <w:color w:val="3B3838" w:themeColor="background2" w:themeShade="40"/>
-                <w:sz w:val="20"/>
-                <w:szCs w:val="20"/>
-                <w:lang w:eastAsia="es-CL"/>
-              </w:rPr>
-              <w:t>backend</w:t>
-            </w:r>
-            <w:proofErr w:type="spellEnd"/>
-            <w:r>
-              <w:rPr>
-                <w:rFonts w:ascii="Calibri" w:hAnsi="Calibri" w:cs="Arial"/>
-                <w:iCs/>
-                <w:color w:val="3B3838" w:themeColor="background2" w:themeShade="40"/>
-                <w:sz w:val="20"/>
-                <w:szCs w:val="20"/>
-                <w:lang w:eastAsia="es-CL"/>
-              </w:rPr>
-              <w:t>, manejo de errores, autenticación y control de acceso por roles. Además, contamos con un plan de pruebas que será utilizado para validar las funcionalidades desarrolladas.</w:t>
+              <w:t>La predicción todavía no tiene número de requisito. Tratamos todo esto como cambios de alcance (sección 3).</w:t>
             </w:r>
           </w:p>
         </w:tc>
       </w:tr>
     </w:tbl>
+    <w:p>
+      <w:pPr>
+        <w:spacing w:after="0" w:line="240" w:lineRule="auto"/>
+        <w:rPr>
+          <w:rFonts w:cs="Calibri Light"/>
+          <w:color w:val="595959" w:themeColor="text1" w:themeTint="A6"/>
+          <w:sz w:val="24"/>
+          <w:szCs w:val="24"/>
+        </w:rPr>
+      </w:pPr>
+    </w:p>
     <w:tbl>
       <w:tblPr>
         <w:tblStyle w:val="Tablaconcuadrcula"/>
-        <w:tblpPr w:leftFromText="141" w:rightFromText="141" w:vertAnchor="text" w:horzAnchor="margin" w:tblpXSpec="center" w:tblpY="105"/>
         <w:tblW w:w="9640" w:type="dxa"/>
+        <w:tblInd w:w="-568" w:type="dxa"/>
         <w:tblBorders>
           <w:top w:val="single" w:sz="4" w:space="0" w:color="BFBFBF" w:themeColor="background1" w:themeShade="BF"/>
           <w:left w:val="single" w:sz="4" w:space="0" w:color="BFBFBF" w:themeColor="background1" w:themeShade="BF"/>
@@ -1525,11 +1478,71 @@
         </w:tc>
       </w:tr>
     </w:tbl>
+    <w:p>
+      <w:pPr>
+        <w:spacing w:after="0" w:line="240" w:lineRule="auto"/>
+        <w:rPr>
+          <w:rFonts w:cs="Calibri Light"/>
+          <w:color w:val="595959" w:themeColor="text1" w:themeTint="A6"/>
+          <w:sz w:val="24"/>
+          <w:szCs w:val="24"/>
+          <w:lang w:val="es-ES"/>
+        </w:rPr>
+      </w:pPr>
+    </w:p>
+    <w:p>
+      <w:pPr>
+        <w:spacing w:after="0" w:line="240" w:lineRule="auto"/>
+        <w:rPr>
+          <w:rFonts w:cs="Calibri Light"/>
+          <w:color w:val="595959" w:themeColor="text1" w:themeTint="A6"/>
+          <w:sz w:val="24"/>
+          <w:szCs w:val="24"/>
+          <w:lang w:val="es-ES"/>
+        </w:rPr>
+      </w:pPr>
+    </w:p>
+    <w:p>
+      <w:pPr>
+        <w:spacing w:after="0" w:line="240" w:lineRule="auto"/>
+        <w:rPr>
+          <w:rFonts w:cs="Calibri Light"/>
+          <w:color w:val="595959" w:themeColor="text1" w:themeTint="A6"/>
+          <w:sz w:val="24"/>
+          <w:szCs w:val="24"/>
+          <w:lang w:val="es-ES"/>
+        </w:rPr>
+      </w:pPr>
+    </w:p>
+    <w:p>
+      <w:pPr>
+        <w:spacing w:after="0" w:line="240" w:lineRule="auto"/>
+        <w:rPr>
+          <w:rFonts w:cs="Calibri Light"/>
+          <w:color w:val="595959" w:themeColor="text1" w:themeTint="A6"/>
+          <w:sz w:val="24"/>
+          <w:szCs w:val="24"/>
+          <w:lang w:val="es-ES"/>
+        </w:rPr>
+      </w:pPr>
+    </w:p>
+    <w:p>
+      <w:pPr>
+        <w:spacing w:after="0" w:line="240" w:lineRule="auto"/>
+        <w:rPr>
+          <w:rFonts w:cs="Calibri Light"/>
+          <w:color w:val="595959" w:themeColor="text1" w:themeTint="A6"/>
+          <w:sz w:val="24"/>
+          <w:szCs w:val="24"/>
+          <w:lang w:val="es-ES"/>
+        </w:rPr>
+      </w:pPr>
+    </w:p>
     <w:tbl>
       <w:tblPr>
         <w:tblStyle w:val="Tablaconcuadrcula"/>
-        <w:tblpPr w:leftFromText="180" w:rightFromText="180" w:vertAnchor="page" w:horzAnchor="margin" w:tblpXSpec="center" w:tblpY="9766"/>
         <w:tblW w:w="9776" w:type="dxa"/>
+        <w:tblInd w:w="-643" w:type="dxa"/>
         <w:tblBorders>
           <w:top w:val="single" w:sz="4" w:space="0" w:color="BFBFBF" w:themeColor="background1" w:themeShade="BF"/>
           <w:left w:val="single" w:sz="4" w:space="0" w:color="BFBFBF" w:themeColor="background1" w:themeShade="BF"/>
@@ -1542,14 +1555,14 @@
         <w:tblLook w:val="04A0" w:firstRow="1" w:lastRow="0" w:firstColumn="1" w:lastColumn="0" w:noHBand="0" w:noVBand="1"/>
       </w:tblPr>
       <w:tblGrid>
-        <w:gridCol w:w="1328"/>
-        <w:gridCol w:w="1077"/>
-        <w:gridCol w:w="1276"/>
-        <w:gridCol w:w="1276"/>
-        <w:gridCol w:w="1275"/>
-        <w:gridCol w:w="1276"/>
-        <w:gridCol w:w="851"/>
-        <w:gridCol w:w="1417"/>
+        <w:gridCol w:w="1300"/>
+        <w:gridCol w:w="1250"/>
+        <w:gridCol w:w="1100"/>
+        <w:gridCol w:w="950"/>
+        <w:gridCol w:w="900"/>
+        <w:gridCol w:w="1650"/>
+        <w:gridCol w:w="826"/>
+        <w:gridCol w:w="1800"/>
       </w:tblGrid>
       <w:tr>
         <w:trPr>
@@ -1576,6 +1589,7 @@
                 <w:color w:val="1F3864" w:themeColor="accent1" w:themeShade="80"/>
                 <w:sz w:val="18"/>
               </w:rPr>
+              <w:lastRenderedPageBreak/>
               <w:t>Plan de Trabajo</w:t>
             </w:r>
           </w:p>
@@ -1587,7 +1601,7 @@
         </w:trPr>
         <w:tc>
           <w:tcPr>
-            <w:tcW w:w="1328" w:type="dxa"/>
+            <w:tcW w:w="1300" w:type="dxa"/>
             <w:vAlign w:val="center"/>
           </w:tcPr>
           <w:p>
@@ -1604,6 +1618,7 @@
                 <w:rFonts w:ascii="Calibri" w:hAnsi="Calibri"/>
                 <w:color w:val="1F3864" w:themeColor="accent1" w:themeShade="80"/>
                 <w:sz w:val="18"/>
+                <w:szCs w:val="18"/>
               </w:rPr>
               <w:t>C</w:t>
             </w:r>
@@ -1612,6 +1627,7 @@
                 <w:rFonts w:ascii="Calibri" w:hAnsi="Calibri"/>
                 <w:color w:val="1F3864" w:themeColor="accent1" w:themeShade="80"/>
                 <w:sz w:val="18"/>
+                <w:szCs w:val="18"/>
               </w:rPr>
               <w:t>ompetencia</w:t>
             </w:r>
@@ -1620,6 +1636,7 @@
                 <w:rFonts w:ascii="Calibri" w:hAnsi="Calibri"/>
                 <w:color w:val="1F3864" w:themeColor="accent1" w:themeShade="80"/>
                 <w:sz w:val="18"/>
+                <w:szCs w:val="18"/>
               </w:rPr>
               <w:t xml:space="preserve"> o unidades de competencias</w:t>
             </w:r>
@@ -1627,7 +1644,7 @@
         </w:tc>
         <w:tc>
           <w:tcPr>
-            <w:tcW w:w="1077" w:type="dxa"/>
+            <w:tcW w:w="1250" w:type="dxa"/>
             <w:vAlign w:val="center"/>
           </w:tcPr>
           <w:p>
@@ -1644,6 +1661,7 @@
                 <w:rFonts w:ascii="Calibri" w:hAnsi="Calibri"/>
                 <w:color w:val="1F3864" w:themeColor="accent1" w:themeShade="80"/>
                 <w:sz w:val="18"/>
+                <w:szCs w:val="18"/>
               </w:rPr>
               <w:t>Actividades</w:t>
             </w:r>
@@ -1651,7 +1669,7 @@
         </w:tc>
         <w:tc>
           <w:tcPr>
-            <w:tcW w:w="1276" w:type="dxa"/>
+            <w:tcW w:w="1100" w:type="dxa"/>
             <w:vAlign w:val="center"/>
           </w:tcPr>
           <w:p>
@@ -1668,6 +1686,7 @@
                 <w:rFonts w:ascii="Calibri" w:hAnsi="Calibri"/>
                 <w:color w:val="1F3864" w:themeColor="accent1" w:themeShade="80"/>
                 <w:sz w:val="18"/>
+                <w:szCs w:val="18"/>
               </w:rPr>
               <w:t>Recursos</w:t>
             </w:r>
@@ -1675,7 +1694,7 @@
         </w:tc>
         <w:tc>
           <w:tcPr>
-            <w:tcW w:w="1276" w:type="dxa"/>
+            <w:tcW w:w="950" w:type="dxa"/>
             <w:vAlign w:val="center"/>
           </w:tcPr>
           <w:p>
@@ -1692,6 +1711,7 @@
                 <w:rFonts w:ascii="Calibri" w:hAnsi="Calibri"/>
                 <w:color w:val="1F3864" w:themeColor="accent1" w:themeShade="80"/>
                 <w:sz w:val="18"/>
+                <w:szCs w:val="18"/>
               </w:rPr>
               <w:t>Duración de la actividad</w:t>
             </w:r>
@@ -1699,7 +1719,7 @@
         </w:tc>
         <w:tc>
           <w:tcPr>
-            <w:tcW w:w="1275" w:type="dxa"/>
+            <w:tcW w:w="900" w:type="dxa"/>
             <w:vAlign w:val="center"/>
           </w:tcPr>
           <w:p>
@@ -1716,6 +1736,7 @@
                 <w:rFonts w:ascii="Calibri" w:hAnsi="Calibri"/>
                 <w:color w:val="1F3864" w:themeColor="accent1" w:themeShade="80"/>
                 <w:sz w:val="18"/>
+                <w:szCs w:val="18"/>
               </w:rPr>
               <w:t>Responsable</w:t>
             </w:r>
@@ -1725,6 +1746,7 @@
                 <w:rFonts w:ascii="Calibri" w:hAnsi="Calibri"/>
                 <w:color w:val="1F3864" w:themeColor="accent1" w:themeShade="80"/>
                 <w:sz w:val="18"/>
+                <w:szCs w:val="18"/>
               </w:rPr>
               <w:footnoteReference w:id="1"/>
             </w:r>
@@ -1732,7 +1754,7 @@
         </w:tc>
         <w:tc>
           <w:tcPr>
-            <w:tcW w:w="1276" w:type="dxa"/>
+            <w:tcW w:w="1650" w:type="dxa"/>
             <w:vAlign w:val="center"/>
           </w:tcPr>
           <w:p>
@@ -1749,6 +1771,7 @@
                 <w:rFonts w:ascii="Calibri" w:hAnsi="Calibri"/>
                 <w:color w:val="1F3864" w:themeColor="accent1" w:themeShade="80"/>
                 <w:sz w:val="18"/>
+                <w:szCs w:val="18"/>
               </w:rPr>
               <w:t>Observaciones</w:t>
             </w:r>
@@ -1756,7 +1779,7 @@
         </w:tc>
         <w:tc>
           <w:tcPr>
-            <w:tcW w:w="851" w:type="dxa"/>
+            <w:tcW w:w="826" w:type="dxa"/>
             <w:vAlign w:val="center"/>
           </w:tcPr>
           <w:p>
@@ -1773,6 +1796,7 @@
                 <w:rFonts w:ascii="Calibri" w:hAnsi="Calibri"/>
                 <w:color w:val="1F3864" w:themeColor="accent1" w:themeShade="80"/>
                 <w:sz w:val="18"/>
+                <w:szCs w:val="18"/>
               </w:rPr>
               <w:t>Estado de avance</w:t>
             </w:r>
@@ -1780,7 +1804,7 @@
         </w:tc>
         <w:tc>
           <w:tcPr>
-            <w:tcW w:w="1417" w:type="dxa"/>
+            <w:tcW w:w="1800" w:type="dxa"/>
             <w:vAlign w:val="center"/>
           </w:tcPr>
           <w:p>
@@ -1797,6 +1821,7 @@
                 <w:rFonts w:ascii="Calibri" w:hAnsi="Calibri"/>
                 <w:color w:val="1F3864" w:themeColor="accent1" w:themeShade="80"/>
                 <w:sz w:val="18"/>
+                <w:szCs w:val="18"/>
               </w:rPr>
               <w:t>A</w:t>
             </w:r>
@@ -1805,6 +1830,7 @@
                 <w:rFonts w:ascii="Calibri" w:hAnsi="Calibri"/>
                 <w:color w:val="1F3864" w:themeColor="accent1" w:themeShade="80"/>
                 <w:sz w:val="18"/>
+                <w:szCs w:val="18"/>
               </w:rPr>
               <w:t>justes</w:t>
             </w:r>
@@ -1817,26 +1843,25 @@
         </w:trPr>
         <w:tc>
           <w:tcPr>
-            <w:tcW w:w="1328" w:type="dxa"/>
-          </w:tcPr>
-          <w:p>
-            <w:pPr>
-              <w:jc w:val="both"/>
-              <w:rPr>
-                <w:b/>
-                <w:iCs/>
-                <w:sz w:val="18"/>
-                <w:szCs w:val="24"/>
-              </w:rPr>
-            </w:pPr>
-            <w:r>
-              <w:rPr>
-                <w:rFonts w:ascii="Calibri" w:hAnsi="Calibri" w:cs="Arial"/>
-                <w:iCs/>
-                <w:color w:val="3B3838" w:themeColor="background2" w:themeShade="40"/>
-                <w:sz w:val="18"/>
-                <w:szCs w:val="20"/>
-                <w:lang w:eastAsia="es-CL"/>
+            <w:tcW w:w="1300" w:type="dxa"/>
+          </w:tcPr>
+          <w:p>
+            <w:pPr>
+              <w:spacing w:after="100"/>
+              <w:rPr>
+                <w:rFonts w:ascii="Calibri" w:hAnsi="Calibri" w:cs="Arial"/>
+                <w:color w:val="3B3838" w:themeColor="background2" w:themeShade="40"/>
+                <w:sz w:val="20"/>
+                <w:szCs w:val="20"/>
+                <w:lang w:eastAsia="es-CL"/>
+              </w:rPr>
+            </w:pPr>
+            <w:r>
+              <w:rPr>
+                <w:rFonts w:ascii="Calibri" w:hAnsi="Calibri" w:cs="Calibri"/>
+                <w:color w:val="3B3838"/>
+                <w:sz w:val="18"/>
+                <w:szCs w:val="18"/>
               </w:rPr>
               <w:t>C3: Construir un modelo de datos relacional</w:t>
             </w:r>
@@ -1844,113 +1869,103 @@
         </w:tc>
         <w:tc>
           <w:tcPr>
-            <w:tcW w:w="1077" w:type="dxa"/>
-          </w:tcPr>
-          <w:p>
-            <w:pPr>
-              <w:jc w:val="both"/>
-              <w:rPr>
-                <w:rFonts w:ascii="Calibri" w:hAnsi="Calibri" w:cs="Arial"/>
-                <w:iCs/>
-                <w:color w:val="3B3838" w:themeColor="background2" w:themeShade="40"/>
-                <w:sz w:val="18"/>
-                <w:szCs w:val="20"/>
-                <w:lang w:eastAsia="es-CL"/>
-              </w:rPr>
-            </w:pPr>
-            <w:r>
-              <w:rPr>
-                <w:rFonts w:ascii="Calibri" w:hAnsi="Calibri" w:cs="Arial"/>
-                <w:iCs/>
-                <w:color w:val="3B3838" w:themeColor="background2" w:themeShade="40"/>
-                <w:sz w:val="18"/>
-                <w:szCs w:val="20"/>
-                <w:lang w:eastAsia="es-CL"/>
-              </w:rPr>
-              <w:t>Diseñar e implementar el modelo de datos del sistema</w:t>
-            </w:r>
-          </w:p>
-        </w:tc>
-        <w:tc>
-          <w:tcPr>
-            <w:tcW w:w="1276" w:type="dxa"/>
-          </w:tcPr>
-          <w:p>
-            <w:pPr>
-              <w:jc w:val="both"/>
-              <w:rPr>
-                <w:b/>
-                <w:iCs/>
-                <w:color w:val="3B3838" w:themeColor="background2" w:themeShade="40"/>
-                <w:sz w:val="18"/>
-                <w:szCs w:val="24"/>
-              </w:rPr>
-            </w:pPr>
-            <w:r>
-              <w:rPr>
-                <w:rFonts w:ascii="Calibri" w:hAnsi="Calibri" w:cs="Arial"/>
-                <w:iCs/>
-                <w:color w:val="3B3838" w:themeColor="background2" w:themeShade="40"/>
-                <w:sz w:val="18"/>
-                <w:szCs w:val="20"/>
-                <w:lang w:eastAsia="es-CL"/>
-              </w:rPr>
-              <w:t>PostgreSQL, modelo ER, SQL, documentación técnica</w:t>
-            </w:r>
-          </w:p>
-        </w:tc>
-        <w:tc>
-          <w:tcPr>
-            <w:tcW w:w="1276" w:type="dxa"/>
-          </w:tcPr>
-          <w:p>
-            <w:pPr>
-              <w:jc w:val="both"/>
-              <w:rPr>
-                <w:b/>
-                <w:iCs/>
-                <w:color w:val="3B3838" w:themeColor="background2" w:themeShade="40"/>
-                <w:sz w:val="18"/>
-                <w:szCs w:val="24"/>
-              </w:rPr>
-            </w:pPr>
-            <w:r>
-              <w:rPr>
-                <w:rFonts w:ascii="Calibri" w:hAnsi="Calibri" w:cs="Arial"/>
-                <w:iCs/>
-                <w:color w:val="3B3838" w:themeColor="background2" w:themeShade="40"/>
-                <w:sz w:val="18"/>
-                <w:szCs w:val="20"/>
-                <w:lang w:eastAsia="es-CL"/>
-              </w:rPr>
-              <w:t>Semanas 5–7</w:t>
-            </w:r>
-          </w:p>
-        </w:tc>
-        <w:tc>
-          <w:tcPr>
-            <w:tcW w:w="1275" w:type="dxa"/>
-          </w:tcPr>
-          <w:p>
-            <w:pPr>
-              <w:jc w:val="both"/>
-              <w:rPr>
-                <w:rFonts w:ascii="Calibri" w:hAnsi="Calibri" w:cs="Arial"/>
-                <w:iCs/>
-                <w:color w:val="3B3838" w:themeColor="background2" w:themeShade="40"/>
-                <w:sz w:val="18"/>
-                <w:szCs w:val="20"/>
-                <w:lang w:eastAsia="es-CL"/>
-              </w:rPr>
-            </w:pPr>
-            <w:r>
-              <w:rPr>
-                <w:rFonts w:ascii="Calibri" w:hAnsi="Calibri" w:cs="Arial"/>
-                <w:iCs/>
-                <w:color w:val="3B3838" w:themeColor="background2" w:themeShade="40"/>
-                <w:sz w:val="18"/>
-                <w:szCs w:val="20"/>
-                <w:lang w:eastAsia="es-CL"/>
+            <w:tcW w:w="1250" w:type="dxa"/>
+          </w:tcPr>
+          <w:p>
+            <w:pPr>
+              <w:spacing w:after="100"/>
+              <w:rPr>
+                <w:rFonts w:ascii="Calibri" w:hAnsi="Calibri" w:cs="Arial"/>
+                <w:color w:val="3B3838" w:themeColor="background2" w:themeShade="40"/>
+                <w:sz w:val="20"/>
+                <w:szCs w:val="20"/>
+                <w:lang w:eastAsia="es-CL"/>
+              </w:rPr>
+            </w:pPr>
+            <w:r>
+              <w:rPr>
+                <w:rFonts w:ascii="Calibri" w:hAnsi="Calibri" w:cs="Calibri"/>
+                <w:color w:val="3B3838"/>
+                <w:sz w:val="18"/>
+                <w:szCs w:val="18"/>
+              </w:rPr>
+              <w:t>Diseñar e implementar el modelo de datos</w:t>
+            </w:r>
+          </w:p>
+        </w:tc>
+        <w:tc>
+          <w:tcPr>
+            <w:tcW w:w="1100" w:type="dxa"/>
+          </w:tcPr>
+          <w:p>
+            <w:pPr>
+              <w:spacing w:after="100"/>
+              <w:rPr>
+                <w:rFonts w:ascii="Calibri" w:hAnsi="Calibri" w:cs="Arial"/>
+                <w:color w:val="3B3838" w:themeColor="background2" w:themeShade="40"/>
+                <w:sz w:val="20"/>
+                <w:szCs w:val="20"/>
+                <w:lang w:eastAsia="es-CL"/>
+              </w:rPr>
+            </w:pPr>
+            <w:r>
+              <w:rPr>
+                <w:rFonts w:ascii="Calibri" w:hAnsi="Calibri" w:cs="Calibri"/>
+                <w:color w:val="3B3838"/>
+                <w:sz w:val="18"/>
+                <w:szCs w:val="18"/>
+              </w:rPr>
+              <w:t>PostgreSQL, SQL, modelo ER</w:t>
+            </w:r>
+          </w:p>
+        </w:tc>
+        <w:tc>
+          <w:tcPr>
+            <w:tcW w:w="950" w:type="dxa"/>
+          </w:tcPr>
+          <w:p>
+            <w:pPr>
+              <w:spacing w:after="100"/>
+              <w:rPr>
+                <w:rFonts w:ascii="Calibri" w:hAnsi="Calibri" w:cs="Arial"/>
+                <w:color w:val="3B3838" w:themeColor="background2" w:themeShade="40"/>
+                <w:sz w:val="20"/>
+                <w:szCs w:val="20"/>
+                <w:lang w:eastAsia="es-CL"/>
+              </w:rPr>
+            </w:pPr>
+            <w:r>
+              <w:rPr>
+                <w:rFonts w:ascii="Calibri" w:hAnsi="Calibri" w:cs="Calibri"/>
+                <w:color w:val="3B3838"/>
+                <w:sz w:val="18"/>
+                <w:szCs w:val="18"/>
+              </w:rPr>
+              <w:t>Semanas 5 a 7</w:t>
+            </w:r>
+          </w:p>
+        </w:tc>
+        <w:tc>
+          <w:tcPr>
+            <w:tcW w:w="900" w:type="dxa"/>
+          </w:tcPr>
+          <w:p>
+            <w:pPr>
+              <w:spacing w:after="100"/>
+              <w:rPr>
+                <w:rFonts w:ascii="Calibri" w:hAnsi="Calibri" w:cs="Arial"/>
+                <w:color w:val="3B3838" w:themeColor="background2" w:themeShade="40"/>
+                <w:sz w:val="20"/>
+                <w:szCs w:val="20"/>
+                <w:lang w:eastAsia="es-CL"/>
+              </w:rPr>
+            </w:pPr>
+            <w:r>
+              <w:rPr>
+                <w:rFonts w:ascii="Calibri" w:hAnsi="Calibri" w:cs="Calibri"/>
+                <w:color w:val="3B3838"/>
+                <w:sz w:val="18"/>
+                <w:szCs w:val="18"/>
               </w:rPr>
               <w:t>Isabella y Diego</w:t>
             </w:r>
@@ -1958,88 +1973,79 @@
         </w:tc>
         <w:tc>
           <w:tcPr>
-            <w:tcW w:w="1276" w:type="dxa"/>
-          </w:tcPr>
-          <w:p>
-            <w:pPr>
-              <w:jc w:val="both"/>
-              <w:rPr>
-                <w:rFonts w:ascii="Calibri" w:hAnsi="Calibri" w:cs="Arial"/>
-                <w:iCs/>
-                <w:color w:val="3B3838" w:themeColor="background2" w:themeShade="40"/>
-                <w:sz w:val="18"/>
-                <w:szCs w:val="20"/>
-                <w:lang w:eastAsia="es-CL"/>
-              </w:rPr>
-            </w:pPr>
-            <w:r>
-              <w:rPr>
-                <w:rFonts w:ascii="Calibri" w:hAnsi="Calibri" w:cs="Arial"/>
-                <w:iCs/>
-                <w:color w:val="3B3838" w:themeColor="background2" w:themeShade="40"/>
-                <w:sz w:val="18"/>
-                <w:szCs w:val="20"/>
-                <w:lang w:eastAsia="es-CL"/>
-              </w:rPr>
-              <w:t>Fue necesario revisar la consistencia entre el modelo y las necesidades de la aplicación</w:t>
-            </w:r>
-          </w:p>
-        </w:tc>
-        <w:tc>
-          <w:tcPr>
-            <w:tcW w:w="851" w:type="dxa"/>
-          </w:tcPr>
-          <w:p>
-            <w:pPr>
-              <w:jc w:val="both"/>
-              <w:rPr>
-                <w:rFonts w:ascii="Calibri" w:hAnsi="Calibri" w:cs="Arial"/>
-                <w:iCs/>
-                <w:color w:val="3B3838" w:themeColor="background2" w:themeShade="40"/>
-                <w:sz w:val="16"/>
-                <w:szCs w:val="20"/>
-                <w:lang w:eastAsia="es-CL"/>
-              </w:rPr>
-            </w:pPr>
-            <w:r>
-              <w:rPr>
-                <w:rFonts w:ascii="Calibri" w:hAnsi="Calibri" w:cs="Arial"/>
-                <w:iCs/>
-                <w:color w:val="3B3838" w:themeColor="background2" w:themeShade="40"/>
-                <w:sz w:val="18"/>
-                <w:szCs w:val="20"/>
-                <w:lang w:eastAsia="es-CL"/>
-              </w:rPr>
-              <w:t>Completado</w:t>
-            </w:r>
-          </w:p>
-        </w:tc>
-        <w:tc>
-          <w:tcPr>
-            <w:tcW w:w="1417" w:type="dxa"/>
-          </w:tcPr>
-          <w:p>
-            <w:pPr>
-              <w:jc w:val="both"/>
-              <w:rPr>
-                <w:rFonts w:ascii="Calibri" w:hAnsi="Calibri" w:cs="Arial"/>
-                <w:iCs/>
-                <w:color w:val="3B3838" w:themeColor="background2" w:themeShade="40"/>
-                <w:sz w:val="18"/>
-                <w:szCs w:val="20"/>
-                <w:lang w:eastAsia="es-CL"/>
-              </w:rPr>
-            </w:pPr>
-            <w:r>
-              <w:rPr>
-                <w:rFonts w:ascii="Calibri" w:hAnsi="Calibri" w:cs="Arial"/>
-                <w:iCs/>
-                <w:color w:val="3B3838" w:themeColor="background2" w:themeShade="40"/>
-                <w:sz w:val="18"/>
-                <w:szCs w:val="20"/>
-                <w:lang w:eastAsia="es-CL"/>
-              </w:rPr>
-              <w:t>Se realizaron ajustes al modelo durante la implementación para adaptarlo a las funcionalidades desarrolladas</w:t>
+            <w:tcW w:w="1650" w:type="dxa"/>
+          </w:tcPr>
+          <w:p>
+            <w:pPr>
+              <w:spacing w:after="100"/>
+              <w:rPr>
+                <w:rFonts w:ascii="Calibri" w:hAnsi="Calibri" w:cs="Arial"/>
+                <w:color w:val="3B3838" w:themeColor="background2" w:themeShade="40"/>
+                <w:sz w:val="20"/>
+                <w:szCs w:val="20"/>
+                <w:lang w:eastAsia="es-CL"/>
+              </w:rPr>
+            </w:pPr>
+            <w:r>
+              <w:rPr>
+                <w:rFonts w:ascii="Calibri" w:hAnsi="Calibri" w:cs="Calibri"/>
+                <w:color w:val="3B3838"/>
+                <w:sz w:val="18"/>
+                <w:szCs w:val="18"/>
+              </w:rPr>
+              <w:t>El modelo creció de 16 a 24 tablas y una vista en siete migraciones. El diagrama ER todavía muestra las 16 iniciales.</w:t>
+            </w:r>
+          </w:p>
+        </w:tc>
+        <w:tc>
+          <w:tcPr>
+            <w:tcW w:w="826" w:type="dxa"/>
+          </w:tcPr>
+          <w:p>
+            <w:pPr>
+              <w:spacing w:after="100"/>
+              <w:rPr>
+                <w:rFonts w:ascii="Calibri" w:hAnsi="Calibri" w:cs="Arial"/>
+                <w:color w:val="3B3838" w:themeColor="background2" w:themeShade="40"/>
+                <w:sz w:val="20"/>
+                <w:szCs w:val="20"/>
+                <w:lang w:eastAsia="es-CL"/>
+              </w:rPr>
+            </w:pPr>
+            <w:r>
+              <w:rPr>
+                <w:rFonts w:ascii="Calibri" w:hAnsi="Calibri" w:cs="Calibri"/>
+                <w:color w:val="3B3838"/>
+                <w:sz w:val="18"/>
+                <w:szCs w:val="18"/>
+              </w:rPr>
+              <w:t>En curso</w:t>
+            </w:r>
+          </w:p>
+        </w:tc>
+        <w:tc>
+          <w:tcPr>
+            <w:tcW w:w="1800" w:type="dxa"/>
+          </w:tcPr>
+          <w:p>
+            <w:pPr>
+              <w:spacing w:after="100"/>
+              <w:rPr>
+                <w:rFonts w:ascii="Calibri" w:hAnsi="Calibri" w:cs="Arial"/>
+                <w:color w:val="3B3838" w:themeColor="background2" w:themeShade="40"/>
+                <w:sz w:val="20"/>
+                <w:szCs w:val="20"/>
+                <w:lang w:eastAsia="es-CL"/>
+              </w:rPr>
+            </w:pPr>
+            <w:r>
+              <w:rPr>
+                <w:rFonts w:ascii="Calibri" w:hAnsi="Calibri" w:cs="Calibri"/>
+                <w:color w:val="3B3838"/>
+                <w:sz w:val="18"/>
+                <w:szCs w:val="18"/>
+              </w:rPr>
+              <w:t>Se agregaron tablas para composición nutricional de ingredientes, jornada, stock, ventas de caja y perfil del estudiante. Falta actualizar el diagrama.</w:t>
             </w:r>
           </w:p>
         </w:tc>
@@ -2050,169 +2056,150 @@
         </w:trPr>
         <w:tc>
           <w:tcPr>
-            <w:tcW w:w="1328" w:type="dxa"/>
-          </w:tcPr>
-          <w:p>
-            <w:pPr>
-              <w:jc w:val="both"/>
-              <w:rPr>
-                <w:rFonts w:ascii="Calibri" w:hAnsi="Calibri" w:cs="Arial"/>
-                <w:iCs/>
-                <w:color w:val="3B3838" w:themeColor="background2" w:themeShade="40"/>
-                <w:sz w:val="18"/>
-                <w:szCs w:val="20"/>
-                <w:lang w:eastAsia="es-CL"/>
-              </w:rPr>
-            </w:pPr>
-            <w:r>
-              <w:rPr>
-                <w:rFonts w:ascii="Calibri" w:hAnsi="Calibri" w:cs="Arial"/>
-                <w:iCs/>
-                <w:color w:val="3B3838" w:themeColor="background2" w:themeShade="40"/>
-                <w:sz w:val="18"/>
-                <w:szCs w:val="20"/>
-                <w:lang w:eastAsia="es-CL"/>
-              </w:rPr>
-              <w:lastRenderedPageBreak/>
+            <w:tcW w:w="1300" w:type="dxa"/>
+          </w:tcPr>
+          <w:p>
+            <w:pPr>
+              <w:spacing w:after="100"/>
+              <w:rPr>
+                <w:rFonts w:ascii="Calibri" w:hAnsi="Calibri" w:cs="Arial"/>
+                <w:color w:val="3B3838" w:themeColor="background2" w:themeShade="40"/>
+                <w:sz w:val="20"/>
+                <w:szCs w:val="20"/>
+                <w:lang w:eastAsia="es-CL"/>
+              </w:rPr>
+            </w:pPr>
+            <w:r>
+              <w:rPr>
+                <w:rFonts w:ascii="Calibri" w:hAnsi="Calibri" w:cs="Calibri"/>
+                <w:color w:val="3B3838"/>
+                <w:sz w:val="18"/>
+                <w:szCs w:val="18"/>
+              </w:rPr>
               <w:t>C4: Desarrollar y mantener los módulos del MVP</w:t>
             </w:r>
           </w:p>
         </w:tc>
         <w:tc>
           <w:tcPr>
-            <w:tcW w:w="1077" w:type="dxa"/>
-          </w:tcPr>
-          <w:p>
-            <w:pPr>
-              <w:jc w:val="both"/>
-              <w:rPr>
-                <w:rFonts w:ascii="Calibri" w:hAnsi="Calibri" w:cs="Arial"/>
-                <w:iCs/>
-                <w:color w:val="3B3838" w:themeColor="background2" w:themeShade="40"/>
-                <w:sz w:val="18"/>
-                <w:szCs w:val="20"/>
-                <w:lang w:eastAsia="es-CL"/>
-              </w:rPr>
-            </w:pPr>
-            <w:r>
-              <w:rPr>
-                <w:rFonts w:ascii="Calibri" w:hAnsi="Calibri" w:cs="Arial"/>
-                <w:iCs/>
-                <w:color w:val="3B3838" w:themeColor="background2" w:themeShade="40"/>
-                <w:sz w:val="18"/>
-                <w:szCs w:val="20"/>
-                <w:lang w:eastAsia="es-CL"/>
-              </w:rPr>
-              <w:t xml:space="preserve">Implementar </w:t>
+            <w:tcW w:w="1250" w:type="dxa"/>
+          </w:tcPr>
+          <w:p>
+            <w:pPr>
+              <w:spacing w:after="100"/>
+              <w:rPr>
+                <w:rFonts w:ascii="Calibri" w:hAnsi="Calibri" w:cs="Arial"/>
+                <w:color w:val="3B3838" w:themeColor="background2" w:themeShade="40"/>
+                <w:sz w:val="20"/>
+                <w:szCs w:val="20"/>
+                <w:lang w:eastAsia="es-CL"/>
+              </w:rPr>
+            </w:pPr>
+            <w:r>
+              <w:rPr>
+                <w:rFonts w:ascii="Calibri" w:hAnsi="Calibri" w:cs="Calibri"/>
+                <w:color w:val="3B3838"/>
+                <w:sz w:val="18"/>
+                <w:szCs w:val="18"/>
+              </w:rPr>
+              <w:t xml:space="preserve">Implementar el </w:t>
             </w:r>
             <w:proofErr w:type="spellStart"/>
             <w:r>
               <w:rPr>
-                <w:rFonts w:ascii="Calibri" w:hAnsi="Calibri" w:cs="Arial"/>
-                <w:iCs/>
-                <w:color w:val="3B3838" w:themeColor="background2" w:themeShade="40"/>
-                <w:sz w:val="18"/>
-                <w:szCs w:val="20"/>
-                <w:lang w:eastAsia="es-CL"/>
+                <w:rFonts w:ascii="Calibri" w:hAnsi="Calibri" w:cs="Calibri"/>
+                <w:color w:val="3B3838"/>
+                <w:sz w:val="18"/>
+                <w:szCs w:val="18"/>
               </w:rPr>
               <w:t>backend</w:t>
             </w:r>
             <w:proofErr w:type="spellEnd"/>
             <w:r>
               <w:rPr>
-                <w:rFonts w:ascii="Calibri" w:hAnsi="Calibri" w:cs="Arial"/>
-                <w:iCs/>
-                <w:color w:val="3B3838" w:themeColor="background2" w:themeShade="40"/>
-                <w:sz w:val="18"/>
-                <w:szCs w:val="20"/>
-                <w:lang w:eastAsia="es-CL"/>
-              </w:rPr>
-              <w:t xml:space="preserve"> y estructura de la aplicación</w:t>
-            </w:r>
-          </w:p>
-        </w:tc>
-        <w:tc>
-          <w:tcPr>
-            <w:tcW w:w="1276" w:type="dxa"/>
-          </w:tcPr>
-          <w:p>
-            <w:pPr>
-              <w:jc w:val="both"/>
-              <w:rPr>
-                <w:rFonts w:ascii="Calibri" w:hAnsi="Calibri" w:cs="Arial"/>
-                <w:iCs/>
-                <w:color w:val="3B3838" w:themeColor="background2" w:themeShade="40"/>
-                <w:sz w:val="18"/>
+                <w:rFonts w:ascii="Calibri" w:hAnsi="Calibri" w:cs="Calibri"/>
+                <w:color w:val="3B3838"/>
+                <w:sz w:val="18"/>
+                <w:szCs w:val="18"/>
+              </w:rPr>
+              <w:t xml:space="preserve"> y la estructura de la aplicación</w:t>
+            </w:r>
+          </w:p>
+        </w:tc>
+        <w:tc>
+          <w:tcPr>
+            <w:tcW w:w="1100" w:type="dxa"/>
+          </w:tcPr>
+          <w:p>
+            <w:pPr>
+              <w:spacing w:after="100"/>
+              <w:rPr>
+                <w:rFonts w:ascii="Calibri" w:hAnsi="Calibri" w:cs="Arial"/>
+                <w:color w:val="3B3838" w:themeColor="background2" w:themeShade="40"/>
+                <w:sz w:val="20"/>
                 <w:szCs w:val="20"/>
                 <w:lang w:val="en-US" w:eastAsia="es-CL"/>
               </w:rPr>
             </w:pPr>
             <w:r>
               <w:rPr>
-                <w:rFonts w:ascii="Calibri" w:hAnsi="Calibri" w:cs="Arial"/>
-                <w:iCs/>
-                <w:color w:val="3B3838" w:themeColor="background2" w:themeShade="40"/>
-                <w:sz w:val="18"/>
-                <w:szCs w:val="20"/>
-                <w:lang w:val="en-US" w:eastAsia="es-CL"/>
-              </w:rPr>
-              <w:t>Node.js, Express, PostgreSQL, GitHub</w:t>
-            </w:r>
-          </w:p>
-        </w:tc>
-        <w:tc>
-          <w:tcPr>
-            <w:tcW w:w="1276" w:type="dxa"/>
-          </w:tcPr>
-          <w:p>
-            <w:pPr>
-              <w:jc w:val="both"/>
-              <w:rPr>
-                <w:rFonts w:ascii="Calibri" w:hAnsi="Calibri" w:cs="Arial"/>
-                <w:iCs/>
-                <w:color w:val="3B3838" w:themeColor="background2" w:themeShade="40"/>
-                <w:sz w:val="18"/>
-                <w:szCs w:val="20"/>
-                <w:lang w:val="en-US" w:eastAsia="es-CL"/>
-              </w:rPr>
-            </w:pPr>
-            <w:r>
-              <w:rPr>
-                <w:rFonts w:ascii="Calibri" w:hAnsi="Calibri" w:cs="Arial"/>
-                <w:iCs/>
-                <w:color w:val="3B3838" w:themeColor="background2" w:themeShade="40"/>
-                <w:sz w:val="18"/>
-                <w:szCs w:val="20"/>
-                <w:lang w:val="en-US" w:eastAsia="es-CL"/>
-              </w:rPr>
-              <w:t>Semanas 6–14</w:t>
-            </w:r>
-          </w:p>
-        </w:tc>
-        <w:tc>
-          <w:tcPr>
-            <w:tcW w:w="1275" w:type="dxa"/>
-          </w:tcPr>
-          <w:p>
-            <w:pPr>
-              <w:jc w:val="both"/>
-              <w:rPr>
-                <w:rFonts w:ascii="Calibri" w:hAnsi="Calibri" w:cs="Arial"/>
-                <w:iCs/>
-                <w:color w:val="3B3838" w:themeColor="background2" w:themeShade="40"/>
-                <w:sz w:val="18"/>
-                <w:szCs w:val="20"/>
-                <w:lang w:val="en-US" w:eastAsia="es-CL"/>
-              </w:rPr>
-            </w:pPr>
-            <w:r>
-              <w:rPr>
-                <w:rFonts w:ascii="Calibri" w:hAnsi="Calibri" w:cs="Arial"/>
-                <w:iCs/>
-                <w:color w:val="3B3838" w:themeColor="background2" w:themeShade="40"/>
-                <w:sz w:val="18"/>
-                <w:szCs w:val="20"/>
-                <w:lang w:val="en-US" w:eastAsia="es-CL"/>
+                <w:rFonts w:ascii="Calibri" w:hAnsi="Calibri" w:cs="Calibri"/>
+                <w:color w:val="3B3838"/>
+                <w:sz w:val="18"/>
+                <w:szCs w:val="18"/>
+                <w:lang w:val="en-US"/>
+              </w:rPr>
+              <w:t>Node.js 18, Express 5, PostgreSQL, JWT, Git</w:t>
+            </w:r>
+          </w:p>
+        </w:tc>
+        <w:tc>
+          <w:tcPr>
+            <w:tcW w:w="950" w:type="dxa"/>
+          </w:tcPr>
+          <w:p>
+            <w:pPr>
+              <w:spacing w:after="100"/>
+              <w:rPr>
+                <w:rFonts w:ascii="Calibri" w:hAnsi="Calibri" w:cs="Arial"/>
+                <w:color w:val="3B3838" w:themeColor="background2" w:themeShade="40"/>
+                <w:sz w:val="20"/>
+                <w:szCs w:val="20"/>
+                <w:lang w:eastAsia="es-CL"/>
+              </w:rPr>
+            </w:pPr>
+            <w:r>
+              <w:rPr>
+                <w:rFonts w:ascii="Calibri" w:hAnsi="Calibri" w:cs="Calibri"/>
+                <w:color w:val="3B3838"/>
+                <w:sz w:val="18"/>
+                <w:szCs w:val="18"/>
+              </w:rPr>
+              <w:t>Semanas 6 a 14</w:t>
+            </w:r>
+          </w:p>
+        </w:tc>
+        <w:tc>
+          <w:tcPr>
+            <w:tcW w:w="900" w:type="dxa"/>
+          </w:tcPr>
+          <w:p>
+            <w:pPr>
+              <w:spacing w:after="100"/>
+              <w:rPr>
+                <w:rFonts w:ascii="Calibri" w:hAnsi="Calibri" w:cs="Arial"/>
+                <w:color w:val="3B3838" w:themeColor="background2" w:themeShade="40"/>
+                <w:sz w:val="20"/>
+                <w:szCs w:val="20"/>
+                <w:lang w:eastAsia="es-CL"/>
+              </w:rPr>
+            </w:pPr>
+            <w:r>
+              <w:rPr>
+                <w:rFonts w:ascii="Calibri" w:hAnsi="Calibri" w:cs="Calibri"/>
+                <w:color w:val="3B3838"/>
+                <w:sz w:val="18"/>
+                <w:szCs w:val="18"/>
               </w:rPr>
               <w:t>Isabella y Diego</w:t>
             </w:r>
@@ -2220,70 +2207,51 @@
         </w:tc>
         <w:tc>
           <w:tcPr>
-            <w:tcW w:w="1276" w:type="dxa"/>
-          </w:tcPr>
-          <w:p>
-            <w:pPr>
-              <w:jc w:val="both"/>
-              <w:rPr>
-                <w:rFonts w:ascii="Calibri" w:hAnsi="Calibri" w:cs="Arial"/>
-                <w:iCs/>
-                <w:color w:val="3B3838" w:themeColor="background2" w:themeShade="40"/>
-                <w:sz w:val="18"/>
-                <w:szCs w:val="20"/>
-                <w:lang w:eastAsia="es-CL"/>
-              </w:rPr>
-            </w:pPr>
-            <w:r>
-              <w:rPr>
-                <w:rFonts w:ascii="Calibri" w:hAnsi="Calibri" w:cs="Arial"/>
-                <w:iCs/>
-                <w:color w:val="3B3838" w:themeColor="background2" w:themeShade="40"/>
-                <w:sz w:val="18"/>
-                <w:szCs w:val="20"/>
-                <w:lang w:eastAsia="es-CL"/>
-              </w:rPr>
-              <w:t xml:space="preserve">El desarrollo se ha realizado de manera incremental mediante </w:t>
-            </w:r>
-            <w:proofErr w:type="spellStart"/>
-            <w:r>
-              <w:rPr>
-                <w:rFonts w:ascii="Calibri" w:hAnsi="Calibri" w:cs="Arial"/>
-                <w:iCs/>
-                <w:color w:val="3B3838" w:themeColor="background2" w:themeShade="40"/>
-                <w:sz w:val="18"/>
-                <w:szCs w:val="20"/>
-                <w:lang w:eastAsia="es-CL"/>
-              </w:rPr>
-              <w:t>sprints</w:t>
-            </w:r>
-            <w:proofErr w:type="spellEnd"/>
-          </w:p>
-        </w:tc>
-        <w:tc>
-          <w:tcPr>
-            <w:tcW w:w="851" w:type="dxa"/>
-          </w:tcPr>
-          <w:p>
-            <w:pPr>
-              <w:jc w:val="center"/>
-              <w:rPr>
-                <w:rFonts w:ascii="Calibri" w:hAnsi="Calibri" w:cs="Arial"/>
-                <w:iCs/>
-                <w:color w:val="3B3838" w:themeColor="background2" w:themeShade="40"/>
-                <w:sz w:val="18"/>
-                <w:szCs w:val="20"/>
-                <w:lang w:eastAsia="es-CL"/>
-              </w:rPr>
-            </w:pPr>
-            <w:r>
-              <w:rPr>
-                <w:rFonts w:ascii="Calibri" w:hAnsi="Calibri" w:cs="Arial"/>
-                <w:iCs/>
-                <w:color w:val="3B3838" w:themeColor="background2" w:themeShade="40"/>
-                <w:sz w:val="18"/>
-                <w:szCs w:val="20"/>
-                <w:lang w:eastAsia="es-CL"/>
+            <w:tcW w:w="1650" w:type="dxa"/>
+          </w:tcPr>
+          <w:p>
+            <w:pPr>
+              <w:spacing w:after="100"/>
+              <w:rPr>
+                <w:rFonts w:ascii="Calibri" w:hAnsi="Calibri" w:cs="Arial"/>
+                <w:color w:val="3B3838" w:themeColor="background2" w:themeShade="40"/>
+                <w:sz w:val="20"/>
+                <w:szCs w:val="20"/>
+                <w:lang w:eastAsia="es-CL"/>
+              </w:rPr>
+            </w:pPr>
+            <w:r>
+              <w:rPr>
+                <w:rFonts w:ascii="Calibri" w:hAnsi="Calibri" w:cs="Calibri"/>
+                <w:color w:val="3B3838"/>
+                <w:sz w:val="18"/>
+                <w:szCs w:val="18"/>
+              </w:rPr>
+              <w:t>Diez grupos de rutas y cinco roles. Eventos en tiempo real (SSE) y manejo central de errores.</w:t>
+            </w:r>
+          </w:p>
+        </w:tc>
+        <w:tc>
+          <w:tcPr>
+            <w:tcW w:w="826" w:type="dxa"/>
+          </w:tcPr>
+          <w:p>
+            <w:pPr>
+              <w:spacing w:after="100"/>
+              <w:rPr>
+                <w:rFonts w:ascii="Calibri" w:hAnsi="Calibri" w:cs="Arial"/>
+                <w:color w:val="3B3838" w:themeColor="background2" w:themeShade="40"/>
+                <w:sz w:val="20"/>
+                <w:szCs w:val="20"/>
+                <w:lang w:eastAsia="es-CL"/>
+              </w:rPr>
+            </w:pPr>
+            <w:r>
+              <w:rPr>
+                <w:rFonts w:ascii="Calibri" w:hAnsi="Calibri" w:cs="Calibri"/>
+                <w:color w:val="3B3838"/>
+                <w:sz w:val="18"/>
+                <w:szCs w:val="18"/>
               </w:rPr>
               <w:t>En curso</w:t>
             </w:r>
@@ -2291,30 +2259,27 @@
         </w:tc>
         <w:tc>
           <w:tcPr>
-            <w:tcW w:w="1417" w:type="dxa"/>
-          </w:tcPr>
-          <w:p>
-            <w:pPr>
-              <w:jc w:val="both"/>
-              <w:rPr>
-                <w:rFonts w:ascii="Calibri" w:hAnsi="Calibri" w:cs="Arial"/>
-                <w:iCs/>
-                <w:color w:val="3B3838" w:themeColor="background2" w:themeShade="40"/>
-                <w:sz w:val="18"/>
-                <w:szCs w:val="20"/>
-                <w:lang w:eastAsia="es-CL"/>
-              </w:rPr>
-            </w:pPr>
-            <w:r>
-              <w:rPr>
-                <w:rFonts w:ascii="Calibri" w:hAnsi="Calibri" w:cs="Arial"/>
-                <w:iCs/>
-                <w:color w:val="3B3838" w:themeColor="background2" w:themeShade="40"/>
-                <w:sz w:val="18"/>
-                <w:szCs w:val="20"/>
-                <w:lang w:eastAsia="es-CL"/>
-              </w:rPr>
-              <w:t>Se incorporaron funcionalidades progresivamente según la priorización del backlog</w:t>
+            <w:tcW w:w="1800" w:type="dxa"/>
+          </w:tcPr>
+          <w:p>
+            <w:pPr>
+              <w:spacing w:after="100"/>
+              <w:rPr>
+                <w:rFonts w:ascii="Calibri" w:hAnsi="Calibri" w:cs="Arial"/>
+                <w:color w:val="3B3838" w:themeColor="background2" w:themeShade="40"/>
+                <w:sz w:val="20"/>
+                <w:szCs w:val="20"/>
+                <w:lang w:eastAsia="es-CL"/>
+              </w:rPr>
+            </w:pPr>
+            <w:r>
+              <w:rPr>
+                <w:rFonts w:ascii="Calibri" w:hAnsi="Calibri" w:cs="Calibri"/>
+                <w:color w:val="3B3838"/>
+                <w:sz w:val="18"/>
+                <w:szCs w:val="18"/>
+              </w:rPr>
+              <w:t>Se sumaron jornada, stock, caja, perfil del estudiante y predicción, que no estaban en el MVP original.</w:t>
             </w:r>
           </w:p>
         </w:tc>
@@ -2325,28 +2290,25 @@
         </w:trPr>
         <w:tc>
           <w:tcPr>
-            <w:tcW w:w="1328" w:type="dxa"/>
-          </w:tcPr>
-          <w:p>
-            <w:pPr>
-              <w:jc w:val="both"/>
-              <w:rPr>
-                <w:rFonts w:ascii="Calibri" w:hAnsi="Calibri" w:cs="Arial"/>
-                <w:iCs/>
-                <w:color w:val="3B3838" w:themeColor="background2" w:themeShade="40"/>
-                <w:sz w:val="18"/>
-                <w:szCs w:val="20"/>
-                <w:lang w:eastAsia="es-CL"/>
-              </w:rPr>
-            </w:pPr>
-            <w:r>
-              <w:rPr>
-                <w:rFonts w:ascii="Calibri" w:hAnsi="Calibri" w:cs="Arial"/>
-                <w:iCs/>
-                <w:color w:val="3B3838" w:themeColor="background2" w:themeShade="40"/>
-                <w:sz w:val="18"/>
-                <w:szCs w:val="20"/>
-                <w:lang w:eastAsia="es-CL"/>
+            <w:tcW w:w="1300" w:type="dxa"/>
+          </w:tcPr>
+          <w:p>
+            <w:pPr>
+              <w:spacing w:after="100"/>
+              <w:rPr>
+                <w:rFonts w:ascii="Calibri" w:hAnsi="Calibri" w:cs="Arial"/>
+                <w:color w:val="3B3838" w:themeColor="background2" w:themeShade="40"/>
+                <w:sz w:val="20"/>
+                <w:szCs w:val="20"/>
+                <w:lang w:eastAsia="es-CL"/>
+              </w:rPr>
+            </w:pPr>
+            <w:r>
+              <w:rPr>
+                <w:rFonts w:ascii="Calibri" w:hAnsi="Calibri" w:cs="Calibri"/>
+                <w:color w:val="3B3838"/>
+                <w:sz w:val="18"/>
+                <w:szCs w:val="18"/>
               </w:rPr>
               <w:t>C4: Desarrollar y mantener los módulos del MVP</w:t>
             </w:r>
@@ -2354,64 +2316,55 @@
         </w:tc>
         <w:tc>
           <w:tcPr>
-            <w:tcW w:w="1077" w:type="dxa"/>
-          </w:tcPr>
-          <w:p>
-            <w:pPr>
-              <w:jc w:val="both"/>
-              <w:rPr>
-                <w:rFonts w:ascii="Calibri" w:hAnsi="Calibri" w:cs="Arial"/>
-                <w:iCs/>
-                <w:color w:val="3B3838" w:themeColor="background2" w:themeShade="40"/>
-                <w:sz w:val="18"/>
-                <w:szCs w:val="20"/>
-                <w:lang w:eastAsia="es-CL"/>
-              </w:rPr>
-            </w:pPr>
-            <w:r>
-              <w:rPr>
-                <w:rFonts w:ascii="Calibri" w:hAnsi="Calibri" w:cs="Arial"/>
-                <w:iCs/>
-                <w:color w:val="3B3838" w:themeColor="background2" w:themeShade="40"/>
-                <w:sz w:val="18"/>
-                <w:szCs w:val="20"/>
-                <w:lang w:eastAsia="es-CL"/>
-              </w:rPr>
-              <w:t xml:space="preserve">Implementar </w:t>
+            <w:tcW w:w="1250" w:type="dxa"/>
+          </w:tcPr>
+          <w:p>
+            <w:pPr>
+              <w:spacing w:after="100"/>
+              <w:rPr>
+                <w:rFonts w:ascii="Calibri" w:hAnsi="Calibri" w:cs="Arial"/>
+                <w:color w:val="3B3838" w:themeColor="background2" w:themeShade="40"/>
+                <w:sz w:val="20"/>
+                <w:szCs w:val="20"/>
+                <w:lang w:eastAsia="es-CL"/>
+              </w:rPr>
+            </w:pPr>
+            <w:r>
+              <w:rPr>
+                <w:rFonts w:ascii="Calibri" w:hAnsi="Calibri" w:cs="Calibri"/>
+                <w:color w:val="3B3838"/>
+                <w:sz w:val="18"/>
+                <w:szCs w:val="18"/>
+              </w:rPr>
+              <w:t xml:space="preserve">Implementar el </w:t>
             </w:r>
             <w:proofErr w:type="spellStart"/>
             <w:r>
               <w:rPr>
-                <w:rFonts w:ascii="Calibri" w:hAnsi="Calibri" w:cs="Arial"/>
-                <w:iCs/>
-                <w:color w:val="3B3838" w:themeColor="background2" w:themeShade="40"/>
-                <w:sz w:val="18"/>
-                <w:szCs w:val="20"/>
-                <w:lang w:eastAsia="es-CL"/>
+                <w:rFonts w:ascii="Calibri" w:hAnsi="Calibri" w:cs="Calibri"/>
+                <w:color w:val="3B3838"/>
+                <w:sz w:val="18"/>
+                <w:szCs w:val="18"/>
               </w:rPr>
               <w:t>frontend</w:t>
             </w:r>
             <w:proofErr w:type="spellEnd"/>
             <w:r>
               <w:rPr>
-                <w:rFonts w:ascii="Calibri" w:hAnsi="Calibri" w:cs="Arial"/>
-                <w:iCs/>
-                <w:color w:val="3B3838" w:themeColor="background2" w:themeShade="40"/>
-                <w:sz w:val="18"/>
-                <w:szCs w:val="20"/>
-                <w:lang w:eastAsia="es-CL"/>
-              </w:rPr>
-              <w:t xml:space="preserve"> y conexión con </w:t>
+                <w:rFonts w:ascii="Calibri" w:hAnsi="Calibri" w:cs="Calibri"/>
+                <w:color w:val="3B3838"/>
+                <w:sz w:val="18"/>
+                <w:szCs w:val="18"/>
+              </w:rPr>
+              <w:t xml:space="preserve"> y su conexión con el </w:t>
             </w:r>
             <w:proofErr w:type="spellStart"/>
             <w:r>
               <w:rPr>
-                <w:rFonts w:ascii="Calibri" w:hAnsi="Calibri" w:cs="Arial"/>
-                <w:iCs/>
-                <w:color w:val="3B3838" w:themeColor="background2" w:themeShade="40"/>
-                <w:sz w:val="18"/>
-                <w:szCs w:val="20"/>
-                <w:lang w:eastAsia="es-CL"/>
+                <w:rFonts w:ascii="Calibri" w:hAnsi="Calibri" w:cs="Calibri"/>
+                <w:color w:val="3B3838"/>
+                <w:sz w:val="18"/>
+                <w:szCs w:val="18"/>
               </w:rPr>
               <w:t>backend</w:t>
             </w:r>
@@ -2420,110 +2373,88 @@
         </w:tc>
         <w:tc>
           <w:tcPr>
-            <w:tcW w:w="1276" w:type="dxa"/>
-          </w:tcPr>
-          <w:p>
-            <w:pPr>
-              <w:jc w:val="both"/>
-              <w:rPr>
-                <w:rFonts w:ascii="Calibri" w:hAnsi="Calibri" w:cs="Arial"/>
-                <w:iCs/>
-                <w:color w:val="3B3838" w:themeColor="background2" w:themeShade="40"/>
-                <w:sz w:val="18"/>
-                <w:szCs w:val="20"/>
-                <w:lang w:val="en-US" w:eastAsia="es-CL"/>
-              </w:rPr>
-            </w:pPr>
-            <w:r>
-              <w:rPr>
-                <w:rFonts w:ascii="Calibri" w:hAnsi="Calibri" w:cs="Arial"/>
-                <w:iCs/>
-                <w:color w:val="3B3838" w:themeColor="background2" w:themeShade="40"/>
-                <w:sz w:val="18"/>
-                <w:szCs w:val="20"/>
-                <w:lang w:val="en-US" w:eastAsia="es-CL"/>
-              </w:rPr>
-              <w:t xml:space="preserve">React, </w:t>
-            </w:r>
+            <w:tcW w:w="1100" w:type="dxa"/>
+          </w:tcPr>
+          <w:p>
+            <w:pPr>
+              <w:spacing w:after="100"/>
+              <w:rPr>
+                <w:rFonts w:ascii="Calibri" w:hAnsi="Calibri" w:cs="Arial"/>
+                <w:color w:val="3B3838" w:themeColor="background2" w:themeShade="40"/>
+                <w:sz w:val="20"/>
+                <w:szCs w:val="20"/>
+                <w:lang w:eastAsia="es-CL"/>
+              </w:rPr>
+            </w:pPr>
             <w:proofErr w:type="spellStart"/>
             <w:r>
               <w:rPr>
-                <w:rFonts w:ascii="Calibri" w:hAnsi="Calibri" w:cs="Arial"/>
-                <w:iCs/>
-                <w:color w:val="3B3838" w:themeColor="background2" w:themeShade="40"/>
-                <w:sz w:val="18"/>
-                <w:szCs w:val="20"/>
-                <w:lang w:val="en-US" w:eastAsia="es-CL"/>
-              </w:rPr>
-              <w:t>Vite</w:t>
+                <w:rFonts w:ascii="Calibri" w:hAnsi="Calibri" w:cs="Calibri"/>
+                <w:color w:val="3B3838"/>
+                <w:sz w:val="18"/>
+                <w:szCs w:val="18"/>
+              </w:rPr>
+              <w:t>React</w:t>
             </w:r>
             <w:proofErr w:type="spellEnd"/>
             <w:r>
               <w:rPr>
-                <w:rFonts w:ascii="Calibri" w:hAnsi="Calibri" w:cs="Arial"/>
-                <w:iCs/>
-                <w:color w:val="3B3838" w:themeColor="background2" w:themeShade="40"/>
-                <w:sz w:val="18"/>
-                <w:szCs w:val="20"/>
-                <w:lang w:val="en-US" w:eastAsia="es-CL"/>
-              </w:rPr>
-              <w:t>, JavaScript, API REST</w:t>
-            </w:r>
-          </w:p>
-        </w:tc>
-        <w:tc>
-          <w:tcPr>
-            <w:tcW w:w="1276" w:type="dxa"/>
-          </w:tcPr>
-          <w:p>
-            <w:pPr>
-              <w:jc w:val="both"/>
-              <w:rPr>
-                <w:rFonts w:ascii="Calibri" w:hAnsi="Calibri" w:cs="Arial"/>
-                <w:iCs/>
-                <w:color w:val="3B3838" w:themeColor="background2" w:themeShade="40"/>
-                <w:sz w:val="18"/>
-                <w:szCs w:val="20"/>
-                <w:lang w:val="en-US" w:eastAsia="es-CL"/>
-              </w:rPr>
-            </w:pPr>
-            <w:r>
-              <w:rPr>
-                <w:rFonts w:ascii="Calibri" w:hAnsi="Calibri" w:cs="Arial"/>
-                <w:iCs/>
-                <w:color w:val="3B3838" w:themeColor="background2" w:themeShade="40"/>
-                <w:sz w:val="18"/>
-                <w:szCs w:val="20"/>
-                <w:lang w:val="en-US" w:eastAsia="es-CL"/>
-              </w:rPr>
-              <w:t>Semanas 7–14</w:t>
-            </w:r>
-          </w:p>
-        </w:tc>
-        <w:tc>
-          <w:tcPr>
-            <w:tcW w:w="1275" w:type="dxa"/>
-          </w:tcPr>
-          <w:p>
-            <w:pPr>
-              <w:jc w:val="both"/>
-              <w:rPr>
-                <w:rFonts w:ascii="Calibri" w:hAnsi="Calibri" w:cs="Arial"/>
-                <w:iCs/>
-                <w:color w:val="3B3838" w:themeColor="background2" w:themeShade="40"/>
-                <w:sz w:val="18"/>
-                <w:szCs w:val="20"/>
-                <w:lang w:val="en-US" w:eastAsia="es-CL"/>
-              </w:rPr>
-            </w:pPr>
-            <w:r>
-              <w:rPr>
-                <w:rFonts w:ascii="Calibri" w:hAnsi="Calibri" w:cs="Arial"/>
-                <w:iCs/>
-                <w:color w:val="3B3838" w:themeColor="background2" w:themeShade="40"/>
-                <w:sz w:val="18"/>
-                <w:szCs w:val="20"/>
-                <w:lang w:val="en-US" w:eastAsia="es-CL"/>
+                <w:rFonts w:ascii="Calibri" w:hAnsi="Calibri" w:cs="Calibri"/>
+                <w:color w:val="3B3838"/>
+                <w:sz w:val="18"/>
+                <w:szCs w:val="18"/>
+              </w:rPr>
+              <w:t xml:space="preserve"> 19, Vite 8, API REST</w:t>
+            </w:r>
+          </w:p>
+        </w:tc>
+        <w:tc>
+          <w:tcPr>
+            <w:tcW w:w="950" w:type="dxa"/>
+          </w:tcPr>
+          <w:p>
+            <w:pPr>
+              <w:spacing w:after="100"/>
+              <w:rPr>
+                <w:rFonts w:ascii="Calibri" w:hAnsi="Calibri" w:cs="Arial"/>
+                <w:color w:val="3B3838" w:themeColor="background2" w:themeShade="40"/>
+                <w:sz w:val="20"/>
+                <w:szCs w:val="20"/>
+                <w:lang w:eastAsia="es-CL"/>
+              </w:rPr>
+            </w:pPr>
+            <w:r>
+              <w:rPr>
+                <w:rFonts w:ascii="Calibri" w:hAnsi="Calibri" w:cs="Calibri"/>
+                <w:color w:val="3B3838"/>
+                <w:sz w:val="18"/>
+                <w:szCs w:val="18"/>
+              </w:rPr>
+              <w:t>Semanas 7 a 14</w:t>
+            </w:r>
+          </w:p>
+        </w:tc>
+        <w:tc>
+          <w:tcPr>
+            <w:tcW w:w="900" w:type="dxa"/>
+          </w:tcPr>
+          <w:p>
+            <w:pPr>
+              <w:spacing w:after="100"/>
+              <w:rPr>
+                <w:rFonts w:ascii="Calibri" w:hAnsi="Calibri" w:cs="Arial"/>
+                <w:color w:val="3B3838" w:themeColor="background2" w:themeShade="40"/>
+                <w:sz w:val="20"/>
+                <w:szCs w:val="20"/>
+                <w:lang w:eastAsia="es-CL"/>
+              </w:rPr>
+            </w:pPr>
+            <w:r>
+              <w:rPr>
+                <w:rFonts w:ascii="Calibri" w:hAnsi="Calibri" w:cs="Calibri"/>
+                <w:color w:val="3B3838"/>
+                <w:sz w:val="18"/>
+                <w:szCs w:val="18"/>
               </w:rPr>
               <w:t>Isabella y Diego</w:t>
             </w:r>
@@ -2531,94 +2462,51 @@
         </w:tc>
         <w:tc>
           <w:tcPr>
-            <w:tcW w:w="1276" w:type="dxa"/>
-          </w:tcPr>
-          <w:p>
-            <w:pPr>
-              <w:jc w:val="both"/>
-              <w:rPr>
-                <w:rFonts w:ascii="Calibri" w:hAnsi="Calibri" w:cs="Arial"/>
-                <w:iCs/>
-                <w:color w:val="3B3838" w:themeColor="background2" w:themeShade="40"/>
-                <w:sz w:val="18"/>
-                <w:szCs w:val="20"/>
-                <w:lang w:eastAsia="es-CL"/>
-              </w:rPr>
-            </w:pPr>
-            <w:proofErr w:type="spellStart"/>
-            <w:r>
-              <w:rPr>
-                <w:rFonts w:ascii="Calibri" w:hAnsi="Calibri" w:cs="Arial"/>
-                <w:iCs/>
-                <w:color w:val="3B3838" w:themeColor="background2" w:themeShade="40"/>
-                <w:sz w:val="18"/>
-                <w:szCs w:val="20"/>
-                <w:lang w:eastAsia="es-CL"/>
-              </w:rPr>
-              <w:t>Frontend</w:t>
-            </w:r>
-            <w:proofErr w:type="spellEnd"/>
-            <w:r>
-              <w:rPr>
-                <w:rFonts w:ascii="Calibri" w:hAnsi="Calibri" w:cs="Arial"/>
-                <w:iCs/>
-                <w:color w:val="3B3838" w:themeColor="background2" w:themeShade="40"/>
-                <w:sz w:val="18"/>
-                <w:szCs w:val="20"/>
-                <w:lang w:eastAsia="es-CL"/>
-              </w:rPr>
-              <w:t xml:space="preserve"> y </w:t>
-            </w:r>
-            <w:proofErr w:type="spellStart"/>
-            <w:r>
-              <w:rPr>
-                <w:rFonts w:ascii="Calibri" w:hAnsi="Calibri" w:cs="Arial"/>
-                <w:iCs/>
-                <w:color w:val="3B3838" w:themeColor="background2" w:themeShade="40"/>
-                <w:sz w:val="18"/>
-                <w:szCs w:val="20"/>
-                <w:lang w:eastAsia="es-CL"/>
-              </w:rPr>
-              <w:t>backend</w:t>
-            </w:r>
-            <w:proofErr w:type="spellEnd"/>
-            <w:r>
-              <w:rPr>
-                <w:rFonts w:ascii="Calibri" w:hAnsi="Calibri" w:cs="Arial"/>
-                <w:iCs/>
-                <w:color w:val="3B3838" w:themeColor="background2" w:themeShade="40"/>
-                <w:sz w:val="18"/>
-                <w:szCs w:val="20"/>
-                <w:lang w:eastAsia="es-CL"/>
-              </w:rPr>
-              <w:t xml:space="preserve"> se desarrollan en carpetas separadas y actualmente se encuentran conectados</w:t>
-            </w:r>
-          </w:p>
-        </w:tc>
-        <w:tc>
-          <w:tcPr>
-            <w:tcW w:w="851" w:type="dxa"/>
-          </w:tcPr>
-          <w:p>
-            <w:pPr>
-              <w:jc w:val="center"/>
-              <w:rPr>
-                <w:rFonts w:ascii="Calibri" w:hAnsi="Calibri" w:cs="Arial"/>
-                <w:iCs/>
-                <w:color w:val="3B3838" w:themeColor="background2" w:themeShade="40"/>
-                <w:sz w:val="18"/>
-                <w:szCs w:val="20"/>
-                <w:lang w:val="en-US" w:eastAsia="es-CL"/>
-              </w:rPr>
-            </w:pPr>
-            <w:r>
-              <w:rPr>
-                <w:rFonts w:ascii="Calibri" w:hAnsi="Calibri" w:cs="Arial"/>
-                <w:iCs/>
-                <w:color w:val="3B3838" w:themeColor="background2" w:themeShade="40"/>
-                <w:sz w:val="18"/>
-                <w:szCs w:val="20"/>
-                <w:lang w:eastAsia="es-CL"/>
+            <w:tcW w:w="1650" w:type="dxa"/>
+          </w:tcPr>
+          <w:p>
+            <w:pPr>
+              <w:spacing w:after="100"/>
+              <w:rPr>
+                <w:rFonts w:ascii="Calibri" w:hAnsi="Calibri" w:cs="Arial"/>
+                <w:color w:val="3B3838" w:themeColor="background2" w:themeShade="40"/>
+                <w:sz w:val="20"/>
+                <w:szCs w:val="20"/>
+                <w:lang w:eastAsia="es-CL"/>
+              </w:rPr>
+            </w:pPr>
+            <w:r>
+              <w:rPr>
+                <w:rFonts w:ascii="Calibri" w:hAnsi="Calibri" w:cs="Calibri"/>
+                <w:color w:val="3B3838"/>
+                <w:sz w:val="18"/>
+                <w:szCs w:val="18"/>
+              </w:rPr>
+              <w:t>Vista pública y panel del personal según rol: disponibilidad, caja, planificación, preparaciones, ingredientes, usuarios y análisis.</w:t>
+            </w:r>
+          </w:p>
+        </w:tc>
+        <w:tc>
+          <w:tcPr>
+            <w:tcW w:w="826" w:type="dxa"/>
+          </w:tcPr>
+          <w:p>
+            <w:pPr>
+              <w:spacing w:after="100"/>
+              <w:rPr>
+                <w:rFonts w:ascii="Calibri" w:hAnsi="Calibri" w:cs="Arial"/>
+                <w:color w:val="3B3838" w:themeColor="background2" w:themeShade="40"/>
+                <w:sz w:val="20"/>
+                <w:szCs w:val="20"/>
+                <w:lang w:eastAsia="es-CL"/>
+              </w:rPr>
+            </w:pPr>
+            <w:r>
+              <w:rPr>
+                <w:rFonts w:ascii="Calibri" w:hAnsi="Calibri" w:cs="Calibri"/>
+                <w:color w:val="3B3838"/>
+                <w:sz w:val="18"/>
+                <w:szCs w:val="18"/>
               </w:rPr>
               <w:t>En curso</w:t>
             </w:r>
@@ -2626,30 +2514,27 @@
         </w:tc>
         <w:tc>
           <w:tcPr>
-            <w:tcW w:w="1417" w:type="dxa"/>
-          </w:tcPr>
-          <w:p>
-            <w:pPr>
-              <w:jc w:val="both"/>
-              <w:rPr>
-                <w:rFonts w:ascii="Calibri" w:hAnsi="Calibri" w:cs="Arial"/>
-                <w:iCs/>
-                <w:color w:val="3B3838" w:themeColor="background2" w:themeShade="40"/>
-                <w:sz w:val="18"/>
-                <w:szCs w:val="20"/>
-                <w:lang w:eastAsia="es-CL"/>
-              </w:rPr>
-            </w:pPr>
-            <w:r>
-              <w:rPr>
-                <w:rFonts w:ascii="Calibri" w:hAnsi="Calibri" w:cs="Arial"/>
-                <w:iCs/>
-                <w:color w:val="3B3838" w:themeColor="background2" w:themeShade="40"/>
-                <w:sz w:val="18"/>
-                <w:szCs w:val="20"/>
-                <w:lang w:eastAsia="es-CL"/>
-              </w:rPr>
-              <w:t>Se ha priorizado inicialmente la consulta de información del menú</w:t>
+            <w:tcW w:w="1800" w:type="dxa"/>
+          </w:tcPr>
+          <w:p>
+            <w:pPr>
+              <w:spacing w:after="100"/>
+              <w:rPr>
+                <w:rFonts w:ascii="Calibri" w:hAnsi="Calibri" w:cs="Arial"/>
+                <w:color w:val="3B3838" w:themeColor="background2" w:themeShade="40"/>
+                <w:sz w:val="20"/>
+                <w:szCs w:val="20"/>
+                <w:lang w:eastAsia="es-CL"/>
+              </w:rPr>
+            </w:pPr>
+            <w:r>
+              <w:rPr>
+                <w:rFonts w:ascii="Calibri" w:hAnsi="Calibri" w:cs="Calibri"/>
+                <w:color w:val="3B3838"/>
+                <w:sz w:val="18"/>
+                <w:szCs w:val="18"/>
+              </w:rPr>
+              <w:t>Primero se priorizó la consulta estudiantil y después el panel del personal. La interfaz tiene modo claro y oscuro.</w:t>
             </w:r>
           </w:p>
         </w:tc>
@@ -2660,28 +2545,25 @@
         </w:trPr>
         <w:tc>
           <w:tcPr>
-            <w:tcW w:w="1328" w:type="dxa"/>
-          </w:tcPr>
-          <w:p>
-            <w:pPr>
-              <w:jc w:val="both"/>
-              <w:rPr>
-                <w:rFonts w:ascii="Calibri" w:hAnsi="Calibri" w:cs="Arial"/>
-                <w:iCs/>
-                <w:color w:val="3B3838" w:themeColor="background2" w:themeShade="40"/>
-                <w:sz w:val="18"/>
-                <w:szCs w:val="20"/>
-                <w:lang w:eastAsia="es-CL"/>
-              </w:rPr>
-            </w:pPr>
-            <w:r>
-              <w:rPr>
-                <w:rFonts w:ascii="Calibri" w:hAnsi="Calibri" w:cs="Arial"/>
-                <w:iCs/>
-                <w:color w:val="3B3838" w:themeColor="background2" w:themeShade="40"/>
-                <w:sz w:val="18"/>
-                <w:szCs w:val="20"/>
-                <w:lang w:eastAsia="es-CL"/>
+            <w:tcW w:w="1300" w:type="dxa"/>
+          </w:tcPr>
+          <w:p>
+            <w:pPr>
+              <w:spacing w:after="100"/>
+              <w:rPr>
+                <w:rFonts w:ascii="Calibri" w:hAnsi="Calibri" w:cs="Arial"/>
+                <w:color w:val="3B3838" w:themeColor="background2" w:themeShade="40"/>
+                <w:sz w:val="20"/>
+                <w:szCs w:val="20"/>
+                <w:lang w:eastAsia="es-CL"/>
+              </w:rPr>
+            </w:pPr>
+            <w:r>
+              <w:rPr>
+                <w:rFonts w:ascii="Calibri" w:hAnsi="Calibri" w:cs="Calibri"/>
+                <w:color w:val="3B3838"/>
+                <w:sz w:val="18"/>
+                <w:szCs w:val="18"/>
               </w:rPr>
               <w:t>C1: Realizar pruebas de certificación</w:t>
             </w:r>
@@ -2689,115 +2571,145 @@
         </w:tc>
         <w:tc>
           <w:tcPr>
-            <w:tcW w:w="1077" w:type="dxa"/>
-          </w:tcPr>
-          <w:p>
-            <w:pPr>
-              <w:jc w:val="both"/>
-              <w:rPr>
-                <w:rFonts w:ascii="Calibri" w:hAnsi="Calibri" w:cs="Arial"/>
-                <w:iCs/>
-                <w:color w:val="3B3838" w:themeColor="background2" w:themeShade="40"/>
-                <w:sz w:val="18"/>
-                <w:szCs w:val="20"/>
-                <w:lang w:eastAsia="es-CL"/>
-              </w:rPr>
-            </w:pPr>
-            <w:r>
-              <w:rPr>
-                <w:rFonts w:ascii="Calibri" w:hAnsi="Calibri" w:cs="Arial"/>
-                <w:iCs/>
-                <w:color w:val="3B3838" w:themeColor="background2" w:themeShade="40"/>
-                <w:sz w:val="18"/>
-                <w:szCs w:val="20"/>
-                <w:lang w:eastAsia="es-CL"/>
-              </w:rPr>
-              <w:t>Elaborar plan de pruebas y preparar validación de funcionalidades</w:t>
-            </w:r>
-          </w:p>
-        </w:tc>
-        <w:tc>
-          <w:tcPr>
-            <w:tcW w:w="1276" w:type="dxa"/>
-          </w:tcPr>
-          <w:p>
-            <w:pPr>
-              <w:jc w:val="both"/>
-              <w:rPr>
-                <w:rFonts w:ascii="Calibri" w:hAnsi="Calibri" w:cs="Arial"/>
-                <w:iCs/>
-                <w:color w:val="3B3838" w:themeColor="background2" w:themeShade="40"/>
-                <w:sz w:val="18"/>
-                <w:szCs w:val="20"/>
-                <w:lang w:eastAsia="es-CL"/>
-              </w:rPr>
-            </w:pPr>
-            <w:r>
-              <w:rPr>
-                <w:rFonts w:ascii="Calibri" w:hAnsi="Calibri" w:cs="Arial"/>
-                <w:iCs/>
-                <w:color w:val="3B3838" w:themeColor="background2" w:themeShade="40"/>
-                <w:sz w:val="18"/>
-                <w:szCs w:val="20"/>
-                <w:lang w:eastAsia="es-CL"/>
-              </w:rPr>
-              <w:t>Documento de plan de pruebas, sistema desarrollado</w:t>
-            </w:r>
-          </w:p>
-        </w:tc>
-        <w:tc>
-          <w:tcPr>
-            <w:tcW w:w="1276" w:type="dxa"/>
-          </w:tcPr>
-          <w:p>
-            <w:pPr>
-              <w:jc w:val="both"/>
-              <w:rPr>
-                <w:rFonts w:ascii="Calibri" w:hAnsi="Calibri" w:cs="Arial"/>
-                <w:iCs/>
-                <w:color w:val="3B3838" w:themeColor="background2" w:themeShade="40"/>
-                <w:sz w:val="18"/>
-                <w:szCs w:val="20"/>
-                <w:lang w:eastAsia="es-CL"/>
-              </w:rPr>
-            </w:pPr>
-            <w:r>
-              <w:rPr>
-                <w:rFonts w:ascii="Calibri" w:hAnsi="Calibri" w:cs="Arial"/>
-                <w:iCs/>
-                <w:color w:val="3B3838" w:themeColor="background2" w:themeShade="40"/>
-                <w:sz w:val="18"/>
-                <w:szCs w:val="20"/>
-                <w:lang w:eastAsia="es-CL"/>
-              </w:rPr>
-              <w:t>Semanas 10–16</w:t>
-            </w:r>
-          </w:p>
-        </w:tc>
-        <w:tc>
-          <w:tcPr>
-            <w:tcW w:w="1275" w:type="dxa"/>
-          </w:tcPr>
-          <w:p>
-            <w:pPr>
-              <w:jc w:val="both"/>
-              <w:rPr>
-                <w:rFonts w:ascii="Calibri" w:hAnsi="Calibri" w:cs="Arial"/>
-                <w:iCs/>
-                <w:color w:val="3B3838" w:themeColor="background2" w:themeShade="40"/>
-                <w:sz w:val="18"/>
-                <w:szCs w:val="20"/>
-                <w:lang w:eastAsia="es-CL"/>
-              </w:rPr>
-            </w:pPr>
-            <w:r>
-              <w:rPr>
-                <w:rFonts w:ascii="Calibri" w:hAnsi="Calibri" w:cs="Arial"/>
-                <w:iCs/>
-                <w:color w:val="3B3838" w:themeColor="background2" w:themeShade="40"/>
-                <w:sz w:val="18"/>
-                <w:szCs w:val="20"/>
-                <w:lang w:val="en-US" w:eastAsia="es-CL"/>
+            <w:tcW w:w="1250" w:type="dxa"/>
+          </w:tcPr>
+          <w:p>
+            <w:pPr>
+              <w:spacing w:after="100"/>
+              <w:rPr>
+                <w:rFonts w:ascii="Calibri" w:hAnsi="Calibri" w:cs="Arial"/>
+                <w:color w:val="3B3838" w:themeColor="background2" w:themeShade="40"/>
+                <w:sz w:val="20"/>
+                <w:szCs w:val="20"/>
+                <w:lang w:eastAsia="es-CL"/>
+              </w:rPr>
+            </w:pPr>
+            <w:r>
+              <w:rPr>
+                <w:rFonts w:ascii="Calibri" w:hAnsi="Calibri" w:cs="Calibri"/>
+                <w:color w:val="3B3838"/>
+                <w:sz w:val="18"/>
+                <w:szCs w:val="18"/>
+              </w:rPr>
+              <w:t>Elaborar el plan de pruebas y ejecutar las pruebas</w:t>
+            </w:r>
+          </w:p>
+        </w:tc>
+        <w:tc>
+          <w:tcPr>
+            <w:tcW w:w="1100" w:type="dxa"/>
+          </w:tcPr>
+          <w:p>
+            <w:pPr>
+              <w:spacing w:after="100"/>
+              <w:rPr>
+                <w:rFonts w:ascii="Calibri" w:hAnsi="Calibri" w:cs="Arial"/>
+                <w:color w:val="3B3838" w:themeColor="background2" w:themeShade="40"/>
+                <w:sz w:val="20"/>
+                <w:szCs w:val="20"/>
+                <w:lang w:eastAsia="es-CL"/>
+              </w:rPr>
+            </w:pPr>
+            <w:proofErr w:type="spellStart"/>
+            <w:r>
+              <w:rPr>
+                <w:rFonts w:ascii="Calibri" w:hAnsi="Calibri" w:cs="Calibri"/>
+                <w:color w:val="3B3838"/>
+                <w:sz w:val="18"/>
+                <w:szCs w:val="18"/>
+              </w:rPr>
+              <w:t>node:test</w:t>
+            </w:r>
+            <w:proofErr w:type="spellEnd"/>
+            <w:r>
+              <w:rPr>
+                <w:rFonts w:ascii="Calibri" w:hAnsi="Calibri" w:cs="Calibri"/>
+                <w:color w:val="3B3838"/>
+                <w:sz w:val="18"/>
+                <w:szCs w:val="18"/>
+              </w:rPr>
+              <w:t xml:space="preserve">, scripts de integración, </w:t>
+            </w:r>
+            <w:proofErr w:type="spellStart"/>
+            <w:r>
+              <w:rPr>
+                <w:rFonts w:ascii="Calibri" w:hAnsi="Calibri" w:cs="Calibri"/>
+                <w:color w:val="3B3838"/>
+                <w:sz w:val="18"/>
+                <w:szCs w:val="18"/>
+              </w:rPr>
+              <w:t>curl</w:t>
+            </w:r>
+            <w:proofErr w:type="spellEnd"/>
+            <w:r>
+              <w:rPr>
+                <w:rFonts w:ascii="Calibri" w:hAnsi="Calibri" w:cs="Calibri"/>
+                <w:color w:val="3B3838"/>
+                <w:sz w:val="18"/>
+                <w:szCs w:val="18"/>
+              </w:rPr>
+              <w:t xml:space="preserve"> y </w:t>
+            </w:r>
+            <w:proofErr w:type="spellStart"/>
+            <w:r>
+              <w:rPr>
+                <w:rFonts w:ascii="Calibri" w:hAnsi="Calibri" w:cs="Calibri"/>
+                <w:color w:val="3B3838"/>
+                <w:sz w:val="18"/>
+                <w:szCs w:val="18"/>
+              </w:rPr>
+              <w:t>Postman</w:t>
+            </w:r>
+            <w:proofErr w:type="spellEnd"/>
+          </w:p>
+        </w:tc>
+        <w:tc>
+          <w:tcPr>
+            <w:tcW w:w="950" w:type="dxa"/>
+          </w:tcPr>
+          <w:p>
+            <w:pPr>
+              <w:spacing w:after="100"/>
+              <w:rPr>
+                <w:rFonts w:ascii="Calibri" w:hAnsi="Calibri" w:cs="Arial"/>
+                <w:color w:val="3B3838" w:themeColor="background2" w:themeShade="40"/>
+                <w:sz w:val="20"/>
+                <w:szCs w:val="20"/>
+                <w:lang w:eastAsia="es-CL"/>
+              </w:rPr>
+            </w:pPr>
+            <w:r>
+              <w:rPr>
+                <w:rFonts w:ascii="Calibri" w:hAnsi="Calibri" w:cs="Calibri"/>
+                <w:color w:val="3B3838"/>
+                <w:sz w:val="18"/>
+                <w:szCs w:val="18"/>
+              </w:rPr>
+              <w:t>Semanas 10 a 16</w:t>
+            </w:r>
+          </w:p>
+        </w:tc>
+        <w:tc>
+          <w:tcPr>
+            <w:tcW w:w="900" w:type="dxa"/>
+          </w:tcPr>
+          <w:p>
+            <w:pPr>
+              <w:spacing w:after="100"/>
+              <w:rPr>
+                <w:rFonts w:ascii="Calibri" w:hAnsi="Calibri" w:cs="Arial"/>
+                <w:color w:val="3B3838" w:themeColor="background2" w:themeShade="40"/>
+                <w:sz w:val="20"/>
+                <w:szCs w:val="20"/>
+                <w:lang w:eastAsia="es-CL"/>
+              </w:rPr>
+            </w:pPr>
+            <w:r>
+              <w:rPr>
+                <w:rFonts w:ascii="Calibri" w:hAnsi="Calibri" w:cs="Calibri"/>
+                <w:color w:val="3B3838"/>
+                <w:sz w:val="18"/>
+                <w:szCs w:val="18"/>
               </w:rPr>
               <w:t>Isabella y Diego</w:t>
             </w:r>
@@ -2805,57 +2717,51 @@
         </w:tc>
         <w:tc>
           <w:tcPr>
-            <w:tcW w:w="1276" w:type="dxa"/>
-          </w:tcPr>
-          <w:p>
-            <w:pPr>
-              <w:jc w:val="both"/>
-              <w:rPr>
-                <w:rFonts w:ascii="Calibri" w:hAnsi="Calibri" w:cs="Arial"/>
-                <w:iCs/>
-                <w:color w:val="3B3838" w:themeColor="background2" w:themeShade="40"/>
-                <w:sz w:val="18"/>
-                <w:szCs w:val="20"/>
-                <w:lang w:eastAsia="es-CL"/>
-              </w:rPr>
-            </w:pPr>
-            <w:r>
-              <w:rPr>
-                <w:rFonts w:ascii="Calibri" w:hAnsi="Calibri" w:cs="Arial"/>
-                <w:iCs/>
-                <w:color w:val="3B3838" w:themeColor="background2" w:themeShade="40"/>
-                <w:sz w:val="18"/>
-                <w:szCs w:val="20"/>
-                <w:lang w:eastAsia="es-CL"/>
-              </w:rPr>
-              <w:t>El plan de pruebas ya fue elaborado, mientras que la ejecución completa se realizará durante las etapas correspondientes</w:t>
-            </w:r>
-          </w:p>
-        </w:tc>
-        <w:tc>
-          <w:tcPr>
-            <w:tcW w:w="851" w:type="dxa"/>
-          </w:tcPr>
-          <w:p>
-            <w:pPr>
-              <w:jc w:val="center"/>
-              <w:rPr>
-                <w:rFonts w:ascii="Calibri" w:hAnsi="Calibri" w:cs="Arial"/>
-                <w:iCs/>
-                <w:color w:val="3B3838" w:themeColor="background2" w:themeShade="40"/>
-                <w:sz w:val="18"/>
-                <w:szCs w:val="20"/>
-                <w:lang w:eastAsia="es-CL"/>
-              </w:rPr>
-            </w:pPr>
-            <w:r>
-              <w:rPr>
-                <w:rFonts w:ascii="Calibri" w:hAnsi="Calibri" w:cs="Arial"/>
-                <w:iCs/>
-                <w:color w:val="3B3838" w:themeColor="background2" w:themeShade="40"/>
-                <w:sz w:val="18"/>
-                <w:szCs w:val="20"/>
-                <w:lang w:eastAsia="es-CL"/>
+            <w:tcW w:w="1650" w:type="dxa"/>
+          </w:tcPr>
+          <w:p>
+            <w:pPr>
+              <w:spacing w:after="100"/>
+              <w:rPr>
+                <w:rFonts w:ascii="Calibri" w:hAnsi="Calibri" w:cs="Arial"/>
+                <w:color w:val="3B3838" w:themeColor="background2" w:themeShade="40"/>
+                <w:sz w:val="20"/>
+                <w:szCs w:val="20"/>
+                <w:lang w:eastAsia="es-CL"/>
+              </w:rPr>
+            </w:pPr>
+            <w:r>
+              <w:rPr>
+                <w:rFonts w:ascii="Calibri" w:hAnsi="Calibri" w:cs="Calibri"/>
+                <w:color w:val="3B3838"/>
+                <w:sz w:val="18"/>
+                <w:szCs w:val="18"/>
+              </w:rPr>
+              <w:t>Las 23 pruebas unitarias automatizadas pasan. Hay 2 scripts de integración contra PostgreSQL y 2 incidencias corregidas (INC-01, INC-02). El plan documenta solo los 14 casos del Sprint 1.</w:t>
+            </w:r>
+          </w:p>
+        </w:tc>
+        <w:tc>
+          <w:tcPr>
+            <w:tcW w:w="826" w:type="dxa"/>
+          </w:tcPr>
+          <w:p>
+            <w:pPr>
+              <w:spacing w:after="100"/>
+              <w:rPr>
+                <w:rFonts w:ascii="Calibri" w:hAnsi="Calibri" w:cs="Arial"/>
+                <w:color w:val="3B3838" w:themeColor="background2" w:themeShade="40"/>
+                <w:sz w:val="20"/>
+                <w:szCs w:val="20"/>
+                <w:lang w:eastAsia="es-CL"/>
+              </w:rPr>
+            </w:pPr>
+            <w:r>
+              <w:rPr>
+                <w:rFonts w:ascii="Calibri" w:hAnsi="Calibri" w:cs="Calibri"/>
+                <w:color w:val="3B3838"/>
+                <w:sz w:val="18"/>
+                <w:szCs w:val="18"/>
               </w:rPr>
               <w:t>En curso</w:t>
             </w:r>
@@ -2863,30 +2769,67 @@
         </w:tc>
         <w:tc>
           <w:tcPr>
-            <w:tcW w:w="1417" w:type="dxa"/>
-          </w:tcPr>
-          <w:p>
-            <w:pPr>
-              <w:jc w:val="both"/>
-              <w:rPr>
-                <w:rFonts w:ascii="Calibri" w:hAnsi="Calibri" w:cs="Arial"/>
-                <w:iCs/>
-                <w:color w:val="3B3838" w:themeColor="background2" w:themeShade="40"/>
-                <w:sz w:val="18"/>
-                <w:szCs w:val="20"/>
-                <w:lang w:eastAsia="es-CL"/>
-              </w:rPr>
-            </w:pPr>
-            <w:r>
-              <w:rPr>
-                <w:rFonts w:ascii="Calibri" w:hAnsi="Calibri" w:cs="Arial"/>
-                <w:iCs/>
-                <w:color w:val="3B3838" w:themeColor="background2" w:themeShade="40"/>
-                <w:sz w:val="18"/>
-                <w:szCs w:val="20"/>
-                <w:lang w:eastAsia="es-CL"/>
-              </w:rPr>
-              <w:t>Se irá actualizando según las funcionalidades implementadas</w:t>
+            <w:tcW w:w="1800" w:type="dxa"/>
+          </w:tcPr>
+          <w:p>
+            <w:pPr>
+              <w:spacing w:after="100"/>
+              <w:rPr>
+                <w:rFonts w:ascii="Calibri" w:hAnsi="Calibri" w:cs="Arial"/>
+                <w:color w:val="3B3838" w:themeColor="background2" w:themeShade="40"/>
+                <w:sz w:val="20"/>
+                <w:szCs w:val="20"/>
+                <w:lang w:eastAsia="es-CL"/>
+              </w:rPr>
+            </w:pPr>
+            <w:r>
+              <w:rPr>
+                <w:rFonts w:ascii="Calibri" w:hAnsi="Calibri" w:cs="Calibri"/>
+                <w:color w:val="3B3838"/>
+                <w:sz w:val="18"/>
+                <w:szCs w:val="18"/>
+              </w:rPr>
+              <w:t xml:space="preserve">Se usó </w:t>
+            </w:r>
+            <w:proofErr w:type="spellStart"/>
+            <w:r>
+              <w:rPr>
+                <w:rFonts w:ascii="Calibri" w:hAnsi="Calibri" w:cs="Calibri"/>
+                <w:color w:val="3B3838"/>
+                <w:sz w:val="18"/>
+                <w:szCs w:val="18"/>
+              </w:rPr>
+              <w:t>node:test</w:t>
+            </w:r>
+            <w:proofErr w:type="spellEnd"/>
+            <w:r>
+              <w:rPr>
+                <w:rFonts w:ascii="Calibri" w:hAnsi="Calibri" w:cs="Calibri"/>
+                <w:color w:val="3B3838"/>
+                <w:sz w:val="18"/>
+                <w:szCs w:val="18"/>
+              </w:rPr>
+              <w:t xml:space="preserve"> en lugar de </w:t>
+            </w:r>
+            <w:proofErr w:type="spellStart"/>
+            <w:r>
+              <w:rPr>
+                <w:rFonts w:ascii="Calibri" w:hAnsi="Calibri" w:cs="Calibri"/>
+                <w:color w:val="3B3838"/>
+                <w:sz w:val="18"/>
+                <w:szCs w:val="18"/>
+              </w:rPr>
+              <w:t>Jest</w:t>
+            </w:r>
+            <w:proofErr w:type="spellEnd"/>
+            <w:r>
+              <w:rPr>
+                <w:rFonts w:ascii="Calibri" w:hAnsi="Calibri" w:cs="Calibri"/>
+                <w:color w:val="3B3838"/>
+                <w:sz w:val="18"/>
+                <w:szCs w:val="18"/>
+              </w:rPr>
+              <w:t>. Falta documentar las pruebas posteriores al Sprint 1 y cerrar la matriz de trazabilidad.</w:t>
             </w:r>
           </w:p>
         </w:tc>
@@ -2897,28 +2840,25 @@
         </w:trPr>
         <w:tc>
           <w:tcPr>
-            <w:tcW w:w="1328" w:type="dxa"/>
-          </w:tcPr>
-          <w:p>
-            <w:pPr>
-              <w:jc w:val="both"/>
-              <w:rPr>
-                <w:rFonts w:ascii="Calibri" w:hAnsi="Calibri" w:cs="Arial"/>
-                <w:iCs/>
-                <w:color w:val="3B3838" w:themeColor="background2" w:themeShade="40"/>
-                <w:sz w:val="18"/>
-                <w:szCs w:val="20"/>
-                <w:lang w:eastAsia="es-CL"/>
-              </w:rPr>
-            </w:pPr>
-            <w:r>
-              <w:rPr>
-                <w:rFonts w:ascii="Calibri" w:hAnsi="Calibri" w:cs="Arial"/>
-                <w:iCs/>
-                <w:color w:val="3B3838" w:themeColor="background2" w:themeShade="40"/>
-                <w:sz w:val="18"/>
-                <w:szCs w:val="20"/>
-                <w:lang w:eastAsia="es-CL"/>
+            <w:tcW w:w="1300" w:type="dxa"/>
+          </w:tcPr>
+          <w:p>
+            <w:pPr>
+              <w:spacing w:after="100"/>
+              <w:rPr>
+                <w:rFonts w:ascii="Calibri" w:hAnsi="Calibri" w:cs="Arial"/>
+                <w:color w:val="3B3838" w:themeColor="background2" w:themeShade="40"/>
+                <w:sz w:val="20"/>
+                <w:szCs w:val="20"/>
+                <w:lang w:eastAsia="es-CL"/>
+              </w:rPr>
+            </w:pPr>
+            <w:r>
+              <w:rPr>
+                <w:rFonts w:ascii="Calibri" w:hAnsi="Calibri" w:cs="Calibri"/>
+                <w:color w:val="3B3838"/>
+                <w:sz w:val="18"/>
+                <w:szCs w:val="18"/>
               </w:rPr>
               <w:t>C2: Gestionar el proyecto mediante metodología ágil</w:t>
             </w:r>
@@ -2926,40 +2866,35 @@
         </w:tc>
         <w:tc>
           <w:tcPr>
-            <w:tcW w:w="1077" w:type="dxa"/>
-          </w:tcPr>
-          <w:p>
-            <w:pPr>
-              <w:jc w:val="both"/>
-              <w:rPr>
-                <w:rFonts w:ascii="Calibri" w:hAnsi="Calibri" w:cs="Arial"/>
-                <w:iCs/>
-                <w:color w:val="3B3838" w:themeColor="background2" w:themeShade="40"/>
-                <w:sz w:val="18"/>
-                <w:szCs w:val="20"/>
-                <w:lang w:eastAsia="es-CL"/>
-              </w:rPr>
-            </w:pPr>
-            <w:r>
-              <w:rPr>
-                <w:rFonts w:ascii="Calibri" w:hAnsi="Calibri" w:cs="Arial"/>
-                <w:iCs/>
-                <w:color w:val="3B3838" w:themeColor="background2" w:themeShade="40"/>
-                <w:sz w:val="18"/>
-                <w:szCs w:val="20"/>
-                <w:lang w:eastAsia="es-CL"/>
-              </w:rPr>
-              <w:t xml:space="preserve">Gestionar backlog y desarrollo mediante </w:t>
+            <w:tcW w:w="1250" w:type="dxa"/>
+          </w:tcPr>
+          <w:p>
+            <w:pPr>
+              <w:spacing w:after="100"/>
+              <w:rPr>
+                <w:rFonts w:ascii="Calibri" w:hAnsi="Calibri" w:cs="Arial"/>
+                <w:color w:val="3B3838" w:themeColor="background2" w:themeShade="40"/>
+                <w:sz w:val="20"/>
+                <w:szCs w:val="20"/>
+                <w:lang w:eastAsia="es-CL"/>
+              </w:rPr>
+            </w:pPr>
+            <w:r>
+              <w:rPr>
+                <w:rFonts w:ascii="Calibri" w:hAnsi="Calibri" w:cs="Calibri"/>
+                <w:color w:val="3B3838"/>
+                <w:sz w:val="18"/>
+                <w:szCs w:val="18"/>
+              </w:rPr>
+              <w:t xml:space="preserve">Gestionar el backlog y el desarrollo por </w:t>
             </w:r>
             <w:proofErr w:type="spellStart"/>
             <w:r>
               <w:rPr>
-                <w:rFonts w:ascii="Calibri" w:hAnsi="Calibri" w:cs="Arial"/>
-                <w:iCs/>
-                <w:color w:val="3B3838" w:themeColor="background2" w:themeShade="40"/>
-                <w:sz w:val="18"/>
-                <w:szCs w:val="20"/>
-                <w:lang w:eastAsia="es-CL"/>
+                <w:rFonts w:ascii="Calibri" w:hAnsi="Calibri" w:cs="Calibri"/>
+                <w:color w:val="3B3838"/>
+                <w:sz w:val="18"/>
+                <w:szCs w:val="18"/>
               </w:rPr>
               <w:t>sprints</w:t>
             </w:r>
@@ -2968,86 +2903,77 @@
         </w:tc>
         <w:tc>
           <w:tcPr>
-            <w:tcW w:w="1276" w:type="dxa"/>
-          </w:tcPr>
-          <w:p>
-            <w:pPr>
-              <w:jc w:val="both"/>
-              <w:rPr>
-                <w:rFonts w:ascii="Calibri" w:hAnsi="Calibri" w:cs="Arial"/>
-                <w:iCs/>
-                <w:color w:val="3B3838" w:themeColor="background2" w:themeShade="40"/>
-                <w:sz w:val="18"/>
-                <w:szCs w:val="20"/>
-                <w:lang w:eastAsia="es-CL"/>
-              </w:rPr>
-            </w:pPr>
-            <w:r>
-              <w:rPr>
-                <w:rFonts w:ascii="Calibri" w:hAnsi="Calibri" w:cs="Arial"/>
-                <w:iCs/>
-                <w:color w:val="3B3838" w:themeColor="background2" w:themeShade="40"/>
-                <w:sz w:val="18"/>
-                <w:szCs w:val="20"/>
-                <w:lang w:eastAsia="es-CL"/>
-              </w:rPr>
-              <w:t>GitHub, backlog, historias de usuario, Scrum</w:t>
-            </w:r>
-          </w:p>
-        </w:tc>
-        <w:tc>
-          <w:tcPr>
-            <w:tcW w:w="1276" w:type="dxa"/>
-          </w:tcPr>
-          <w:p>
-            <w:pPr>
-              <w:jc w:val="both"/>
-              <w:rPr>
-                <w:rFonts w:ascii="Calibri" w:hAnsi="Calibri" w:cs="Arial"/>
-                <w:iCs/>
-                <w:color w:val="3B3838" w:themeColor="background2" w:themeShade="40"/>
-                <w:sz w:val="18"/>
-                <w:szCs w:val="20"/>
-                <w:lang w:eastAsia="es-CL"/>
-              </w:rPr>
-            </w:pPr>
-            <w:r>
-              <w:rPr>
-                <w:rFonts w:ascii="Calibri" w:hAnsi="Calibri" w:cs="Arial"/>
-                <w:iCs/>
-                <w:color w:val="3B3838" w:themeColor="background2" w:themeShade="40"/>
-                <w:sz w:val="18"/>
-                <w:szCs w:val="20"/>
-                <w:lang w:eastAsia="es-CL"/>
-              </w:rPr>
-              <w:t>Semanas 5–14</w:t>
-            </w:r>
-          </w:p>
-        </w:tc>
-        <w:tc>
-          <w:tcPr>
-            <w:tcW w:w="1275" w:type="dxa"/>
-          </w:tcPr>
-          <w:p>
-            <w:pPr>
-              <w:jc w:val="both"/>
-              <w:rPr>
-                <w:rFonts w:ascii="Calibri" w:hAnsi="Calibri" w:cs="Arial"/>
-                <w:iCs/>
-                <w:color w:val="3B3838" w:themeColor="background2" w:themeShade="40"/>
-                <w:sz w:val="18"/>
-                <w:szCs w:val="20"/>
-                <w:lang w:eastAsia="es-CL"/>
-              </w:rPr>
-            </w:pPr>
-            <w:r>
-              <w:rPr>
-                <w:rFonts w:ascii="Calibri" w:hAnsi="Calibri" w:cs="Arial"/>
-                <w:iCs/>
-                <w:color w:val="3B3838" w:themeColor="background2" w:themeShade="40"/>
-                <w:sz w:val="18"/>
-                <w:szCs w:val="20"/>
-                <w:lang w:eastAsia="es-CL"/>
+            <w:tcW w:w="1100" w:type="dxa"/>
+          </w:tcPr>
+          <w:p>
+            <w:pPr>
+              <w:spacing w:after="100"/>
+              <w:rPr>
+                <w:rFonts w:ascii="Calibri" w:hAnsi="Calibri" w:cs="Arial"/>
+                <w:color w:val="3B3838" w:themeColor="background2" w:themeShade="40"/>
+                <w:sz w:val="20"/>
+                <w:szCs w:val="20"/>
+                <w:lang w:eastAsia="es-CL"/>
+              </w:rPr>
+            </w:pPr>
+            <w:r>
+              <w:rPr>
+                <w:rFonts w:ascii="Calibri" w:hAnsi="Calibri" w:cs="Calibri"/>
+                <w:color w:val="3B3838"/>
+                <w:sz w:val="18"/>
+                <w:szCs w:val="18"/>
+              </w:rPr>
+              <w:t>GitHub, backlog, historias de usuario</w:t>
+            </w:r>
+          </w:p>
+        </w:tc>
+        <w:tc>
+          <w:tcPr>
+            <w:tcW w:w="950" w:type="dxa"/>
+          </w:tcPr>
+          <w:p>
+            <w:pPr>
+              <w:spacing w:after="100"/>
+              <w:rPr>
+                <w:rFonts w:ascii="Calibri" w:hAnsi="Calibri" w:cs="Arial"/>
+                <w:color w:val="3B3838" w:themeColor="background2" w:themeShade="40"/>
+                <w:sz w:val="20"/>
+                <w:szCs w:val="20"/>
+                <w:lang w:eastAsia="es-CL"/>
+              </w:rPr>
+            </w:pPr>
+            <w:r>
+              <w:rPr>
+                <w:rFonts w:ascii="Calibri" w:hAnsi="Calibri" w:cs="Calibri"/>
+                <w:color w:val="3B3838"/>
+                <w:sz w:val="18"/>
+                <w:szCs w:val="18"/>
+              </w:rPr>
+              <w:t>Semanas 5 a 14</w:t>
+            </w:r>
+          </w:p>
+        </w:tc>
+        <w:tc>
+          <w:tcPr>
+            <w:tcW w:w="900" w:type="dxa"/>
+          </w:tcPr>
+          <w:p>
+            <w:pPr>
+              <w:spacing w:after="100"/>
+              <w:rPr>
+                <w:rFonts w:ascii="Calibri" w:hAnsi="Calibri" w:cs="Arial"/>
+                <w:color w:val="3B3838" w:themeColor="background2" w:themeShade="40"/>
+                <w:sz w:val="20"/>
+                <w:szCs w:val="20"/>
+                <w:lang w:eastAsia="es-CL"/>
+              </w:rPr>
+            </w:pPr>
+            <w:r>
+              <w:rPr>
+                <w:rFonts w:ascii="Calibri" w:hAnsi="Calibri" w:cs="Calibri"/>
+                <w:color w:val="3B3838"/>
+                <w:sz w:val="18"/>
+                <w:szCs w:val="18"/>
               </w:rPr>
               <w:t>Isabella y Diego</w:t>
             </w:r>
@@ -3055,57 +2981,71 @@
         </w:tc>
         <w:tc>
           <w:tcPr>
-            <w:tcW w:w="1276" w:type="dxa"/>
-          </w:tcPr>
-          <w:p>
-            <w:pPr>
-              <w:jc w:val="both"/>
-              <w:rPr>
-                <w:rFonts w:ascii="Calibri" w:hAnsi="Calibri" w:cs="Arial"/>
-                <w:iCs/>
-                <w:color w:val="3B3838" w:themeColor="background2" w:themeShade="40"/>
-                <w:sz w:val="18"/>
-                <w:szCs w:val="20"/>
-                <w:lang w:eastAsia="es-CL"/>
-              </w:rPr>
-            </w:pPr>
-            <w:r>
-              <w:rPr>
-                <w:rFonts w:ascii="Calibri" w:hAnsi="Calibri" w:cs="Arial"/>
-                <w:iCs/>
-                <w:color w:val="3B3838" w:themeColor="background2" w:themeShade="40"/>
-                <w:sz w:val="18"/>
-                <w:szCs w:val="20"/>
-                <w:lang w:eastAsia="es-CL"/>
-              </w:rPr>
-              <w:t>Actualmente se encuentran en el Sprint 4</w:t>
-            </w:r>
-          </w:p>
-        </w:tc>
-        <w:tc>
-          <w:tcPr>
-            <w:tcW w:w="851" w:type="dxa"/>
-          </w:tcPr>
-          <w:p>
-            <w:pPr>
-              <w:jc w:val="center"/>
-              <w:rPr>
-                <w:rFonts w:ascii="Calibri" w:hAnsi="Calibri" w:cs="Arial"/>
-                <w:iCs/>
-                <w:color w:val="3B3838" w:themeColor="background2" w:themeShade="40"/>
-                <w:sz w:val="18"/>
-                <w:szCs w:val="20"/>
-                <w:lang w:eastAsia="es-CL"/>
-              </w:rPr>
-            </w:pPr>
-            <w:r>
-              <w:rPr>
-                <w:rFonts w:ascii="Calibri" w:hAnsi="Calibri" w:cs="Arial"/>
-                <w:iCs/>
-                <w:color w:val="3B3838" w:themeColor="background2" w:themeShade="40"/>
-                <w:sz w:val="18"/>
-                <w:szCs w:val="20"/>
-                <w:lang w:eastAsia="es-CL"/>
+            <w:tcW w:w="1650" w:type="dxa"/>
+          </w:tcPr>
+          <w:p>
+            <w:pPr>
+              <w:spacing w:after="100"/>
+              <w:rPr>
+                <w:rFonts w:ascii="Calibri" w:hAnsi="Calibri" w:cs="Arial"/>
+                <w:color w:val="3B3838" w:themeColor="background2" w:themeShade="40"/>
+                <w:sz w:val="20"/>
+                <w:szCs w:val="20"/>
+                <w:lang w:eastAsia="es-CL"/>
+              </w:rPr>
+            </w:pPr>
+            <w:r>
+              <w:rPr>
+                <w:rFonts w:ascii="Calibri" w:hAnsi="Calibri" w:cs="Calibri"/>
+                <w:color w:val="3B3838"/>
+                <w:sz w:val="18"/>
+                <w:szCs w:val="18"/>
+              </w:rPr>
+              <w:t xml:space="preserve">Nueve </w:t>
+            </w:r>
+            <w:proofErr w:type="spellStart"/>
+            <w:r>
+              <w:rPr>
+                <w:rFonts w:ascii="Calibri" w:hAnsi="Calibri" w:cs="Calibri"/>
+                <w:color w:val="3B3838"/>
+                <w:sz w:val="18"/>
+                <w:szCs w:val="18"/>
+              </w:rPr>
+              <w:t>sprints</w:t>
+            </w:r>
+            <w:proofErr w:type="spellEnd"/>
+            <w:r>
+              <w:rPr>
+                <w:rFonts w:ascii="Calibri" w:hAnsi="Calibri" w:cs="Calibri"/>
+                <w:color w:val="3B3838"/>
+                <w:sz w:val="18"/>
+                <w:szCs w:val="18"/>
+              </w:rPr>
+              <w:t xml:space="preserve"> a la fecha. Varias funciones nacieron durante el desarrollo y se identificaron como RF-21 a RF-28.</w:t>
+            </w:r>
+          </w:p>
+        </w:tc>
+        <w:tc>
+          <w:tcPr>
+            <w:tcW w:w="826" w:type="dxa"/>
+          </w:tcPr>
+          <w:p>
+            <w:pPr>
+              <w:spacing w:after="100"/>
+              <w:rPr>
+                <w:rFonts w:ascii="Calibri" w:hAnsi="Calibri" w:cs="Arial"/>
+                <w:color w:val="3B3838" w:themeColor="background2" w:themeShade="40"/>
+                <w:sz w:val="20"/>
+                <w:szCs w:val="20"/>
+                <w:lang w:eastAsia="es-CL"/>
+              </w:rPr>
+            </w:pPr>
+            <w:r>
+              <w:rPr>
+                <w:rFonts w:ascii="Calibri" w:hAnsi="Calibri" w:cs="Calibri"/>
+                <w:color w:val="3B3838"/>
+                <w:sz w:val="18"/>
+                <w:szCs w:val="18"/>
               </w:rPr>
               <w:t>En curso</w:t>
             </w:r>
@@ -3113,46 +3053,246 @@
         </w:tc>
         <w:tc>
           <w:tcPr>
-            <w:tcW w:w="1417" w:type="dxa"/>
-          </w:tcPr>
-          <w:p>
-            <w:pPr>
-              <w:jc w:val="both"/>
-              <w:rPr>
-                <w:rFonts w:ascii="Calibri" w:hAnsi="Calibri" w:cs="Arial"/>
-                <w:iCs/>
-                <w:color w:val="3B3838" w:themeColor="background2" w:themeShade="40"/>
-                <w:sz w:val="18"/>
-                <w:szCs w:val="20"/>
-                <w:lang w:eastAsia="es-CL"/>
-              </w:rPr>
-            </w:pPr>
-            <w:r>
-              <w:rPr>
-                <w:rFonts w:ascii="Calibri" w:hAnsi="Calibri" w:cs="Arial"/>
-                <w:iCs/>
-                <w:color w:val="3B3838" w:themeColor="background2" w:themeShade="40"/>
-                <w:sz w:val="18"/>
-                <w:szCs w:val="20"/>
-                <w:lang w:eastAsia="es-CL"/>
-              </w:rPr>
-              <w:t>Se han realizado ajustes menores en la priorización de tareas</w:t>
+            <w:tcW w:w="1800" w:type="dxa"/>
+          </w:tcPr>
+          <w:p>
+            <w:pPr>
+              <w:spacing w:after="100"/>
+              <w:rPr>
+                <w:rFonts w:ascii="Calibri" w:hAnsi="Calibri" w:cs="Arial"/>
+                <w:color w:val="3B3838" w:themeColor="background2" w:themeShade="40"/>
+                <w:sz w:val="20"/>
+                <w:szCs w:val="20"/>
+                <w:lang w:eastAsia="es-CL"/>
+              </w:rPr>
+            </w:pPr>
+            <w:r>
+              <w:rPr>
+                <w:rFonts w:ascii="Calibri" w:hAnsi="Calibri" w:cs="Calibri"/>
+                <w:color w:val="3B3838"/>
+                <w:sz w:val="18"/>
+                <w:szCs w:val="18"/>
+              </w:rPr>
+              <w:t>Los cambios de alcance se explican en la sección 3. La especificación de requerimientos todavía llega hasta el RF-20.</w:t>
+            </w:r>
+          </w:p>
+        </w:tc>
+      </w:tr>
+      <w:tr>
+        <w:trPr>
+          <w:trHeight w:val="1248"/>
+        </w:trPr>
+        <w:tc>
+          <w:tcPr>
+            <w:tcW w:w="1300" w:type="dxa"/>
+          </w:tcPr>
+          <w:p>
+            <w:pPr>
+              <w:spacing w:after="100"/>
+              <w:rPr>
+                <w:rFonts w:ascii="Calibri" w:hAnsi="Calibri" w:cs="Arial"/>
+                <w:color w:val="3B3838" w:themeColor="background2" w:themeShade="40"/>
+                <w:sz w:val="20"/>
+                <w:szCs w:val="20"/>
+                <w:lang w:eastAsia="es-CL"/>
+              </w:rPr>
+            </w:pPr>
+            <w:r>
+              <w:rPr>
+                <w:rFonts w:ascii="Calibri" w:hAnsi="Calibri" w:cs="Calibri"/>
+                <w:color w:val="3B3838"/>
+                <w:sz w:val="18"/>
+                <w:szCs w:val="18"/>
+              </w:rPr>
+              <w:lastRenderedPageBreak/>
+              <w:t>C2: Gestionar el proyecto mediante metodología ágil</w:t>
+            </w:r>
+          </w:p>
+        </w:tc>
+        <w:tc>
+          <w:tcPr>
+            <w:tcW w:w="1250" w:type="dxa"/>
+          </w:tcPr>
+          <w:p>
+            <w:pPr>
+              <w:spacing w:after="100"/>
+              <w:rPr>
+                <w:rFonts w:ascii="Calibri" w:hAnsi="Calibri" w:cs="Arial"/>
+                <w:color w:val="3B3838" w:themeColor="background2" w:themeShade="40"/>
+                <w:sz w:val="20"/>
+                <w:szCs w:val="20"/>
+                <w:lang w:eastAsia="es-CL"/>
+              </w:rPr>
+            </w:pPr>
+            <w:r>
+              <w:rPr>
+                <w:rFonts w:ascii="Calibri" w:hAnsi="Calibri" w:cs="Calibri"/>
+                <w:color w:val="3B3838"/>
+                <w:sz w:val="18"/>
+                <w:szCs w:val="18"/>
+              </w:rPr>
+              <w:t>Decidir el escenario de datos de venta</w:t>
+            </w:r>
+          </w:p>
+        </w:tc>
+        <w:tc>
+          <w:tcPr>
+            <w:tcW w:w="1100" w:type="dxa"/>
+          </w:tcPr>
+          <w:p>
+            <w:pPr>
+              <w:spacing w:after="100"/>
+              <w:rPr>
+                <w:rFonts w:ascii="Calibri" w:hAnsi="Calibri" w:cs="Arial"/>
+                <w:color w:val="3B3838" w:themeColor="background2" w:themeShade="40"/>
+                <w:sz w:val="20"/>
+                <w:szCs w:val="20"/>
+                <w:lang w:eastAsia="es-CL"/>
+              </w:rPr>
+            </w:pPr>
+            <w:r>
+              <w:rPr>
+                <w:rFonts w:ascii="Calibri" w:hAnsi="Calibri" w:cs="Calibri"/>
+                <w:color w:val="3B3838"/>
+                <w:sz w:val="18"/>
+                <w:szCs w:val="18"/>
+              </w:rPr>
+              <w:t>Documento de alcance, datos simulados</w:t>
+            </w:r>
+          </w:p>
+        </w:tc>
+        <w:tc>
+          <w:tcPr>
+            <w:tcW w:w="950" w:type="dxa"/>
+          </w:tcPr>
+          <w:p>
+            <w:pPr>
+              <w:spacing w:after="100"/>
+              <w:rPr>
+                <w:rFonts w:ascii="Calibri" w:hAnsi="Calibri" w:cs="Arial"/>
+                <w:color w:val="3B3838" w:themeColor="background2" w:themeShade="40"/>
+                <w:sz w:val="20"/>
+                <w:szCs w:val="20"/>
+                <w:lang w:eastAsia="es-CL"/>
+              </w:rPr>
+            </w:pPr>
+            <w:r>
+              <w:rPr>
+                <w:rFonts w:ascii="Calibri" w:hAnsi="Calibri" w:cs="Calibri"/>
+                <w:color w:val="3B3838"/>
+                <w:sz w:val="18"/>
+                <w:szCs w:val="18"/>
+              </w:rPr>
+              <w:t>Hasta la semana 6</w:t>
+            </w:r>
+          </w:p>
+        </w:tc>
+        <w:tc>
+          <w:tcPr>
+            <w:tcW w:w="900" w:type="dxa"/>
+          </w:tcPr>
+          <w:p>
+            <w:pPr>
+              <w:spacing w:after="100"/>
+              <w:rPr>
+                <w:rFonts w:ascii="Calibri" w:hAnsi="Calibri" w:cs="Arial"/>
+                <w:color w:val="3B3838" w:themeColor="background2" w:themeShade="40"/>
+                <w:sz w:val="20"/>
+                <w:szCs w:val="20"/>
+                <w:lang w:eastAsia="es-CL"/>
+              </w:rPr>
+            </w:pPr>
+            <w:r>
+              <w:rPr>
+                <w:rFonts w:ascii="Calibri" w:hAnsi="Calibri" w:cs="Calibri"/>
+                <w:color w:val="3B3838"/>
+                <w:sz w:val="18"/>
+                <w:szCs w:val="18"/>
+              </w:rPr>
+              <w:t>Isabella y Diego</w:t>
+            </w:r>
+          </w:p>
+        </w:tc>
+        <w:tc>
+          <w:tcPr>
+            <w:tcW w:w="1650" w:type="dxa"/>
+          </w:tcPr>
+          <w:p>
+            <w:pPr>
+              <w:spacing w:after="100"/>
+              <w:rPr>
+                <w:rFonts w:ascii="Calibri" w:hAnsi="Calibri" w:cs="Arial"/>
+                <w:color w:val="3B3838" w:themeColor="background2" w:themeShade="40"/>
+                <w:sz w:val="20"/>
+                <w:szCs w:val="20"/>
+                <w:lang w:eastAsia="es-CL"/>
+              </w:rPr>
+            </w:pPr>
+            <w:r>
+              <w:rPr>
+                <w:rFonts w:ascii="Calibri" w:hAnsi="Calibri" w:cs="Calibri"/>
+                <w:color w:val="3B3838"/>
+                <w:sz w:val="18"/>
+                <w:szCs w:val="18"/>
+              </w:rPr>
+              <w:t>Campomar es dueña de los datos de caja y no hay acceso a ellos.</w:t>
+            </w:r>
+          </w:p>
+        </w:tc>
+        <w:tc>
+          <w:tcPr>
+            <w:tcW w:w="826" w:type="dxa"/>
+          </w:tcPr>
+          <w:p>
+            <w:pPr>
+              <w:spacing w:after="100"/>
+              <w:rPr>
+                <w:rFonts w:ascii="Calibri" w:hAnsi="Calibri" w:cs="Arial"/>
+                <w:color w:val="3B3838" w:themeColor="background2" w:themeShade="40"/>
+                <w:sz w:val="20"/>
+                <w:szCs w:val="20"/>
+                <w:lang w:eastAsia="es-CL"/>
+              </w:rPr>
+            </w:pPr>
+            <w:r>
+              <w:rPr>
+                <w:rFonts w:ascii="Calibri" w:hAnsi="Calibri" w:cs="Calibri"/>
+                <w:color w:val="3B3838"/>
+                <w:sz w:val="18"/>
+                <w:szCs w:val="18"/>
+              </w:rPr>
+              <w:t>Completado</w:t>
+            </w:r>
+          </w:p>
+        </w:tc>
+        <w:tc>
+          <w:tcPr>
+            <w:tcW w:w="1800" w:type="dxa"/>
+          </w:tcPr>
+          <w:p>
+            <w:pPr>
+              <w:spacing w:after="100"/>
+              <w:rPr>
+                <w:rFonts w:ascii="Calibri" w:hAnsi="Calibri" w:cs="Arial"/>
+                <w:color w:val="3B3838" w:themeColor="background2" w:themeShade="40"/>
+                <w:sz w:val="20"/>
+                <w:szCs w:val="20"/>
+                <w:lang w:eastAsia="es-CL"/>
+              </w:rPr>
+            </w:pPr>
+            <w:r>
+              <w:rPr>
+                <w:rFonts w:ascii="Calibri" w:hAnsi="Calibri" w:cs="Calibri"/>
+                <w:color w:val="3B3838"/>
+                <w:sz w:val="18"/>
+                <w:szCs w:val="18"/>
+              </w:rPr>
+              <w:t>El escenario C (datos simulados) quedó como base. La caja propia registra ventas dentro del sistema.</w:t>
             </w:r>
           </w:p>
         </w:tc>
       </w:tr>
     </w:tbl>
-    <w:p>
-      <w:pPr>
-        <w:spacing w:after="0" w:line="240" w:lineRule="auto"/>
-        <w:rPr>
-          <w:rFonts w:cs="Calibri Light"/>
-          <w:color w:val="595959" w:themeColor="text1" w:themeTint="A6"/>
-          <w:sz w:val="24"/>
-          <w:szCs w:val="24"/>
-        </w:rPr>
-      </w:pPr>
-    </w:p>
     <w:p>
       <w:pPr>
         <w:rPr>
@@ -3420,27 +3560,49 @@
                 <w:szCs w:val="20"/>
                 <w:lang w:eastAsia="es-CL"/>
               </w:rPr>
-              <w:t>Uno de los principales factores que ha facilitado el desarrollo del proyecto ha sido el levantamiento de información realizado durante la Fase 1, ya que permitió contar con una definición más clara del problema, los usuarios y los requerimientos antes de comenzar la implementación.</w:t>
-            </w:r>
-            <w:r>
-              <w:rPr>
-                <w:rFonts w:ascii="Calibri" w:hAnsi="Calibri" w:cs="Arial"/>
-                <w:color w:val="3B3838" w:themeColor="background2" w:themeShade="40"/>
-                <w:sz w:val="20"/>
-                <w:szCs w:val="20"/>
-                <w:lang w:eastAsia="es-CL"/>
-              </w:rPr>
-              <w:t xml:space="preserve"> T</w:t>
-            </w:r>
-            <w:r>
-              <w:rPr>
-                <w:rFonts w:ascii="Calibri" w:hAnsi="Calibri" w:cs="Arial"/>
-                <w:color w:val="3B3838" w:themeColor="background2" w:themeShade="40"/>
-                <w:sz w:val="20"/>
-                <w:szCs w:val="20"/>
-                <w:lang w:eastAsia="es-CL"/>
-              </w:rPr>
-              <w:t xml:space="preserve">ambién ha facilitado el trabajo mantener una metodología ágil y dividir el desarrollo en </w:t>
+              <w:t xml:space="preserve">Lo que más ayudó fue el levantamiento de la Fase 1. </w:t>
+            </w:r>
+          </w:p>
+          <w:p>
+            <w:pPr>
+              <w:jc w:val="both"/>
+              <w:rPr>
+                <w:rFonts w:ascii="Calibri" w:hAnsi="Calibri" w:cs="Arial"/>
+                <w:color w:val="3B3838" w:themeColor="background2" w:themeShade="40"/>
+                <w:sz w:val="20"/>
+                <w:szCs w:val="20"/>
+                <w:lang w:eastAsia="es-CL"/>
+              </w:rPr>
+            </w:pPr>
+            <w:r>
+              <w:rPr>
+                <w:rFonts w:ascii="Calibri" w:hAnsi="Calibri" w:cs="Arial"/>
+                <w:color w:val="3B3838" w:themeColor="background2" w:themeShade="40"/>
+                <w:sz w:val="20"/>
+                <w:szCs w:val="20"/>
+                <w:lang w:eastAsia="es-CL"/>
+              </w:rPr>
+              <w:t>Nos dejó un problema concreto antes de escribir código: la planificación del menú cambia durante el día y los estudiantes no la ven</w:t>
+            </w:r>
+            <w:r>
+              <w:rPr>
+                <w:rFonts w:ascii="Calibri" w:hAnsi="Calibri" w:cs="Arial"/>
+                <w:color w:val="3B3838" w:themeColor="background2" w:themeShade="40"/>
+                <w:sz w:val="20"/>
+                <w:szCs w:val="20"/>
+                <w:lang w:eastAsia="es-CL"/>
+              </w:rPr>
+              <w:t>, d</w:t>
+            </w:r>
+            <w:r>
+              <w:rPr>
+                <w:rFonts w:ascii="Calibri" w:hAnsi="Calibri" w:cs="Arial"/>
+                <w:color w:val="3B3838" w:themeColor="background2" w:themeShade="40"/>
+                <w:sz w:val="20"/>
+                <w:szCs w:val="20"/>
+                <w:lang w:eastAsia="es-CL"/>
+              </w:rPr>
+              <w:t xml:space="preserve">e ahí salió la decisión de separar en la base de datos lo planificado de lo que ocurre en la jornada. También ayudó usar una pila que ya conocíamos (Node.js, Express, PostgreSQL y </w:t>
             </w:r>
             <w:proofErr w:type="spellStart"/>
             <w:r>
@@ -3451,6 +3613,112 @@
                 <w:szCs w:val="20"/>
                 <w:lang w:eastAsia="es-CL"/>
               </w:rPr>
+              <w:t>React</w:t>
+            </w:r>
+            <w:proofErr w:type="spellEnd"/>
+            <w:r>
+              <w:rPr>
+                <w:rFonts w:ascii="Calibri" w:hAnsi="Calibri" w:cs="Arial"/>
+                <w:color w:val="3B3838" w:themeColor="background2" w:themeShade="40"/>
+                <w:sz w:val="20"/>
+                <w:szCs w:val="20"/>
+                <w:lang w:eastAsia="es-CL"/>
+              </w:rPr>
+              <w:t>) y escribir las pruebas unitarias sobre funciones puras, el cálculo nutricional y la predicción, porque se ejecutan sin base de datos.</w:t>
+            </w:r>
+          </w:p>
+          <w:p>
+            <w:pPr>
+              <w:jc w:val="both"/>
+              <w:rPr>
+                <w:rFonts w:ascii="Calibri" w:hAnsi="Calibri" w:cs="Arial"/>
+                <w:color w:val="3B3838" w:themeColor="background2" w:themeShade="40"/>
+                <w:sz w:val="20"/>
+                <w:szCs w:val="20"/>
+                <w:lang w:eastAsia="es-CL"/>
+              </w:rPr>
+            </w:pPr>
+            <w:r>
+              <w:rPr>
+                <w:rFonts w:ascii="Calibri" w:hAnsi="Calibri" w:cs="Arial"/>
+                <w:color w:val="3B3838" w:themeColor="background2" w:themeShade="40"/>
+                <w:sz w:val="20"/>
+                <w:szCs w:val="20"/>
+                <w:lang w:eastAsia="es-CL"/>
+              </w:rPr>
+              <w:t>La dificultad mayor fue externa</w:t>
+            </w:r>
+            <w:r>
+              <w:rPr>
+                <w:rFonts w:ascii="Calibri" w:hAnsi="Calibri" w:cs="Arial"/>
+                <w:color w:val="3B3838" w:themeColor="background2" w:themeShade="40"/>
+                <w:sz w:val="20"/>
+                <w:szCs w:val="20"/>
+                <w:lang w:eastAsia="es-CL"/>
+              </w:rPr>
+              <w:t>, el</w:t>
+            </w:r>
+            <w:r>
+              <w:rPr>
+                <w:rFonts w:ascii="Calibri" w:hAnsi="Calibri" w:cs="Arial"/>
+                <w:color w:val="3B3838" w:themeColor="background2" w:themeShade="40"/>
+                <w:sz w:val="20"/>
+                <w:szCs w:val="20"/>
+                <w:lang w:eastAsia="es-CL"/>
+              </w:rPr>
+              <w:t xml:space="preserve"> casino lo opera Campomar, que es dueña del sistema de caja y de los datos de venta, y no tenemos un canal directo con ella. Sin esos datos, el análisis que sugirió la docente no podía apoyarse en consumo real</w:t>
+            </w:r>
+            <w:r>
+              <w:rPr>
+                <w:rFonts w:ascii="Calibri" w:hAnsi="Calibri" w:cs="Arial"/>
+                <w:color w:val="3B3838" w:themeColor="background2" w:themeShade="40"/>
+                <w:sz w:val="20"/>
+                <w:szCs w:val="20"/>
+                <w:lang w:eastAsia="es-CL"/>
+              </w:rPr>
+              <w:t>, así que r</w:t>
+            </w:r>
+            <w:r>
+              <w:rPr>
+                <w:rFonts w:ascii="Calibri" w:hAnsi="Calibri" w:cs="Arial"/>
+                <w:color w:val="3B3838" w:themeColor="background2" w:themeShade="40"/>
+                <w:sz w:val="20"/>
+                <w:szCs w:val="20"/>
+                <w:lang w:eastAsia="es-CL"/>
+              </w:rPr>
+              <w:t xml:space="preserve">espondimos con dos decisiones: usar datos simulados como base, marcados en pantalla, y construir una pantalla de caja propia para que el sistema genere sus propios registros de venta. </w:t>
+            </w:r>
+          </w:p>
+          <w:p>
+            <w:pPr>
+              <w:jc w:val="both"/>
+              <w:rPr>
+                <w:rFonts w:ascii="Calibri" w:hAnsi="Calibri" w:cs="Arial"/>
+                <w:color w:val="3B3838" w:themeColor="background2" w:themeShade="40"/>
+                <w:sz w:val="20"/>
+                <w:szCs w:val="20"/>
+                <w:lang w:eastAsia="es-CL"/>
+              </w:rPr>
+            </w:pPr>
+            <w:r>
+              <w:rPr>
+                <w:rFonts w:ascii="Calibri" w:hAnsi="Calibri" w:cs="Arial"/>
+                <w:color w:val="3B3838" w:themeColor="background2" w:themeShade="40"/>
+                <w:sz w:val="20"/>
+                <w:szCs w:val="20"/>
+                <w:lang w:eastAsia="es-CL"/>
+              </w:rPr>
+              <w:t xml:space="preserve">La segunda decisión amplió bastante el alcance (jornada, stock, anulación de ventas y predicción) y ocupó los </w:t>
+            </w:r>
+            <w:proofErr w:type="spellStart"/>
+            <w:r>
+              <w:rPr>
+                <w:rFonts w:ascii="Calibri" w:hAnsi="Calibri" w:cs="Arial"/>
+                <w:color w:val="3B3838" w:themeColor="background2" w:themeShade="40"/>
+                <w:sz w:val="20"/>
+                <w:szCs w:val="20"/>
+                <w:lang w:eastAsia="es-CL"/>
+              </w:rPr>
               <w:t>sprints</w:t>
             </w:r>
             <w:proofErr w:type="spellEnd"/>
@@ -3462,7 +3730,91 @@
                 <w:szCs w:val="20"/>
                 <w:lang w:eastAsia="es-CL"/>
               </w:rPr>
-              <w:t>, ya que permite avanzar de manera incremental y revisar las funcionalidades antes de continuar con las siguientes.</w:t>
+              <w:t xml:space="preserve"> 6 a 8.</w:t>
+            </w:r>
+          </w:p>
+          <w:p>
+            <w:pPr>
+              <w:jc w:val="both"/>
+              <w:rPr>
+                <w:rFonts w:ascii="Calibri" w:hAnsi="Calibri" w:cs="Arial"/>
+                <w:color w:val="3B3838" w:themeColor="background2" w:themeShade="40"/>
+                <w:sz w:val="20"/>
+                <w:szCs w:val="20"/>
+                <w:lang w:eastAsia="es-CL"/>
+              </w:rPr>
+            </w:pPr>
+            <w:r>
+              <w:rPr>
+                <w:rFonts w:ascii="Calibri" w:hAnsi="Calibri" w:cs="Arial"/>
+                <w:color w:val="3B3838" w:themeColor="background2" w:themeShade="40"/>
+                <w:sz w:val="20"/>
+                <w:szCs w:val="20"/>
+                <w:lang w:eastAsia="es-CL"/>
+              </w:rPr>
+              <w:t>La información nutricional fue la otra dificultad</w:t>
+            </w:r>
+            <w:r>
+              <w:rPr>
+                <w:rFonts w:ascii="Calibri" w:hAnsi="Calibri" w:cs="Arial"/>
+                <w:color w:val="3B3838" w:themeColor="background2" w:themeShade="40"/>
+                <w:sz w:val="20"/>
+                <w:szCs w:val="20"/>
+                <w:lang w:eastAsia="es-CL"/>
+              </w:rPr>
+              <w:t>, l</w:t>
+            </w:r>
+            <w:r>
+              <w:rPr>
+                <w:rFonts w:ascii="Calibri" w:hAnsi="Calibri" w:cs="Arial"/>
+                <w:color w:val="3B3838" w:themeColor="background2" w:themeShade="40"/>
+                <w:sz w:val="20"/>
+                <w:szCs w:val="20"/>
+                <w:lang w:eastAsia="es-CL"/>
+              </w:rPr>
+              <w:t>a nutricionista confirmó que no existe documentada por preparación, así que en vez de pedirla plato por plato, el sistema la calcula desde los gramos de cada ingrediente.</w:t>
+            </w:r>
+          </w:p>
+          <w:p>
+            <w:pPr>
+              <w:jc w:val="both"/>
+              <w:rPr>
+                <w:rFonts w:ascii="Calibri" w:hAnsi="Calibri" w:cs="Arial"/>
+                <w:color w:val="3B3838" w:themeColor="background2" w:themeShade="40"/>
+                <w:sz w:val="20"/>
+                <w:szCs w:val="20"/>
+                <w:lang w:eastAsia="es-CL"/>
+              </w:rPr>
+            </w:pPr>
+            <w:r>
+              <w:rPr>
+                <w:rFonts w:ascii="Calibri" w:hAnsi="Calibri" w:cs="Arial"/>
+                <w:color w:val="3B3838" w:themeColor="background2" w:themeShade="40"/>
+                <w:sz w:val="20"/>
+                <w:szCs w:val="20"/>
+                <w:lang w:eastAsia="es-CL"/>
+              </w:rPr>
+              <w:t xml:space="preserve"> Los valores por 100 g que cargamos son de referencia (tabla de tipo USDA) y no provienen del casino</w:t>
+            </w:r>
+            <w:r>
+              <w:rPr>
+                <w:rFonts w:ascii="Calibri" w:hAnsi="Calibri" w:cs="Arial"/>
+                <w:color w:val="3B3838" w:themeColor="background2" w:themeShade="40"/>
+                <w:sz w:val="20"/>
+                <w:szCs w:val="20"/>
+                <w:lang w:eastAsia="es-CL"/>
+              </w:rPr>
+              <w:t>, h</w:t>
+            </w:r>
+            <w:r>
+              <w:rPr>
+                <w:rFonts w:ascii="Calibri" w:hAnsi="Calibri" w:cs="Arial"/>
+                <w:color w:val="3B3838" w:themeColor="background2" w:themeShade="40"/>
+                <w:sz w:val="20"/>
+                <w:szCs w:val="20"/>
+                <w:lang w:eastAsia="es-CL"/>
+              </w:rPr>
+              <w:t>asta que la nutricionista los reemplace por su propia fuente, lo que se publica es una estimación.</w:t>
             </w:r>
           </w:p>
         </w:tc>
@@ -3499,7 +3851,7 @@
       </w:tblGrid>
       <w:tr>
         <w:trPr>
-          <w:trHeight w:val="1936"/>
+          <w:trHeight w:val="841"/>
         </w:trPr>
         <w:tc>
           <w:tcPr>
@@ -3509,36 +3861,222 @@
           <w:p>
             <w:pPr>
               <w:jc w:val="both"/>
-              <w:rPr>
-                <w:rFonts w:ascii="Calibri" w:hAnsi="Calibri" w:cs="Arial"/>
-                <w:iCs/>
-                <w:color w:val="3B3838" w:themeColor="background2" w:themeShade="40"/>
-                <w:sz w:val="20"/>
-                <w:szCs w:val="20"/>
-                <w:lang w:eastAsia="es-CL"/>
-              </w:rPr>
             </w:pPr>
             <w:r>
               <w:rPr>
                 <w:rFonts w:ascii="Calibri" w:hAnsi="Calibri"/>
                 <w:color w:val="1F3864" w:themeColor="accent1" w:themeShade="80"/>
               </w:rPr>
-              <w:lastRenderedPageBreak/>
               <w:t xml:space="preserve">Actividades ajustadas o eliminadas: </w:t>
             </w:r>
             <w:r>
               <w:t xml:space="preserve"> </w:t>
             </w:r>
-            <w:r>
-              <w:rPr>
-                <w:rFonts w:ascii="Calibri" w:hAnsi="Calibri" w:cs="Arial"/>
-                <w:iCs/>
-                <w:color w:val="3B3838" w:themeColor="background2" w:themeShade="40"/>
-                <w:sz w:val="20"/>
-                <w:szCs w:val="20"/>
-                <w:lang w:eastAsia="es-CL"/>
-              </w:rPr>
-              <w:t>El principal ajuste corresponde al análisis e integración de datos de venta. Durante la Fase 1 se consideró la posibilidad de utilizar información de ventas para realizar análisis de consumo y apoyar la toma de decisiones del casino.</w:t>
+          </w:p>
+          <w:p>
+            <w:pPr>
+              <w:jc w:val="both"/>
+              <w:rPr>
+                <w:rFonts w:ascii="Calibri" w:hAnsi="Calibri" w:cs="Arial"/>
+                <w:iCs/>
+                <w:color w:val="3B3838" w:themeColor="background2" w:themeShade="40"/>
+                <w:sz w:val="20"/>
+                <w:szCs w:val="20"/>
+                <w:lang w:eastAsia="es-CL"/>
+              </w:rPr>
+            </w:pPr>
+            <w:r>
+              <w:rPr>
+                <w:rFonts w:ascii="Calibri" w:hAnsi="Calibri" w:cs="Arial"/>
+                <w:iCs/>
+                <w:color w:val="3B3838" w:themeColor="background2" w:themeShade="40"/>
+                <w:sz w:val="20"/>
+                <w:szCs w:val="20"/>
+                <w:lang w:eastAsia="es-CL"/>
+              </w:rPr>
+              <w:t>Datos de venta</w:t>
+            </w:r>
+            <w:r>
+              <w:rPr>
+                <w:rFonts w:ascii="Calibri" w:hAnsi="Calibri" w:cs="Arial"/>
+                <w:iCs/>
+                <w:color w:val="3B3838" w:themeColor="background2" w:themeShade="40"/>
+                <w:sz w:val="20"/>
+                <w:szCs w:val="20"/>
+                <w:lang w:eastAsia="es-CL"/>
+              </w:rPr>
+              <w:t xml:space="preserve">: </w:t>
+            </w:r>
+            <w:r>
+              <w:rPr>
+                <w:rFonts w:ascii="Calibri" w:hAnsi="Calibri" w:cs="Arial"/>
+                <w:iCs/>
+                <w:color w:val="3B3838" w:themeColor="background2" w:themeShade="40"/>
+                <w:sz w:val="20"/>
+                <w:szCs w:val="20"/>
+                <w:lang w:eastAsia="es-CL"/>
+              </w:rPr>
+              <w:t>La integración con la caja de Campomar (escenarios A y B) dejó de ser parte del MVP y queda como ampliación. El análisis usa el escenario C y las ventas de la caja propia.</w:t>
+            </w:r>
+          </w:p>
+          <w:p>
+            <w:pPr>
+              <w:jc w:val="both"/>
+              <w:rPr>
+                <w:rFonts w:ascii="Calibri" w:hAnsi="Calibri" w:cs="Arial"/>
+                <w:iCs/>
+                <w:color w:val="3B3838" w:themeColor="background2" w:themeShade="40"/>
+                <w:sz w:val="20"/>
+                <w:szCs w:val="20"/>
+                <w:lang w:eastAsia="es-CL"/>
+              </w:rPr>
+            </w:pPr>
+            <w:r>
+              <w:rPr>
+                <w:rFonts w:ascii="Calibri" w:hAnsi="Calibri" w:cs="Arial"/>
+                <w:iCs/>
+                <w:color w:val="3B3838" w:themeColor="background2" w:themeShade="40"/>
+                <w:sz w:val="20"/>
+                <w:szCs w:val="20"/>
+                <w:lang w:eastAsia="es-CL"/>
+              </w:rPr>
+              <w:t>Validación nutricional</w:t>
+            </w:r>
+            <w:r>
+              <w:rPr>
+                <w:rFonts w:ascii="Calibri" w:hAnsi="Calibri" w:cs="Arial"/>
+                <w:iCs/>
+                <w:color w:val="3B3838" w:themeColor="background2" w:themeShade="40"/>
+                <w:sz w:val="20"/>
+                <w:szCs w:val="20"/>
+                <w:lang w:eastAsia="es-CL"/>
+              </w:rPr>
+              <w:t>:</w:t>
+            </w:r>
+            <w:r>
+              <w:rPr>
+                <w:rFonts w:ascii="Calibri" w:hAnsi="Calibri" w:cs="Arial"/>
+                <w:iCs/>
+                <w:color w:val="3B3838" w:themeColor="background2" w:themeShade="40"/>
+                <w:sz w:val="20"/>
+                <w:szCs w:val="20"/>
+                <w:lang w:eastAsia="es-CL"/>
+              </w:rPr>
+              <w:t xml:space="preserve"> En la Fase 1, la información nutricional debía marcarse como validada antes de publicarse (RF-13). En el Sprint 7 lo simplificamos: lo que guarda la nutricionista o el administrador se publica directo, y sin calorías se muestra "No disponible". También quitamos de los ingredientes los campos de fuente y de dato de ejemplo. Este cambio modifica el RF-13 y hay que registrarlo en el control de cambios.</w:t>
+            </w:r>
+          </w:p>
+          <w:p>
+            <w:pPr>
+              <w:jc w:val="both"/>
+              <w:rPr>
+                <w:rFonts w:ascii="Calibri" w:hAnsi="Calibri" w:cs="Arial"/>
+                <w:iCs/>
+                <w:color w:val="3B3838" w:themeColor="background2" w:themeShade="40"/>
+                <w:sz w:val="20"/>
+                <w:szCs w:val="20"/>
+                <w:lang w:eastAsia="es-CL"/>
+              </w:rPr>
+            </w:pPr>
+            <w:r>
+              <w:rPr>
+                <w:rFonts w:ascii="Calibri" w:hAnsi="Calibri" w:cs="Arial"/>
+                <w:iCs/>
+                <w:color w:val="3B3838" w:themeColor="background2" w:themeShade="40"/>
+                <w:sz w:val="20"/>
+                <w:szCs w:val="20"/>
+                <w:lang w:eastAsia="es-CL"/>
+              </w:rPr>
+              <w:t>Cuenta del estudiante</w:t>
+            </w:r>
+            <w:r>
+              <w:rPr>
+                <w:rFonts w:ascii="Calibri" w:hAnsi="Calibri" w:cs="Arial"/>
+                <w:iCs/>
+                <w:color w:val="3B3838" w:themeColor="background2" w:themeShade="40"/>
+                <w:sz w:val="20"/>
+                <w:szCs w:val="20"/>
+                <w:lang w:eastAsia="es-CL"/>
+              </w:rPr>
+              <w:t>:</w:t>
+            </w:r>
+            <w:r>
+              <w:rPr>
+                <w:rFonts w:ascii="Calibri" w:hAnsi="Calibri" w:cs="Arial"/>
+                <w:iCs/>
+                <w:color w:val="3B3838" w:themeColor="background2" w:themeShade="40"/>
+                <w:sz w:val="20"/>
+                <w:szCs w:val="20"/>
+                <w:lang w:eastAsia="es-CL"/>
+              </w:rPr>
+              <w:t xml:space="preserve"> Las preferencias, calificaciones y notificaciones (RF-18 a RF-20) estaban condicionadas a la cuenta institucional de DUOC</w:t>
+            </w:r>
+            <w:r>
+              <w:rPr>
+                <w:rFonts w:ascii="Calibri" w:hAnsi="Calibri" w:cs="Arial"/>
+                <w:iCs/>
+                <w:color w:val="3B3838" w:themeColor="background2" w:themeShade="40"/>
+                <w:sz w:val="20"/>
+                <w:szCs w:val="20"/>
+                <w:lang w:eastAsia="es-CL"/>
+              </w:rPr>
+              <w:t>, l</w:t>
+            </w:r>
+            <w:r>
+              <w:rPr>
+                <w:rFonts w:ascii="Calibri" w:hAnsi="Calibri" w:cs="Arial"/>
+                <w:iCs/>
+                <w:color w:val="3B3838" w:themeColor="background2" w:themeShade="40"/>
+                <w:sz w:val="20"/>
+                <w:szCs w:val="20"/>
+                <w:lang w:eastAsia="es-CL"/>
+              </w:rPr>
+              <w:t xml:space="preserve">as implementamos con un ingreso simulado que solo acepta correos @duocuc.cl y nunca entra a cuentas del personal. </w:t>
+            </w:r>
+          </w:p>
+          <w:p>
+            <w:pPr>
+              <w:jc w:val="both"/>
+              <w:rPr>
+                <w:rFonts w:ascii="Calibri" w:hAnsi="Calibri" w:cs="Arial"/>
+                <w:iCs/>
+                <w:color w:val="3B3838" w:themeColor="background2" w:themeShade="40"/>
+                <w:sz w:val="20"/>
+                <w:szCs w:val="20"/>
+                <w:lang w:eastAsia="es-CL"/>
+              </w:rPr>
+            </w:pPr>
+            <w:r>
+              <w:rPr>
+                <w:rFonts w:ascii="Calibri" w:hAnsi="Calibri" w:cs="Arial"/>
+                <w:iCs/>
+                <w:color w:val="3B3838" w:themeColor="background2" w:themeShade="40"/>
+                <w:sz w:val="20"/>
+                <w:szCs w:val="20"/>
+                <w:lang w:eastAsia="es-CL"/>
+              </w:rPr>
+              <w:t>Roles y pruebas</w:t>
+            </w:r>
+            <w:r>
+              <w:rPr>
+                <w:rFonts w:ascii="Calibri" w:hAnsi="Calibri" w:cs="Arial"/>
+                <w:iCs/>
+                <w:color w:val="3B3838" w:themeColor="background2" w:themeShade="40"/>
+                <w:sz w:val="20"/>
+                <w:szCs w:val="20"/>
+                <w:lang w:eastAsia="es-CL"/>
+              </w:rPr>
+              <w:t xml:space="preserve">: </w:t>
+            </w:r>
+            <w:r>
+              <w:rPr>
+                <w:rFonts w:ascii="Calibri" w:hAnsi="Calibri" w:cs="Arial"/>
+                <w:iCs/>
+                <w:color w:val="3B3838" w:themeColor="background2" w:themeShade="40"/>
+                <w:sz w:val="20"/>
+                <w:szCs w:val="20"/>
+                <w:lang w:eastAsia="es-CL"/>
+              </w:rPr>
+              <w:t>Agregamos los roles Cajero y Nutricionista (RF-28)</w:t>
             </w:r>
             <w:r>
               <w:rPr>
@@ -3550,17 +4088,6 @@
                 <w:lang w:eastAsia="es-CL"/>
               </w:rPr>
               <w:t xml:space="preserve"> </w:t>
-            </w:r>
-            <w:r>
-              <w:rPr>
-                <w:rFonts w:ascii="Calibri" w:hAnsi="Calibri" w:cs="Arial"/>
-                <w:iCs/>
-                <w:color w:val="3B3838" w:themeColor="background2" w:themeShade="40"/>
-                <w:sz w:val="20"/>
-                <w:szCs w:val="20"/>
-                <w:lang w:eastAsia="es-CL"/>
-              </w:rPr>
-              <w:t>Sin embargo, durante el desarrollo hemos mantenido esta funcionalidad como una posibilidad futura, debido a que su implementación dependería de la disponibilidad de los datos, autorizaciones y condiciones externas al equipo. Por este motivo, no forma parte de las funcionalidades del MVP actual.</w:t>
             </w:r>
           </w:p>
           <w:p>
@@ -3584,7 +4111,56 @@
                 <w:szCs w:val="20"/>
                 <w:lang w:eastAsia="es-CL"/>
               </w:rPr>
-              <w:t>También hemos realizado ajustes menores en las actividades de desarrollo y documentación, principalmente para mantener la consistencia entre el modelo de datos, la arquitectura y las funcionalidades que efectivamente estamos implementando.</w:t>
+              <w:lastRenderedPageBreak/>
+              <w:t xml:space="preserve">Para las pruebas usamos </w:t>
+            </w:r>
+            <w:proofErr w:type="spellStart"/>
+            <w:r>
+              <w:rPr>
+                <w:rFonts w:ascii="Calibri" w:hAnsi="Calibri" w:cs="Arial"/>
+                <w:iCs/>
+                <w:color w:val="3B3838" w:themeColor="background2" w:themeShade="40"/>
+                <w:sz w:val="20"/>
+                <w:szCs w:val="20"/>
+                <w:lang w:eastAsia="es-CL"/>
+              </w:rPr>
+              <w:t>node:test</w:t>
+            </w:r>
+            <w:proofErr w:type="spellEnd"/>
+            <w:r>
+              <w:rPr>
+                <w:rFonts w:ascii="Calibri" w:hAnsi="Calibri" w:cs="Arial"/>
+                <w:iCs/>
+                <w:color w:val="3B3838" w:themeColor="background2" w:themeShade="40"/>
+                <w:sz w:val="20"/>
+                <w:szCs w:val="20"/>
+                <w:lang w:eastAsia="es-CL"/>
+              </w:rPr>
+              <w:t xml:space="preserve">, incluido en Node.js, en lugar de </w:t>
+            </w:r>
+            <w:proofErr w:type="spellStart"/>
+            <w:r>
+              <w:rPr>
+                <w:rFonts w:ascii="Calibri" w:hAnsi="Calibri" w:cs="Arial"/>
+                <w:iCs/>
+                <w:color w:val="3B3838" w:themeColor="background2" w:themeShade="40"/>
+                <w:sz w:val="20"/>
+                <w:szCs w:val="20"/>
+                <w:lang w:eastAsia="es-CL"/>
+              </w:rPr>
+              <w:t>Jest</w:t>
+            </w:r>
+            <w:proofErr w:type="spellEnd"/>
+            <w:r>
+              <w:rPr>
+                <w:rFonts w:ascii="Calibri" w:hAnsi="Calibri" w:cs="Arial"/>
+                <w:iCs/>
+                <w:color w:val="3B3838" w:themeColor="background2" w:themeShade="40"/>
+                <w:sz w:val="20"/>
+                <w:szCs w:val="20"/>
+                <w:lang w:eastAsia="es-CL"/>
+              </w:rPr>
+              <w:t>, que era lo previsto en el plan de pruebas, para no sumar dependencias.</w:t>
             </w:r>
           </w:p>
         </w:tc>
@@ -3654,7 +4230,6 @@
                 <w:color w:val="3B3838" w:themeColor="background2" w:themeShade="40"/>
                 <w:sz w:val="20"/>
                 <w:szCs w:val="20"/>
-                <w:u w:val="single"/>
                 <w:lang w:eastAsia="es-CL"/>
               </w:rPr>
             </w:pPr>
@@ -3685,7 +4260,152 @@
                 <w:szCs w:val="20"/>
                 <w:lang w:eastAsia="es-CL"/>
               </w:rPr>
-              <w:t xml:space="preserve">Actualmente no identificamos actividades críticas que se encuentren retrasadas respecto del cronograma general. </w:t>
+              <w:t>Ninguna actividad crítica va retrasada respecto del cronograma general, pero hay cuatro tareas pendientes que debemos cerrar antes del informe final.</w:t>
+            </w:r>
+          </w:p>
+          <w:p>
+            <w:pPr>
+              <w:jc w:val="both"/>
+              <w:rPr>
+                <w:rFonts w:ascii="Calibri" w:hAnsi="Calibri" w:cs="Arial"/>
+                <w:iCs/>
+                <w:color w:val="3B3838" w:themeColor="background2" w:themeShade="40"/>
+                <w:sz w:val="20"/>
+                <w:szCs w:val="20"/>
+                <w:lang w:eastAsia="es-CL"/>
+              </w:rPr>
+            </w:pPr>
+            <w:r>
+              <w:rPr>
+                <w:rFonts w:ascii="Calibri" w:hAnsi="Calibri" w:cs="Arial"/>
+                <w:iCs/>
+                <w:color w:val="3B3838" w:themeColor="background2" w:themeShade="40"/>
+                <w:sz w:val="20"/>
+                <w:szCs w:val="20"/>
+                <w:lang w:eastAsia="es-CL"/>
+              </w:rPr>
+              <w:t xml:space="preserve">Primero, actualizar el plan de pruebas y la matriz de trazabilidad, que hoy documentan solo el Sprint 1. </w:t>
+            </w:r>
+          </w:p>
+          <w:p>
+            <w:pPr>
+              <w:jc w:val="both"/>
+              <w:rPr>
+                <w:rFonts w:ascii="Calibri" w:hAnsi="Calibri" w:cs="Arial"/>
+                <w:iCs/>
+                <w:color w:val="3B3838" w:themeColor="background2" w:themeShade="40"/>
+                <w:sz w:val="20"/>
+                <w:szCs w:val="20"/>
+                <w:lang w:eastAsia="es-CL"/>
+              </w:rPr>
+            </w:pPr>
+            <w:r>
+              <w:rPr>
+                <w:rFonts w:ascii="Calibri" w:hAnsi="Calibri" w:cs="Arial"/>
+                <w:iCs/>
+                <w:color w:val="3B3838" w:themeColor="background2" w:themeShade="40"/>
+                <w:sz w:val="20"/>
+                <w:szCs w:val="20"/>
+                <w:lang w:eastAsia="es-CL"/>
+              </w:rPr>
+              <w:t xml:space="preserve">Segundo, actualizar el diagrama entidad-relación y el documento de arquitectura, que describen 16 tablas. </w:t>
+            </w:r>
+          </w:p>
+          <w:p>
+            <w:pPr>
+              <w:jc w:val="both"/>
+              <w:rPr>
+                <w:rFonts w:ascii="Calibri" w:hAnsi="Calibri" w:cs="Arial"/>
+                <w:iCs/>
+                <w:color w:val="3B3838" w:themeColor="background2" w:themeShade="40"/>
+                <w:sz w:val="20"/>
+                <w:szCs w:val="20"/>
+                <w:lang w:eastAsia="es-CL"/>
+              </w:rPr>
+            </w:pPr>
+            <w:r>
+              <w:rPr>
+                <w:rFonts w:ascii="Calibri" w:hAnsi="Calibri" w:cs="Arial"/>
+                <w:iCs/>
+                <w:color w:val="3B3838" w:themeColor="background2" w:themeShade="40"/>
+                <w:sz w:val="20"/>
+                <w:szCs w:val="20"/>
+                <w:lang w:eastAsia="es-CL"/>
+              </w:rPr>
+              <w:t xml:space="preserve">Tercero, reemplazar los valores nutricionales de referencia por la fuente de la nutricionista y probar el prototipo con ella y con la encargada del casino. </w:t>
+            </w:r>
+          </w:p>
+          <w:p>
+            <w:pPr>
+              <w:jc w:val="both"/>
+              <w:rPr>
+                <w:rFonts w:ascii="Calibri" w:hAnsi="Calibri" w:cs="Arial"/>
+                <w:iCs/>
+                <w:color w:val="3B3838" w:themeColor="background2" w:themeShade="40"/>
+                <w:sz w:val="20"/>
+                <w:szCs w:val="20"/>
+                <w:u w:val="single"/>
+                <w:lang w:eastAsia="es-CL"/>
+              </w:rPr>
+            </w:pPr>
+            <w:r>
+              <w:rPr>
+                <w:rFonts w:ascii="Calibri" w:hAnsi="Calibri" w:cs="Arial"/>
+                <w:iCs/>
+                <w:color w:val="3B3838" w:themeColor="background2" w:themeShade="40"/>
+                <w:sz w:val="20"/>
+                <w:szCs w:val="20"/>
+                <w:lang w:eastAsia="es-CL"/>
+              </w:rPr>
+              <w:t>Cuarto, publicar la aplicación en un enlace público (</w:t>
+            </w:r>
+            <w:proofErr w:type="spellStart"/>
+            <w:r>
+              <w:rPr>
+                <w:rFonts w:ascii="Calibri" w:hAnsi="Calibri" w:cs="Arial"/>
+                <w:iCs/>
+                <w:color w:val="3B3838" w:themeColor="background2" w:themeShade="40"/>
+                <w:sz w:val="20"/>
+                <w:szCs w:val="20"/>
+                <w:lang w:eastAsia="es-CL"/>
+              </w:rPr>
+              <w:t>backend</w:t>
+            </w:r>
+            <w:proofErr w:type="spellEnd"/>
+            <w:r>
+              <w:rPr>
+                <w:rFonts w:ascii="Calibri" w:hAnsi="Calibri" w:cs="Arial"/>
+                <w:iCs/>
+                <w:color w:val="3B3838" w:themeColor="background2" w:themeShade="40"/>
+                <w:sz w:val="20"/>
+                <w:szCs w:val="20"/>
+                <w:lang w:eastAsia="es-CL"/>
+              </w:rPr>
+              <w:t xml:space="preserve">, base de datos y </w:t>
+            </w:r>
+            <w:proofErr w:type="spellStart"/>
+            <w:r>
+              <w:rPr>
+                <w:rFonts w:ascii="Calibri" w:hAnsi="Calibri" w:cs="Arial"/>
+                <w:iCs/>
+                <w:color w:val="3B3838" w:themeColor="background2" w:themeShade="40"/>
+                <w:sz w:val="20"/>
+                <w:szCs w:val="20"/>
+                <w:lang w:eastAsia="es-CL"/>
+              </w:rPr>
+              <w:t>frontend</w:t>
+            </w:r>
+            <w:proofErr w:type="spellEnd"/>
+            <w:r>
+              <w:rPr>
+                <w:rFonts w:ascii="Calibri" w:hAnsi="Calibri" w:cs="Arial"/>
+                <w:iCs/>
+                <w:color w:val="3B3838" w:themeColor="background2" w:themeShade="40"/>
+                <w:sz w:val="20"/>
+                <w:szCs w:val="20"/>
+                <w:lang w:eastAsia="es-CL"/>
+              </w:rPr>
+              <w:t>), como define el documento de arquitectura.</w:t>
             </w:r>
           </w:p>
         </w:tc>
@@ -4599,6 +5319,7 @@
   <w:style w:type="character" w:default="1" w:styleId="Fuentedeprrafopredeter">
     <w:name w:val="Default Paragraph Font"/>
     <w:uiPriority w:val="1"/>
+    <w:semiHidden/>
     <w:unhideWhenUsed/>
   </w:style>
   <w:style w:type="table" w:default="1" w:styleId="Tablanormal">
@@ -5162,12 +5883,9 @@
 </file>
 
 <file path=customXml/item1.xml><?xml version="1.0" encoding="utf-8"?>
-<?mso-contentType ?>
-<FormTemplates xmlns="http://schemas.microsoft.com/sharepoint/v3/contenttype/forms">
-  <Display>DocumentLibraryForm</Display>
-  <Edit>DocumentLibraryForm</Edit>
-  <New>DocumentLibraryForm</New>
-</FormTemplates>
+<p:properties xmlns:p="http://schemas.microsoft.com/office/2006/metadata/properties" xmlns:xsi="http://www.w3.org/2001/XMLSchema-instance" xmlns:pc="http://schemas.microsoft.com/office/infopath/2007/PartnerControls">
+  <documentManagement/>
+</p:properties>
 </file>
 
 <file path=customXml/item2.xml><?xml version="1.0" encoding="utf-8"?>
@@ -5303,15 +6021,19 @@
 </file>
 
 <file path=customXml/item3.xml><?xml version="1.0" encoding="utf-8"?>
-<p:properties xmlns:p="http://schemas.microsoft.com/office/2006/metadata/properties" xmlns:xsi="http://www.w3.org/2001/XMLSchema-instance" xmlns:pc="http://schemas.microsoft.com/office/infopath/2007/PartnerControls">
-  <documentManagement/>
-</p:properties>
+<?mso-contentType ?>
+<FormTemplates xmlns="http://schemas.microsoft.com/sharepoint/v3/contenttype/forms">
+  <Display>DocumentLibraryForm</Display>
+  <Edit>DocumentLibraryForm</Edit>
+  <New>DocumentLibraryForm</New>
+</FormTemplates>
 </file>
 
 <file path=customXml/itemProps1.xml><?xml version="1.0" encoding="utf-8"?>
-<ds:datastoreItem xmlns:ds="http://schemas.openxmlformats.org/officeDocument/2006/customXml" ds:itemID="{D51C61E4-DB75-4684-AD25-71F546404E96}">
+<ds:datastoreItem xmlns:ds="http://schemas.openxmlformats.org/officeDocument/2006/customXml" ds:itemID="{46CA5683-AF87-4E40-B841-2E23A3B52406}">
   <ds:schemaRefs>
-    <ds:schemaRef ds:uri="http://schemas.microsoft.com/sharepoint/v3/contenttype/forms"/>
+    <ds:schemaRef ds:uri="http://schemas.microsoft.com/office/2006/metadata/properties"/>
+    <ds:schemaRef ds:uri="http://schemas.microsoft.com/office/infopath/2007/PartnerControls"/>
   </ds:schemaRefs>
 </ds:datastoreItem>
 </file>
@@ -5335,10 +6057,9 @@
 </file>
 
 <file path=customXml/itemProps3.xml><?xml version="1.0" encoding="utf-8"?>
-<ds:datastoreItem xmlns:ds="http://schemas.openxmlformats.org/officeDocument/2006/customXml" ds:itemID="{46CA5683-AF87-4E40-B841-2E23A3B52406}">
+<ds:datastoreItem xmlns:ds="http://schemas.openxmlformats.org/officeDocument/2006/customXml" ds:itemID="{D51C61E4-DB75-4684-AD25-71F546404E96}">
   <ds:schemaRefs>
-    <ds:schemaRef ds:uri="http://schemas.microsoft.com/office/2006/metadata/properties"/>
-    <ds:schemaRef ds:uri="http://schemas.microsoft.com/office/infopath/2007/PartnerControls"/>
+    <ds:schemaRef ds:uri="http://schemas.microsoft.com/sharepoint/v3/contenttype/forms"/>
   </ds:schemaRefs>
 </ds:datastoreItem>
 </file>
</xml_diff>